<commit_message>
feat(branding): integrate official LOGO 5 suite and update proposal styling
</commit_message>
<xml_diff>
--- a/PROPOSAL_INVESTASI_KEDAI_21.docx
+++ b/PROPOSAL_INVESTASI_KEDAI_21.docx
@@ -31,7 +31,7 @@
               <w:rPr>
                 <w:rFonts w:ascii="Arial" w:hAnsi="Arial"/>
                 <w:b/>
-                <w:color w:val="A56341"/>
+                <w:color w:val="00AA91"/>
                 <w:sz w:val="17"/>
               </w:rPr>
               <w:t>PENAWARAN INVESTASI &amp; KEMITRAAN USAHA MIKRO BERBASIS LEAN STARTUP</w:t>
@@ -43,7 +43,7 @@
             </w:pPr>
             <w:r>
               <w:rPr>
-                <w:color w:val="102A43"/>
+                <w:color w:val="12213A"/>
               </w:rPr>
               <w:t>————————————————————————————————————————</w:t>
             </w:r>
@@ -56,7 +56,7 @@
               <w:rPr>
                 <w:rFonts w:ascii="Arial" w:hAnsi="Arial"/>
                 <w:b/>
-                <w:color w:val="102A43"/>
+                <w:color w:val="12213A"/>
                 <w:sz w:val="56"/>
               </w:rPr>
               <w:t>KEDAI 21</w:t>
@@ -70,7 +70,7 @@
               <w:rPr>
                 <w:rFonts w:ascii="Arial" w:hAnsi="Arial"/>
                 <w:b/>
-                <w:color w:val="A56341"/>
+                <w:color w:val="00AA91"/>
                 <w:sz w:val="30"/>
               </w:rPr>
               <w:t>&amp; ARTISAN ANGKRINGAN RAKYAT</w:t>
@@ -95,7 +95,7 @@
             <w:r>
               <w:drawing>
                 <wp:inline xmlns:a="http://schemas.openxmlformats.org/drawingml/2006/main" xmlns:pic="http://schemas.openxmlformats.org/drawingml/2006/picture">
-                  <wp:extent cx="1152000" cy="1152000"/>
+                  <wp:extent cx="1224000" cy="1224000"/>
                   <wp:docPr id="1" name="Picture 1"/>
                   <wp:cNvGraphicFramePr>
                     <a:graphicFrameLocks noChangeAspect="1"/>
@@ -104,7 +104,7 @@
                     <a:graphicData uri="http://schemas.openxmlformats.org/drawingml/2006/picture">
                       <pic:pic>
                         <pic:nvPicPr>
-                          <pic:cNvPr id="0" name="KEDAI 21 - LOGOMARK.png"/>
+                          <pic:cNvPr id="0" name="KEDAI 21 - LOGO UTAMA.png"/>
                           <pic:cNvPicPr/>
                         </pic:nvPicPr>
                         <pic:blipFill>
@@ -116,7 +116,7 @@
                         <pic:spPr>
                           <a:xfrm>
                             <a:off x="0" y="0"/>
-                            <a:ext cx="1152000" cy="1152000"/>
+                            <a:ext cx="1224000" cy="1224000"/>
                           </a:xfrm>
                           <a:prstGeom prst="rect"/>
                         </pic:spPr>
@@ -139,7 +139,7 @@
           <w:rFonts w:ascii="Arial" w:hAnsi="Arial"/>
           <w:b/>
           <w:i/>
-          <w:color w:val="C58917"/>
+          <w:color w:val="FEBB09"/>
           <w:sz w:val="22"/>
         </w:rPr>
         <w:t>Tagline: "Ruang Temu Bersahaja, Seduh Cerita"</w:t>
@@ -174,7 +174,7 @@
         <w:tc>
           <w:tcPr>
             <w:tcW w:type="dxa" w:w="9694"/>
-            <w:shd w:val="clear" w:color="auto" w:fill="FDF6F0"/>
+            <w:shd w:val="clear" w:color="auto" w:fill="F4F9F8"/>
             <w:tcMar>
               <w:top w:w="65" w:type="dxa"/>
               <w:bottom w:w="65" w:type="dxa"/>
@@ -183,7 +183,7 @@
             </w:tcMar>
             <w:tcBorders>
               <w:top w:val="none"/>
-              <w:left w:val="single" w:sz="24" w:space="0" w:color="A56341"/>
+              <w:left w:val="single" w:sz="24" w:space="0" w:color="00AA91"/>
               <w:bottom w:val="none"/>
               <w:right w:val="none"/>
             </w:tcBorders>
@@ -197,7 +197,7 @@
               <w:rPr>
                 <w:rFonts w:ascii="Arial" w:hAnsi="Arial"/>
                 <w:b/>
-                <w:color w:val="102A43"/>
+                <w:color w:val="12213A"/>
                 <w:sz w:val="20"/>
               </w:rPr>
               <w:t>RINGKASAN EKSEKUTIF PROYEK INVESTASI (LEAN MVP MODEL)</w:t>
@@ -216,7 +216,7 @@
               <w:rPr>
                 <w:rFonts w:ascii="Arial" w:hAnsi="Arial"/>
                 <w:b/>
-                <w:color w:val="A56341"/>
+                <w:color w:val="00AA91"/>
                 <w:sz w:val="18"/>
               </w:rPr>
               <w:t>• Nilai Total Permodalan Awal</w:t>
@@ -245,7 +245,7 @@
               <w:rPr>
                 <w:rFonts w:ascii="Arial" w:hAnsi="Arial"/>
                 <w:b/>
-                <w:color w:val="A56341"/>
+                <w:color w:val="00AA91"/>
                 <w:sz w:val="18"/>
               </w:rPr>
               <w:t>• Opsi Partisipasi Mitra</w:t>
@@ -274,7 +274,7 @@
               <w:rPr>
                 <w:rFonts w:ascii="Arial" w:hAnsi="Arial"/>
                 <w:b/>
-                <w:color w:val="A56341"/>
+                <w:color w:val="00AA91"/>
                 <w:sz w:val="18"/>
               </w:rPr>
               <w:t>• Alokasi Sewa Lahan Sementara</w:t>
@@ -303,7 +303,7 @@
               <w:rPr>
                 <w:rFonts w:ascii="Arial" w:hAnsi="Arial"/>
                 <w:b/>
-                <w:color w:val="A56341"/>
+                <w:color w:val="00AA91"/>
                 <w:sz w:val="18"/>
               </w:rPr>
               <w:t>• Skema Kemitraan Usaha</w:t>
@@ -332,7 +332,7 @@
               <w:rPr>
                 <w:rFonts w:ascii="Arial" w:hAnsi="Arial"/>
                 <w:b/>
-                <w:color w:val="A56341"/>
+                <w:color w:val="00AA91"/>
                 <w:sz w:val="18"/>
               </w:rPr>
               <w:t>• Proyeksi Balik Modal (BEP)</w:t>
@@ -361,7 +361,7 @@
               <w:rPr>
                 <w:rFonts w:ascii="Arial" w:hAnsi="Arial"/>
                 <w:b/>
-                <w:color w:val="A56341"/>
+                <w:color w:val="00AA91"/>
                 <w:sz w:val="18"/>
               </w:rPr>
               <w:t>• Konsep Ruang &amp; Duduk</w:t>
@@ -390,7 +390,7 @@
               <w:rPr>
                 <w:rFonts w:ascii="Arial" w:hAnsi="Arial"/>
                 <w:b/>
-                <w:color w:val="A56341"/>
+                <w:color w:val="00AA91"/>
                 <w:sz w:val="18"/>
               </w:rPr>
               <w:t>• Konsep Dapur &amp; Minuman</w:t>
@@ -419,7 +419,7 @@
               <w:rPr>
                 <w:rFonts w:ascii="Arial" w:hAnsi="Arial"/>
                 <w:b/>
-                <w:color w:val="A56341"/>
+                <w:color w:val="00AA91"/>
                 <w:sz w:val="18"/>
               </w:rPr>
               <w:t>• Lokasi Basis Operasional</w:t>
@@ -448,7 +448,7 @@
               <w:rPr>
                 <w:rFonts w:ascii="Arial" w:hAnsi="Arial"/>
                 <w:b/>
-                <w:color w:val="A56341"/>
+                <w:color w:val="00AA91"/>
                 <w:sz w:val="18"/>
               </w:rPr>
               <w:t>• Inisiator &amp; Penanggung Jawab</w:t>
@@ -488,7 +488,7 @@
       <w:r>
         <w:rPr>
           <w:b/>
-          <w:color w:val="102A43"/>
+          <w:color w:val="12213A"/>
           <w:sz w:val="17"/>
         </w:rPr>
         <w:t>Disusun untuk Calon Mitra Investor Strategis &amp; Rekan Kemitraan</w:t>
@@ -508,7 +508,7 @@
         <w:rPr>
           <w:rFonts w:ascii="Arial" w:hAnsi="Arial"/>
           <w:b/>
-          <w:color w:val="102A43"/>
+          <w:color w:val="12213A"/>
           <w:sz w:val="26"/>
         </w:rPr>
         <w:t>1. LATAR BELAKANG, PRINSIP LEAN STARTUP &amp; FILOSOFI MEREK</w:t>
@@ -523,7 +523,7 @@
         <w:rPr>
           <w:rFonts w:ascii="Arial" w:hAnsi="Arial"/>
           <w:b/>
-          <w:color w:val="A56341"/>
+          <w:color w:val="00AA91"/>
           <w:sz w:val="21"/>
         </w:rPr>
         <w:t>1.1 Mengapa Model Lean MVP Diterapkan?</w:t>
@@ -570,7 +570,7 @@
         <w:rPr>
           <w:rFonts w:ascii="Arial" w:hAnsi="Arial"/>
           <w:b/>
-          <w:color w:val="A56341"/>
+          <w:color w:val="00AA91"/>
           <w:sz w:val="21"/>
         </w:rPr>
         <w:t>1.2 Sederhana, Cepat Buka &amp; Minim Risiko</w:t>
@@ -601,7 +601,7 @@
         <w:rPr>
           <w:rFonts w:ascii="Arial" w:hAnsi="Arial"/>
           <w:b/>
-          <w:color w:val="A56341"/>
+          <w:color w:val="00AA91"/>
           <w:sz w:val="21"/>
         </w:rPr>
         <w:t>1.3 Filosofi Nama Merek "Kedai 21" — Doa dan Harapan</w:t>
@@ -620,7 +620,7 @@
         <w:tc>
           <w:tcPr>
             <w:tcW w:type="dxa" w:w="9694"/>
-            <w:shd w:val="clear" w:color="auto" w:fill="FDF6F0"/>
+            <w:shd w:val="clear" w:color="auto" w:fill="F4F9F8"/>
             <w:tcMar>
               <w:top w:w="40" w:type="dxa"/>
               <w:bottom w:w="40" w:type="dxa"/>
@@ -629,7 +629,7 @@
             </w:tcMar>
             <w:tcBorders>
               <w:top w:val="none"/>
-              <w:left w:val="single" w:sz="24" w:space="0" w:color="A56341"/>
+              <w:left w:val="single" w:sz="24" w:space="0" w:color="00AA91"/>
               <w:bottom w:val="none"/>
               <w:right w:val="none"/>
             </w:tcBorders>
@@ -643,7 +643,7 @@
               <w:rPr>
                 <w:rFonts w:ascii="Arial" w:hAnsi="Arial"/>
                 <w:b/>
-                <w:color w:val="102A43"/>
+                <w:color w:val="12213A"/>
                 <w:sz w:val="20"/>
               </w:rPr>
               <w:t>EMPAT PILAR FILOSOFI DAN DOA DI BALIK NAMA KEDAI 21</w:t>
@@ -658,7 +658,7 @@
               <w:rPr>
                 <w:rFonts w:ascii="Arial" w:hAnsi="Arial"/>
                 <w:b/>
-                <w:color w:val="A56341"/>
+                <w:color w:val="00AA91"/>
                 <w:sz w:val="18"/>
               </w:rPr>
               <w:t xml:space="preserve">1. Ruang Temu Bersahaja &amp; Hangat (The Welcoming Third Place): </w:t>
@@ -681,7 +681,7 @@
               <w:rPr>
                 <w:rFonts w:ascii="Arial" w:hAnsi="Arial"/>
                 <w:b/>
-                <w:color w:val="A56341"/>
+                <w:color w:val="00AA91"/>
                 <w:sz w:val="18"/>
               </w:rPr>
               <w:t xml:space="preserve">2. Kematangan &amp; Kemandirian Usaha (Maturity &amp; Growth): </w:t>
@@ -704,7 +704,7 @@
               <w:rPr>
                 <w:rFonts w:ascii="Arial" w:hAnsi="Arial"/>
                 <w:b/>
-                <w:color w:val="A56341"/>
+                <w:color w:val="00AA91"/>
                 <w:sz w:val="18"/>
               </w:rPr>
               <w:t xml:space="preserve">3. Sinergi Kemitraan Syirkah 2-in-1: </w:t>
@@ -727,7 +727,7 @@
               <w:rPr>
                 <w:rFonts w:ascii="Arial" w:hAnsi="Arial"/>
                 <w:b/>
-                <w:color w:val="A56341"/>
+                <w:color w:val="00AA91"/>
                 <w:sz w:val="18"/>
               </w:rPr>
               <w:t xml:space="preserve">4. Simpul Silaturahmi Komunitas: </w:t>
@@ -758,10 +758,10 @@
         <w:rPr>
           <w:rFonts w:ascii="Arial" w:hAnsi="Arial"/>
           <w:b/>
-          <w:color w:val="A56341"/>
+          <w:color w:val="00AA91"/>
           <w:sz w:val="21"/>
         </w:rPr>
-        <w:t>1.4 Identitas Visual Merek, Palet Warna (#A56341) &amp; Filosofi Logo</w:t>
+        <w:t>1.4 Identitas Visual Merek, Palet Warna &amp; Filosofi Logo</w:t>
       </w:r>
     </w:p>
     <w:tbl>
@@ -784,11 +784,11 @@
               <w:left w:w="25" w:type="dxa"/>
               <w:right w:w="30" w:type="dxa"/>
             </w:tcMar>
-            <w:shd w:val="clear" w:color="auto" w:fill="FDF6F0"/>
+            <w:shd w:val="clear" w:color="auto" w:fill="F4F9F8"/>
             <w:tcBorders>
-              <w:top w:val="single" w:sz="4" w:space="0" w:color="E2D8CE"/>
-              <w:left w:val="single" w:sz="20" w:space="0" w:color="A56341"/>
-              <w:bottom w:val="single" w:sz="4" w:space="0" w:color="E2D8CE"/>
+              <w:top w:val="single" w:sz="4" w:space="0" w:color="D4E5E1"/>
+              <w:left w:val="single" w:sz="20" w:space="0" w:color="00AA91"/>
+              <w:bottom w:val="single" w:sz="4" w:space="0" w:color="D4E5E1"/>
               <w:right w:val="none"/>
             </w:tcBorders>
           </w:tcPr>
@@ -800,7 +800,7 @@
             <w:r>
               <w:drawing>
                 <wp:inline xmlns:a="http://schemas.openxmlformats.org/drawingml/2006/main" xmlns:pic="http://schemas.openxmlformats.org/drawingml/2006/picture">
-                  <wp:extent cx="1655999" cy="1655999"/>
+                  <wp:extent cx="1620000" cy="1620000"/>
                   <wp:docPr id="2" name="Picture 2"/>
                   <wp:cNvGraphicFramePr>
                     <a:graphicFrameLocks noChangeAspect="1"/>
@@ -809,11 +809,11 @@
                     <a:graphicData uri="http://schemas.openxmlformats.org/drawingml/2006/picture">
                       <pic:pic>
                         <pic:nvPicPr>
-                          <pic:cNvPr id="0" name="KEDAI 21 - LOGO 2.png"/>
+                          <pic:cNvPr id="0" name="KEDAI 21 - LOGO UTAMA.png"/>
                           <pic:cNvPicPr/>
                         </pic:nvPicPr>
                         <pic:blipFill>
-                          <a:blip r:embed="rId14"/>
+                          <a:blip r:embed="rId13"/>
                           <a:stretch>
                             <a:fillRect/>
                           </a:stretch>
@@ -821,7 +821,7 @@
                         <pic:spPr>
                           <a:xfrm>
                             <a:off x="0" y="0"/>
-                            <a:ext cx="1655999" cy="1655999"/>
+                            <a:ext cx="1620000" cy="1620000"/>
                           </a:xfrm>
                           <a:prstGeom prst="rect"/>
                         </pic:spPr>
@@ -840,19 +840,19 @@
             <w:r>
               <w:rPr>
                 <w:b/>
-                <w:color w:val="102A43"/>
+                <w:color w:val="12213A"/>
                 <w:sz w:val="15"/>
               </w:rPr>
-              <w:t>Warna Primer Merek:</w:t>
+              <w:t>Warna Utama Merek:</w:t>
               <w:br/>
             </w:r>
             <w:r>
               <w:rPr>
                 <w:b/>
-                <w:color w:val="A56341"/>
+                <w:color w:val="00AA91"/>
                 <w:sz w:val="16"/>
               </w:rPr>
-              <w:t>Terracotta Coffee Roast</w:t>
+              <w:t>Tropical Teal &amp; Deep Navy</w:t>
               <w:br/>
             </w:r>
             <w:r>
@@ -860,7 +860,7 @@
                 <w:color w:val="627D98"/>
                 <w:sz w:val="14"/>
               </w:rPr>
-              <w:t>#A56341 | RGB (165,99,65)</w:t>
+              <w:t>#00AA91, #12213A, #FEBB09</w:t>
             </w:r>
           </w:p>
         </w:tc>
@@ -873,12 +873,12 @@
               <w:left w:w="30" w:type="dxa"/>
               <w:right w:w="25" w:type="dxa"/>
             </w:tcMar>
-            <w:shd w:val="clear" w:color="auto" w:fill="FDF6F0"/>
+            <w:shd w:val="clear" w:color="auto" w:fill="F4F9F8"/>
             <w:tcBorders>
-              <w:top w:val="single" w:sz="4" w:space="0" w:color="E2D8CE"/>
+              <w:top w:val="single" w:sz="4" w:space="0" w:color="D4E5E1"/>
               <w:left w:val="none"/>
-              <w:bottom w:val="single" w:sz="4" w:space="0" w:color="E2D8CE"/>
-              <w:right w:val="single" w:sz="4" w:space="0" w:color="E2D8CE"/>
+              <w:bottom w:val="single" w:sz="4" w:space="0" w:color="D4E5E1"/>
+              <w:right w:val="single" w:sz="4" w:space="0" w:color="D4E5E1"/>
             </w:tcBorders>
           </w:tcPr>
           <w:p>
@@ -889,17 +889,17 @@
             <w:r>
               <w:rPr>
                 <w:b/>
-                <w:color w:val="A56341"/>
+                <w:color w:val="00AA91"/>
                 <w:sz w:val="17"/>
               </w:rPr>
-              <w:t xml:space="preserve">1. Cangkir Kopi &amp; Pahat Angka '21' (Artisanal &amp; Maturity): </w:t>
+              <w:t xml:space="preserve">1. Tipografi 'KEDAI 21' Kokoh &amp; Bersahaja (Bold Typography): </w:t>
             </w:r>
             <w:r>
               <w:rPr>
                 <w:color w:val="243B53"/>
                 <w:sz w:val="17"/>
               </w:rPr>
-              <w:t>Cangkir kopi artisanal berpadu siluet angka '21' melambangkan kedewasaan langkah usaha, racikan kopi berkualitas, dan kesiapan operasional yang matang dalam melayani pasar.</w:t>
+              <w:t>Perpaduan warna Deep Navy pada kata 'KEDAI' dan Teal pada angka '21' memancarkan karakter usaha yang matang, bersahaja, terpercaya, dan sangat mudah diingat semua kalangan.</w:t>
             </w:r>
           </w:p>
           <w:p>
@@ -910,17 +910,17 @@
             <w:r>
               <w:rPr>
                 <w:b/>
-                <w:color w:val="A56341"/>
+                <w:color w:val="00AA91"/>
                 <w:sz w:val="17"/>
               </w:rPr>
-              <w:t xml:space="preserve">2. Lekukan Cangkir Bersahaja (Welcoming Simplicity): </w:t>
+              <w:t xml:space="preserve">2. Lengkungan Senyuman Ramah (The Welcoming Smile Arc): </w:t>
             </w:r>
             <w:r>
               <w:rPr>
                 <w:color w:val="243B53"/>
                 <w:sz w:val="17"/>
               </w:rPr>
-              <w:t>Kurva cangkir yang membumi mencerminkan ruang temu egaliter rakyat tanpa sekat sosial, menghadirkan kenyamanan dan kehangatan silaturahmi bagi seluruh lapisan pengunjung.</w:t>
+              <w:t>Kurva hijau toska di bawah angka 21 merepresentasikan keramahan tulus (hospitality), keterbukaan ruang temu egaliter tanpa sekat sosial, dan kehangatan cangkir kebersamaan.</w:t>
             </w:r>
           </w:p>
           <w:p>
@@ -931,17 +931,17 @@
             <w:r>
               <w:rPr>
                 <w:b/>
-                <w:color w:val="A56341"/>
+                <w:color w:val="00AA91"/>
                 <w:sz w:val="17"/>
               </w:rPr>
-              <w:t xml:space="preserve">3. Tiga Liukan Uap Harum (Aroma, Semangat &amp; Berkah): </w:t>
+              <w:t xml:space="preserve">3. Percikan Kilau Emas Harapan (Radiant Sparkles &amp; Optimism): </w:t>
             </w:r>
             <w:r>
               <w:rPr>
                 <w:color w:val="243B53"/>
                 <w:sz w:val="17"/>
               </w:rPr>
-              <w:t>Tiga liukan uap membubung merepresentasikan aroma seduhan Robusta lokal Gunung Karang, nyala semangat pantang menyerah, serta harapan rezeki berkah yang terus mengalir.</w:t>
+              <w:t>Kilau sinar kuning keemasan di ujung lengkungan melambangkan semerbak aroma sajian lezat, kehangatan suasana malam warga, dan optimisme keberkahan usaha yang terus memancar.</w:t>
             </w:r>
           </w:p>
         </w:tc>
@@ -956,7 +956,7 @@
         <w:rPr>
           <w:rFonts w:ascii="Arial" w:hAnsi="Arial"/>
           <w:b/>
-          <w:color w:val="A56341"/>
+          <w:color w:val="00AA91"/>
           <w:sz w:val="21"/>
         </w:rPr>
         <w:t>1.5 Urgensi Identitas Merek: Dampak Psikologis bagi Pengunjung</w:t>
@@ -987,7 +987,7 @@
         <w:rPr>
           <w:rFonts w:ascii="Arial" w:hAnsi="Arial"/>
           <w:b/>
-          <w:color w:val="A56341"/>
+          <w:color w:val="00AA91"/>
           <w:sz w:val="19"/>
         </w:rPr>
         <w:t xml:space="preserve">1. Rasa Aman &amp; Kepastian Mutu (Psychological Safety &amp; Trust): </w:t>
@@ -1010,7 +1010,7 @@
         <w:rPr>
           <w:rFonts w:ascii="Arial" w:hAnsi="Arial"/>
           <w:b/>
-          <w:color w:val="A56341"/>
+          <w:color w:val="00AA91"/>
           <w:sz w:val="19"/>
         </w:rPr>
         <w:t xml:space="preserve">2. Rasa Memiliki &amp; Kebanggaan Sosial (Sense of Belonging &amp; Pride): </w:t>
@@ -1033,7 +1033,7 @@
         <w:rPr>
           <w:rFonts w:ascii="Arial" w:hAnsi="Arial"/>
           <w:b/>
-          <w:color w:val="A56341"/>
+          <w:color w:val="00AA91"/>
           <w:sz w:val="19"/>
         </w:rPr>
         <w:t xml:space="preserve">3. Pembeda dari Anonimitas Pasar (Top-of-Mind Brand Recall): </w:t>
@@ -1044,7 +1044,7 @@
           <w:color w:val="243B53"/>
           <w:sz w:val="19"/>
         </w:rPr>
-        <w:t>Warna khas Terracotta #A56341 dan logo Kedai 21 bertindak sebagai mercusuar visual pemandu di jalur Cikedal - Menes yang membedakannya dari lapak jalanan biasa dan mengunci loyalitas kunjungan berulang (repeat order).</w:t>
+        <w:t>Warna khas Tropical Teal &amp; Deep Navy serta logo Kedai 21 bertindak sebagai mercusuar visual pemandu di jalur Cikedal - Menes yang membedakannya dari lapak jalanan biasa dan mengunci loyalitas kunjungan berulang (repeat order).</w:t>
       </w:r>
     </w:p>
     <w:p>
@@ -1061,7 +1061,7 @@
         <w:rPr>
           <w:rFonts w:ascii="Arial" w:hAnsi="Arial"/>
           <w:b/>
-          <w:color w:val="102A43"/>
+          <w:color w:val="12213A"/>
           <w:sz w:val="26"/>
         </w:rPr>
         <w:t>2. KONSEP BISNIS, PRODUK &amp; TATA RUANG LAHAN TERBUKA</w:t>
@@ -1076,7 +1076,7 @@
         <w:rPr>
           <w:rFonts w:ascii="Arial" w:hAnsi="Arial"/>
           <w:b/>
-          <w:color w:val="A56341"/>
+          <w:color w:val="00AA91"/>
           <w:sz w:val="21"/>
         </w:rPr>
         <w:t>2.1 Konsep Tempat: 100% Lesehan Alas Tebal Nyaman &amp; 4 Meja Lipat Portabel</w:t>
@@ -1123,7 +1123,7 @@
         <w:rPr>
           <w:rFonts w:ascii="Arial" w:hAnsi="Arial"/>
           <w:b/>
-          <w:color w:val="A56341"/>
+          <w:color w:val="00AA91"/>
           <w:sz w:val="21"/>
         </w:rPr>
         <w:t>2.2 Zonasi Tata Ruang Lahan Terbuka (~5 × 5 Meter / 25 m²)</w:t>
@@ -1158,7 +1158,7 @@
         <w:tc>
           <w:tcPr>
             <w:tcW w:type="dxa" w:w="9694"/>
-            <w:shd w:val="clear" w:color="auto" w:fill="FDF6F0"/>
+            <w:shd w:val="clear" w:color="auto" w:fill="F4F9F8"/>
             <w:tcMar>
               <w:top w:w="65" w:type="dxa"/>
               <w:bottom w:w="65" w:type="dxa"/>
@@ -1167,7 +1167,7 @@
             </w:tcMar>
             <w:tcBorders>
               <w:top w:val="none"/>
-              <w:left w:val="single" w:sz="24" w:space="0" w:color="A56341"/>
+              <w:left w:val="single" w:sz="24" w:space="0" w:color="00AA91"/>
               <w:bottom w:val="none"/>
               <w:right w:val="none"/>
             </w:tcBorders>
@@ -1181,7 +1181,7 @@
               <w:rPr>
                 <w:rFonts w:ascii="Arial" w:hAnsi="Arial"/>
                 <w:b/>
-                <w:color w:val="102A43"/>
+                <w:color w:val="12213A"/>
                 <w:sz w:val="20"/>
               </w:rPr>
               <w:t>SKEMA TATA RUANG DAN ALUR KERJA LAHAN TERBUKA STRATEGIS (5 × 5 METER)</w:t>
@@ -1196,7 +1196,7 @@
               <w:rPr>
                 <w:rFonts w:ascii="Arial" w:hAnsi="Arial"/>
                 <w:b/>
-                <w:color w:val="A56341"/>
+                <w:color w:val="00AA91"/>
                 <w:sz w:val="18"/>
               </w:rPr>
               <w:t xml:space="preserve">• Zonasi Depan (1,5 m × 5,0 m) — Dapur Display &amp; Panggangan Arang: </w:t>
@@ -1219,7 +1219,7 @@
               <w:rPr>
                 <w:rFonts w:ascii="Arial" w:hAnsi="Arial"/>
                 <w:b/>
-                <w:color w:val="A56341"/>
+                <w:color w:val="00AA91"/>
                 <w:sz w:val="18"/>
               </w:rPr>
               <w:t xml:space="preserve">• Zonasi Tengah &amp; Belakang (3,5 m × 5,0 m) — Area Lesehan Tamu: </w:t>
@@ -1242,7 +1242,7 @@
               <w:rPr>
                 <w:rFonts w:ascii="Arial" w:hAnsi="Arial"/>
                 <w:b/>
-                <w:color w:val="A56341"/>
+                <w:color w:val="00AA91"/>
                 <w:sz w:val="18"/>
               </w:rPr>
               <w:t xml:space="preserve">• Perlindungan Cuaca (Tenda 2×6m Milik Sendiri + Atap Terpal Baru): </w:t>
@@ -1265,7 +1265,7 @@
               <w:rPr>
                 <w:rFonts w:ascii="Arial" w:hAnsi="Arial"/>
                 <w:b/>
-                <w:color w:val="A56341"/>
+                <w:color w:val="00AA91"/>
                 <w:sz w:val="18"/>
               </w:rPr>
               <w:t xml:space="preserve">• Zonasi Parkir &amp; Akses Bersih: </w:t>
@@ -1296,7 +1296,7 @@
         <w:rPr>
           <w:rFonts w:ascii="Arial" w:hAnsi="Arial"/>
           <w:b/>
-          <w:color w:val="A56341"/>
+          <w:color w:val="00AA91"/>
           <w:sz w:val="21"/>
         </w:rPr>
         <w:t>2.3 Menu Makanan Awal: Aneka Sate Frozen Food Bakar Arang &amp; Kudapan</w:t>
@@ -1359,7 +1359,7 @@
         <w:rPr>
           <w:rFonts w:ascii="Arial" w:hAnsi="Arial"/>
           <w:b/>
-          <w:color w:val="A56341"/>
+          <w:color w:val="00AA91"/>
           <w:sz w:val="21"/>
         </w:rPr>
         <w:t>2.4 Signature Menu Kopi Kedai 21 &amp; Minuman Rakyat (Ikon Minuman Usaha)</w:t>
@@ -1459,7 +1459,7 @@
         <w:rPr>
           <w:rFonts w:ascii="Arial" w:hAnsi="Arial"/>
           <w:b/>
-          <w:color w:val="102A43"/>
+          <w:color w:val="12213A"/>
           <w:sz w:val="26"/>
         </w:rPr>
         <w:t>3. ANALISIS PASAR, SEGMENTASI &amp; STRATEGI OPERASIONAL</w:t>
@@ -1474,7 +1474,7 @@
         <w:rPr>
           <w:rFonts w:ascii="Arial" w:hAnsi="Arial"/>
           <w:b/>
-          <w:color w:val="A56341"/>
+          <w:color w:val="00AA91"/>
           <w:sz w:val="21"/>
         </w:rPr>
         <w:t>3.1 Segmentasi Sasaran Konsumen Koridor Cikedal - Menes</w:t>
@@ -1509,7 +1509,7 @@
         <w:tc>
           <w:tcPr>
             <w:tcW w:type="dxa" w:w="9694"/>
-            <w:shd w:val="clear" w:color="auto" w:fill="FDF6F0"/>
+            <w:shd w:val="clear" w:color="auto" w:fill="F4F9F8"/>
             <w:tcMar>
               <w:top w:w="65" w:type="dxa"/>
               <w:bottom w:w="65" w:type="dxa"/>
@@ -1518,7 +1518,7 @@
             </w:tcMar>
             <w:tcBorders>
               <w:top w:val="none"/>
-              <w:left w:val="single" w:sz="24" w:space="0" w:color="A56341"/>
+              <w:left w:val="single" w:sz="24" w:space="0" w:color="00AA91"/>
               <w:bottom w:val="none"/>
               <w:right w:val="none"/>
             </w:tcBorders>
@@ -1532,7 +1532,7 @@
               <w:rPr>
                 <w:rFonts w:ascii="Arial" w:hAnsi="Arial"/>
                 <w:b/>
-                <w:color w:val="102A43"/>
+                <w:color w:val="12213A"/>
                 <w:sz w:val="20"/>
               </w:rPr>
               <w:t>EMPAT KLASTER KONSUMEN UTAMA KEDAI 21</w:t>
@@ -1547,7 +1547,7 @@
               <w:rPr>
                 <w:rFonts w:ascii="Arial" w:hAnsi="Arial"/>
                 <w:b/>
-                <w:color w:val="A56341"/>
+                <w:color w:val="00AA91"/>
                 <w:sz w:val="18"/>
               </w:rPr>
               <w:t xml:space="preserve">1. Pemuda Desa &amp; Komunitas Nongkrong Lokal (40%): </w:t>
@@ -1570,7 +1570,7 @@
               <w:rPr>
                 <w:rFonts w:ascii="Arial" w:hAnsi="Arial"/>
                 <w:b/>
-                <w:color w:val="A56341"/>
+                <w:color w:val="00AA91"/>
                 <w:sz w:val="18"/>
               </w:rPr>
               <w:t xml:space="preserve">2. Santri, Alumni &amp; Pelajar Lembaga Pendidikan (25%): </w:t>
@@ -1593,7 +1593,7 @@
               <w:rPr>
                 <w:rFonts w:ascii="Arial" w:hAnsi="Arial"/>
                 <w:b/>
-                <w:color w:val="A56341"/>
+                <w:color w:val="00AA91"/>
                 <w:sz w:val="18"/>
               </w:rPr>
               <w:t xml:space="preserve">3. Pekerja Malam, Guru, Pedagang &amp; Petugas Ronda (20%): </w:t>
@@ -1616,7 +1616,7 @@
               <w:rPr>
                 <w:rFonts w:ascii="Arial" w:hAnsi="Arial"/>
                 <w:b/>
-                <w:color w:val="A56341"/>
+                <w:color w:val="00AA91"/>
                 <w:sz w:val="18"/>
               </w:rPr>
               <w:t xml:space="preserve">4. Pelintas Jalur Wisata &amp; Logistik Pantai Barat (15%): </w:t>
@@ -1647,7 +1647,7 @@
         <w:rPr>
           <w:rFonts w:ascii="Arial" w:hAnsi="Arial"/>
           <w:b/>
-          <w:color w:val="A56341"/>
+          <w:color w:val="00AA91"/>
           <w:sz w:val="21"/>
         </w:rPr>
         <w:t>3.2 Keunggulan Kompetitif Dibanding Warkop Konvensional</w:t>
@@ -1726,7 +1726,7 @@
         <w:rPr>
           <w:rFonts w:ascii="Arial" w:hAnsi="Arial"/>
           <w:b/>
-          <w:color w:val="A56341"/>
+          <w:color w:val="00AA91"/>
           <w:sz w:val="21"/>
         </w:rPr>
         <w:t>3.3 Waktu Operasional &amp; Pola Layanan</w:t>
@@ -1762,7 +1762,7 @@
         <w:rPr>
           <w:rFonts w:ascii="Arial" w:hAnsi="Arial"/>
           <w:b/>
-          <w:color w:val="102A43"/>
+          <w:color w:val="12213A"/>
           <w:sz w:val="26"/>
         </w:rPr>
         <w:t>4. RENCANA ANGGARAN BIAYA &amp; ALOKASI MODAL LEAN MVP (RP 15 JT)</w:t>
@@ -1793,7 +1793,7 @@
         <w:rPr>
           <w:rFonts w:ascii="Arial" w:hAnsi="Arial"/>
           <w:b/>
-          <w:color w:val="A56341"/>
+          <w:color w:val="00AA91"/>
           <w:sz w:val="21"/>
         </w:rPr>
         <w:t>4.1 Tabel Rincian Belanja Modal Awal (Tepat Rp 15.000.000)</w:t>
@@ -1819,7 +1819,7 @@
         <w:tc>
           <w:tcPr>
             <w:tcW w:type="dxa" w:w="2721"/>
-            <w:shd w:val="clear" w:color="auto" w:fill="102A43"/>
+            <w:shd w:val="clear" w:color="auto" w:fill="12213A"/>
             <w:tcMar>
               <w:top w:w="60" w:type="dxa"/>
               <w:bottom w:w="60" w:type="dxa"/>
@@ -1845,7 +1845,7 @@
         <w:tc>
           <w:tcPr>
             <w:tcW w:type="dxa" w:w="3685"/>
-            <w:shd w:val="clear" w:color="auto" w:fill="102A43"/>
+            <w:shd w:val="clear" w:color="auto" w:fill="12213A"/>
             <w:tcMar>
               <w:top w:w="60" w:type="dxa"/>
               <w:bottom w:w="60" w:type="dxa"/>
@@ -1871,7 +1871,7 @@
         <w:tc>
           <w:tcPr>
             <w:tcW w:type="dxa" w:w="1247"/>
-            <w:shd w:val="clear" w:color="auto" w:fill="102A43"/>
+            <w:shd w:val="clear" w:color="auto" w:fill="12213A"/>
             <w:tcMar>
               <w:top w:w="60" w:type="dxa"/>
               <w:bottom w:w="60" w:type="dxa"/>
@@ -1897,7 +1897,7 @@
         <w:tc>
           <w:tcPr>
             <w:tcW w:type="dxa" w:w="2041"/>
-            <w:shd w:val="clear" w:color="auto" w:fill="102A43"/>
+            <w:shd w:val="clear" w:color="auto" w:fill="12213A"/>
             <w:tcMar>
               <w:top w:w="60" w:type="dxa"/>
               <w:bottom w:w="60" w:type="dxa"/>
@@ -1928,7 +1928,7 @@
         <w:tc>
           <w:tcPr>
             <w:tcW w:type="dxa" w:w="2721"/>
-            <w:shd w:val="clear" w:color="auto" w:fill="FDF6F0"/>
+            <w:shd w:val="clear" w:color="auto" w:fill="F4F9F8"/>
             <w:tcMar>
               <w:top w:w="32" w:type="dxa"/>
               <w:bottom w:w="32" w:type="dxa"/>
@@ -1938,7 +1938,7 @@
             <w:tcBorders>
               <w:top w:val="none"/>
               <w:left w:val="none"/>
-              <w:bottom w:val="single" w:sz="4" w:space="0" w:color="E2D8CE"/>
+              <w:bottom w:val="single" w:sz="4" w:space="0" w:color="D4E5E1"/>
               <w:right w:val="none"/>
             </w:tcBorders>
           </w:tcPr>
@@ -1960,7 +1960,7 @@
         <w:tc>
           <w:tcPr>
             <w:tcW w:type="dxa" w:w="3685"/>
-            <w:shd w:val="clear" w:color="auto" w:fill="FDF6F0"/>
+            <w:shd w:val="clear" w:color="auto" w:fill="F4F9F8"/>
             <w:tcMar>
               <w:top w:w="32" w:type="dxa"/>
               <w:bottom w:w="32" w:type="dxa"/>
@@ -1970,7 +1970,7 @@
             <w:tcBorders>
               <w:top w:val="none"/>
               <w:left w:val="none"/>
-              <w:bottom w:val="single" w:sz="4" w:space="0" w:color="E2D8CE"/>
+              <w:bottom w:val="single" w:sz="4" w:space="0" w:color="D4E5E1"/>
               <w:right w:val="none"/>
             </w:tcBorders>
           </w:tcPr>
@@ -1991,7 +1991,7 @@
         <w:tc>
           <w:tcPr>
             <w:tcW w:type="dxa" w:w="1247"/>
-            <w:shd w:val="clear" w:color="auto" w:fill="FDF6F0"/>
+            <w:shd w:val="clear" w:color="auto" w:fill="F4F9F8"/>
             <w:tcMar>
               <w:top w:w="32" w:type="dxa"/>
               <w:bottom w:w="32" w:type="dxa"/>
@@ -2001,7 +2001,7 @@
             <w:tcBorders>
               <w:top w:val="none"/>
               <w:left w:val="none"/>
-              <w:bottom w:val="single" w:sz="4" w:space="0" w:color="E2D8CE"/>
+              <w:bottom w:val="single" w:sz="4" w:space="0" w:color="D4E5E1"/>
               <w:right w:val="none"/>
             </w:tcBorders>
           </w:tcPr>
@@ -2022,7 +2022,7 @@
         <w:tc>
           <w:tcPr>
             <w:tcW w:type="dxa" w:w="2041"/>
-            <w:shd w:val="clear" w:color="auto" w:fill="FDF6F0"/>
+            <w:shd w:val="clear" w:color="auto" w:fill="F4F9F8"/>
             <w:tcMar>
               <w:top w:w="32" w:type="dxa"/>
               <w:bottom w:w="32" w:type="dxa"/>
@@ -2032,7 +2032,7 @@
             <w:tcBorders>
               <w:top w:val="none"/>
               <w:left w:val="none"/>
-              <w:bottom w:val="single" w:sz="4" w:space="0" w:color="E2D8CE"/>
+              <w:bottom w:val="single" w:sz="4" w:space="0" w:color="D4E5E1"/>
               <w:right w:val="none"/>
             </w:tcBorders>
           </w:tcPr>
@@ -2068,7 +2068,7 @@
             <w:tcBorders>
               <w:top w:val="none"/>
               <w:left w:val="none"/>
-              <w:bottom w:val="single" w:sz="4" w:space="0" w:color="E2D8CE"/>
+              <w:bottom w:val="single" w:sz="4" w:space="0" w:color="D4E5E1"/>
               <w:right w:val="none"/>
             </w:tcBorders>
           </w:tcPr>
@@ -2100,7 +2100,7 @@
             <w:tcBorders>
               <w:top w:val="none"/>
               <w:left w:val="none"/>
-              <w:bottom w:val="single" w:sz="4" w:space="0" w:color="E2D8CE"/>
+              <w:bottom w:val="single" w:sz="4" w:space="0" w:color="D4E5E1"/>
               <w:right w:val="none"/>
             </w:tcBorders>
           </w:tcPr>
@@ -2131,7 +2131,7 @@
             <w:tcBorders>
               <w:top w:val="none"/>
               <w:left w:val="none"/>
-              <w:bottom w:val="single" w:sz="4" w:space="0" w:color="E2D8CE"/>
+              <w:bottom w:val="single" w:sz="4" w:space="0" w:color="D4E5E1"/>
               <w:right w:val="none"/>
             </w:tcBorders>
           </w:tcPr>
@@ -2162,7 +2162,7 @@
             <w:tcBorders>
               <w:top w:val="none"/>
               <w:left w:val="none"/>
-              <w:bottom w:val="single" w:sz="4" w:space="0" w:color="E2D8CE"/>
+              <w:bottom w:val="single" w:sz="4" w:space="0" w:color="D4E5E1"/>
               <w:right w:val="none"/>
             </w:tcBorders>
           </w:tcPr>
@@ -2188,7 +2188,7 @@
         <w:tc>
           <w:tcPr>
             <w:tcW w:type="dxa" w:w="2721"/>
-            <w:shd w:val="clear" w:color="auto" w:fill="FDF6F0"/>
+            <w:shd w:val="clear" w:color="auto" w:fill="F4F9F8"/>
             <w:tcMar>
               <w:top w:w="32" w:type="dxa"/>
               <w:bottom w:w="32" w:type="dxa"/>
@@ -2198,7 +2198,7 @@
             <w:tcBorders>
               <w:top w:val="none"/>
               <w:left w:val="none"/>
-              <w:bottom w:val="single" w:sz="4" w:space="0" w:color="E2D8CE"/>
+              <w:bottom w:val="single" w:sz="4" w:space="0" w:color="D4E5E1"/>
               <w:right w:val="none"/>
             </w:tcBorders>
           </w:tcPr>
@@ -2220,7 +2220,7 @@
         <w:tc>
           <w:tcPr>
             <w:tcW w:type="dxa" w:w="3685"/>
-            <w:shd w:val="clear" w:color="auto" w:fill="FDF6F0"/>
+            <w:shd w:val="clear" w:color="auto" w:fill="F4F9F8"/>
             <w:tcMar>
               <w:top w:w="32" w:type="dxa"/>
               <w:bottom w:w="32" w:type="dxa"/>
@@ -2230,7 +2230,7 @@
             <w:tcBorders>
               <w:top w:val="none"/>
               <w:left w:val="none"/>
-              <w:bottom w:val="single" w:sz="4" w:space="0" w:color="E2D8CE"/>
+              <w:bottom w:val="single" w:sz="4" w:space="0" w:color="D4E5E1"/>
               <w:right w:val="none"/>
             </w:tcBorders>
           </w:tcPr>
@@ -2251,7 +2251,7 @@
         <w:tc>
           <w:tcPr>
             <w:tcW w:type="dxa" w:w="1247"/>
-            <w:shd w:val="clear" w:color="auto" w:fill="FDF6F0"/>
+            <w:shd w:val="clear" w:color="auto" w:fill="F4F9F8"/>
             <w:tcMar>
               <w:top w:w="32" w:type="dxa"/>
               <w:bottom w:w="32" w:type="dxa"/>
@@ -2261,7 +2261,7 @@
             <w:tcBorders>
               <w:top w:val="none"/>
               <w:left w:val="none"/>
-              <w:bottom w:val="single" w:sz="4" w:space="0" w:color="E2D8CE"/>
+              <w:bottom w:val="single" w:sz="4" w:space="0" w:color="D4E5E1"/>
               <w:right w:val="none"/>
             </w:tcBorders>
           </w:tcPr>
@@ -2282,7 +2282,7 @@
         <w:tc>
           <w:tcPr>
             <w:tcW w:type="dxa" w:w="2041"/>
-            <w:shd w:val="clear" w:color="auto" w:fill="FDF6F0"/>
+            <w:shd w:val="clear" w:color="auto" w:fill="F4F9F8"/>
             <w:tcMar>
               <w:top w:w="32" w:type="dxa"/>
               <w:bottom w:w="32" w:type="dxa"/>
@@ -2292,7 +2292,7 @@
             <w:tcBorders>
               <w:top w:val="none"/>
               <w:left w:val="none"/>
-              <w:bottom w:val="single" w:sz="4" w:space="0" w:color="E2D8CE"/>
+              <w:bottom w:val="single" w:sz="4" w:space="0" w:color="D4E5E1"/>
               <w:right w:val="none"/>
             </w:tcBorders>
           </w:tcPr>
@@ -2328,7 +2328,7 @@
             <w:tcBorders>
               <w:top w:val="none"/>
               <w:left w:val="none"/>
-              <w:bottom w:val="single" w:sz="4" w:space="0" w:color="E2D8CE"/>
+              <w:bottom w:val="single" w:sz="4" w:space="0" w:color="D4E5E1"/>
               <w:right w:val="none"/>
             </w:tcBorders>
           </w:tcPr>
@@ -2360,7 +2360,7 @@
             <w:tcBorders>
               <w:top w:val="none"/>
               <w:left w:val="none"/>
-              <w:bottom w:val="single" w:sz="4" w:space="0" w:color="E2D8CE"/>
+              <w:bottom w:val="single" w:sz="4" w:space="0" w:color="D4E5E1"/>
               <w:right w:val="none"/>
             </w:tcBorders>
           </w:tcPr>
@@ -2391,7 +2391,7 @@
             <w:tcBorders>
               <w:top w:val="none"/>
               <w:left w:val="none"/>
-              <w:bottom w:val="single" w:sz="4" w:space="0" w:color="E2D8CE"/>
+              <w:bottom w:val="single" w:sz="4" w:space="0" w:color="D4E5E1"/>
               <w:right w:val="none"/>
             </w:tcBorders>
           </w:tcPr>
@@ -2422,7 +2422,7 @@
             <w:tcBorders>
               <w:top w:val="none"/>
               <w:left w:val="none"/>
-              <w:bottom w:val="single" w:sz="4" w:space="0" w:color="E2D8CE"/>
+              <w:bottom w:val="single" w:sz="4" w:space="0" w:color="D4E5E1"/>
               <w:right w:val="none"/>
             </w:tcBorders>
           </w:tcPr>
@@ -2448,7 +2448,7 @@
         <w:tc>
           <w:tcPr>
             <w:tcW w:type="dxa" w:w="2721"/>
-            <w:shd w:val="clear" w:color="auto" w:fill="FDF6F0"/>
+            <w:shd w:val="clear" w:color="auto" w:fill="F4F9F8"/>
             <w:tcMar>
               <w:top w:w="32" w:type="dxa"/>
               <w:bottom w:w="32" w:type="dxa"/>
@@ -2458,7 +2458,7 @@
             <w:tcBorders>
               <w:top w:val="none"/>
               <w:left w:val="none"/>
-              <w:bottom w:val="single" w:sz="4" w:space="0" w:color="E2D8CE"/>
+              <w:bottom w:val="single" w:sz="4" w:space="0" w:color="D4E5E1"/>
               <w:right w:val="none"/>
             </w:tcBorders>
           </w:tcPr>
@@ -2480,7 +2480,7 @@
         <w:tc>
           <w:tcPr>
             <w:tcW w:type="dxa" w:w="3685"/>
-            <w:shd w:val="clear" w:color="auto" w:fill="FDF6F0"/>
+            <w:shd w:val="clear" w:color="auto" w:fill="F4F9F8"/>
             <w:tcMar>
               <w:top w:w="32" w:type="dxa"/>
               <w:bottom w:w="32" w:type="dxa"/>
@@ -2490,7 +2490,7 @@
             <w:tcBorders>
               <w:top w:val="none"/>
               <w:left w:val="none"/>
-              <w:bottom w:val="single" w:sz="4" w:space="0" w:color="E2D8CE"/>
+              <w:bottom w:val="single" w:sz="4" w:space="0" w:color="D4E5E1"/>
               <w:right w:val="none"/>
             </w:tcBorders>
           </w:tcPr>
@@ -2511,7 +2511,7 @@
         <w:tc>
           <w:tcPr>
             <w:tcW w:type="dxa" w:w="1247"/>
-            <w:shd w:val="clear" w:color="auto" w:fill="FDF6F0"/>
+            <w:shd w:val="clear" w:color="auto" w:fill="F4F9F8"/>
             <w:tcMar>
               <w:top w:w="32" w:type="dxa"/>
               <w:bottom w:w="32" w:type="dxa"/>
@@ -2521,7 +2521,7 @@
             <w:tcBorders>
               <w:top w:val="none"/>
               <w:left w:val="none"/>
-              <w:bottom w:val="single" w:sz="4" w:space="0" w:color="E2D8CE"/>
+              <w:bottom w:val="single" w:sz="4" w:space="0" w:color="D4E5E1"/>
               <w:right w:val="none"/>
             </w:tcBorders>
           </w:tcPr>
@@ -2542,7 +2542,7 @@
         <w:tc>
           <w:tcPr>
             <w:tcW w:type="dxa" w:w="2041"/>
-            <w:shd w:val="clear" w:color="auto" w:fill="FDF6F0"/>
+            <w:shd w:val="clear" w:color="auto" w:fill="F4F9F8"/>
             <w:tcMar>
               <w:top w:w="32" w:type="dxa"/>
               <w:bottom w:w="32" w:type="dxa"/>
@@ -2552,7 +2552,7 @@
             <w:tcBorders>
               <w:top w:val="none"/>
               <w:left w:val="none"/>
-              <w:bottom w:val="single" w:sz="4" w:space="0" w:color="E2D8CE"/>
+              <w:bottom w:val="single" w:sz="4" w:space="0" w:color="D4E5E1"/>
               <w:right w:val="none"/>
             </w:tcBorders>
           </w:tcPr>
@@ -2588,7 +2588,7 @@
             <w:tcBorders>
               <w:top w:val="none"/>
               <w:left w:val="none"/>
-              <w:bottom w:val="single" w:sz="4" w:space="0" w:color="E2D8CE"/>
+              <w:bottom w:val="single" w:sz="4" w:space="0" w:color="D4E5E1"/>
               <w:right w:val="none"/>
             </w:tcBorders>
           </w:tcPr>
@@ -2620,7 +2620,7 @@
             <w:tcBorders>
               <w:top w:val="none"/>
               <w:left w:val="none"/>
-              <w:bottom w:val="single" w:sz="4" w:space="0" w:color="E2D8CE"/>
+              <w:bottom w:val="single" w:sz="4" w:space="0" w:color="D4E5E1"/>
               <w:right w:val="none"/>
             </w:tcBorders>
           </w:tcPr>
@@ -2651,7 +2651,7 @@
             <w:tcBorders>
               <w:top w:val="none"/>
               <w:left w:val="none"/>
-              <w:bottom w:val="single" w:sz="4" w:space="0" w:color="E2D8CE"/>
+              <w:bottom w:val="single" w:sz="4" w:space="0" w:color="D4E5E1"/>
               <w:right w:val="none"/>
             </w:tcBorders>
           </w:tcPr>
@@ -2682,7 +2682,7 @@
             <w:tcBorders>
               <w:top w:val="none"/>
               <w:left w:val="none"/>
-              <w:bottom w:val="single" w:sz="4" w:space="0" w:color="E2D8CE"/>
+              <w:bottom w:val="single" w:sz="4" w:space="0" w:color="D4E5E1"/>
               <w:right w:val="none"/>
             </w:tcBorders>
           </w:tcPr>
@@ -2708,7 +2708,7 @@
         <w:tc>
           <w:tcPr>
             <w:tcW w:type="dxa" w:w="2721"/>
-            <w:shd w:val="clear" w:color="auto" w:fill="FDF6F0"/>
+            <w:shd w:val="clear" w:color="auto" w:fill="F4F9F8"/>
             <w:tcMar>
               <w:top w:w="32" w:type="dxa"/>
               <w:bottom w:w="32" w:type="dxa"/>
@@ -2718,7 +2718,7 @@
             <w:tcBorders>
               <w:top w:val="none"/>
               <w:left w:val="none"/>
-              <w:bottom w:val="single" w:sz="4" w:space="0" w:color="E2D8CE"/>
+              <w:bottom w:val="single" w:sz="4" w:space="0" w:color="D4E5E1"/>
               <w:right w:val="none"/>
             </w:tcBorders>
           </w:tcPr>
@@ -2740,7 +2740,7 @@
         <w:tc>
           <w:tcPr>
             <w:tcW w:type="dxa" w:w="3685"/>
-            <w:shd w:val="clear" w:color="auto" w:fill="FDF6F0"/>
+            <w:shd w:val="clear" w:color="auto" w:fill="F4F9F8"/>
             <w:tcMar>
               <w:top w:w="32" w:type="dxa"/>
               <w:bottom w:w="32" w:type="dxa"/>
@@ -2750,7 +2750,7 @@
             <w:tcBorders>
               <w:top w:val="none"/>
               <w:left w:val="none"/>
-              <w:bottom w:val="single" w:sz="4" w:space="0" w:color="E2D8CE"/>
+              <w:bottom w:val="single" w:sz="4" w:space="0" w:color="D4E5E1"/>
               <w:right w:val="none"/>
             </w:tcBorders>
           </w:tcPr>
@@ -2771,7 +2771,7 @@
         <w:tc>
           <w:tcPr>
             <w:tcW w:type="dxa" w:w="1247"/>
-            <w:shd w:val="clear" w:color="auto" w:fill="FDF6F0"/>
+            <w:shd w:val="clear" w:color="auto" w:fill="F4F9F8"/>
             <w:tcMar>
               <w:top w:w="32" w:type="dxa"/>
               <w:bottom w:w="32" w:type="dxa"/>
@@ -2781,7 +2781,7 @@
             <w:tcBorders>
               <w:top w:val="none"/>
               <w:left w:val="none"/>
-              <w:bottom w:val="single" w:sz="4" w:space="0" w:color="E2D8CE"/>
+              <w:bottom w:val="single" w:sz="4" w:space="0" w:color="D4E5E1"/>
               <w:right w:val="none"/>
             </w:tcBorders>
           </w:tcPr>
@@ -2802,7 +2802,7 @@
         <w:tc>
           <w:tcPr>
             <w:tcW w:type="dxa" w:w="2041"/>
-            <w:shd w:val="clear" w:color="auto" w:fill="FDF6F0"/>
+            <w:shd w:val="clear" w:color="auto" w:fill="F4F9F8"/>
             <w:tcMar>
               <w:top w:w="32" w:type="dxa"/>
               <w:bottom w:w="32" w:type="dxa"/>
@@ -2812,7 +2812,7 @@
             <w:tcBorders>
               <w:top w:val="none"/>
               <w:left w:val="none"/>
-              <w:bottom w:val="single" w:sz="4" w:space="0" w:color="E2D8CE"/>
+              <w:bottom w:val="single" w:sz="4" w:space="0" w:color="D4E5E1"/>
               <w:right w:val="none"/>
             </w:tcBorders>
           </w:tcPr>
@@ -2848,7 +2848,7 @@
             <w:tcBorders>
               <w:top w:val="none"/>
               <w:left w:val="none"/>
-              <w:bottom w:val="single" w:sz="4" w:space="0" w:color="E2D8CE"/>
+              <w:bottom w:val="single" w:sz="4" w:space="0" w:color="D4E5E1"/>
               <w:right w:val="none"/>
             </w:tcBorders>
           </w:tcPr>
@@ -2880,7 +2880,7 @@
             <w:tcBorders>
               <w:top w:val="none"/>
               <w:left w:val="none"/>
-              <w:bottom w:val="single" w:sz="4" w:space="0" w:color="E2D8CE"/>
+              <w:bottom w:val="single" w:sz="4" w:space="0" w:color="D4E5E1"/>
               <w:right w:val="none"/>
             </w:tcBorders>
           </w:tcPr>
@@ -2911,7 +2911,7 @@
             <w:tcBorders>
               <w:top w:val="none"/>
               <w:left w:val="none"/>
-              <w:bottom w:val="single" w:sz="4" w:space="0" w:color="E2D8CE"/>
+              <w:bottom w:val="single" w:sz="4" w:space="0" w:color="D4E5E1"/>
               <w:right w:val="none"/>
             </w:tcBorders>
           </w:tcPr>
@@ -2942,7 +2942,7 @@
             <w:tcBorders>
               <w:top w:val="none"/>
               <w:left w:val="none"/>
-              <w:bottom w:val="single" w:sz="4" w:space="0" w:color="E2D8CE"/>
+              <w:bottom w:val="single" w:sz="4" w:space="0" w:color="D4E5E1"/>
               <w:right w:val="none"/>
             </w:tcBorders>
           </w:tcPr>
@@ -2968,7 +2968,7 @@
         <w:tc>
           <w:tcPr>
             <w:tcW w:type="dxa" w:w="2721"/>
-            <w:shd w:val="clear" w:color="auto" w:fill="FDF6F0"/>
+            <w:shd w:val="clear" w:color="auto" w:fill="F4F9F8"/>
             <w:tcMar>
               <w:top w:w="32" w:type="dxa"/>
               <w:bottom w:w="32" w:type="dxa"/>
@@ -2978,7 +2978,7 @@
             <w:tcBorders>
               <w:top w:val="none"/>
               <w:left w:val="none"/>
-              <w:bottom w:val="single" w:sz="4" w:space="0" w:color="E2D8CE"/>
+              <w:bottom w:val="single" w:sz="4" w:space="0" w:color="D4E5E1"/>
               <w:right w:val="none"/>
             </w:tcBorders>
           </w:tcPr>
@@ -3000,7 +3000,7 @@
         <w:tc>
           <w:tcPr>
             <w:tcW w:type="dxa" w:w="3685"/>
-            <w:shd w:val="clear" w:color="auto" w:fill="FDF6F0"/>
+            <w:shd w:val="clear" w:color="auto" w:fill="F4F9F8"/>
             <w:tcMar>
               <w:top w:w="32" w:type="dxa"/>
               <w:bottom w:w="32" w:type="dxa"/>
@@ -3010,7 +3010,7 @@
             <w:tcBorders>
               <w:top w:val="none"/>
               <w:left w:val="none"/>
-              <w:bottom w:val="single" w:sz="4" w:space="0" w:color="E2D8CE"/>
+              <w:bottom w:val="single" w:sz="4" w:space="0" w:color="D4E5E1"/>
               <w:right w:val="none"/>
             </w:tcBorders>
           </w:tcPr>
@@ -3031,7 +3031,7 @@
         <w:tc>
           <w:tcPr>
             <w:tcW w:type="dxa" w:w="1247"/>
-            <w:shd w:val="clear" w:color="auto" w:fill="FDF6F0"/>
+            <w:shd w:val="clear" w:color="auto" w:fill="F4F9F8"/>
             <w:tcMar>
               <w:top w:w="32" w:type="dxa"/>
               <w:bottom w:w="32" w:type="dxa"/>
@@ -3041,7 +3041,7 @@
             <w:tcBorders>
               <w:top w:val="none"/>
               <w:left w:val="none"/>
-              <w:bottom w:val="single" w:sz="4" w:space="0" w:color="E2D8CE"/>
+              <w:bottom w:val="single" w:sz="4" w:space="0" w:color="D4E5E1"/>
               <w:right w:val="none"/>
             </w:tcBorders>
           </w:tcPr>
@@ -3062,7 +3062,7 @@
         <w:tc>
           <w:tcPr>
             <w:tcW w:type="dxa" w:w="2041"/>
-            <w:shd w:val="clear" w:color="auto" w:fill="FDF6F0"/>
+            <w:shd w:val="clear" w:color="auto" w:fill="F4F9F8"/>
             <w:tcMar>
               <w:top w:w="32" w:type="dxa"/>
               <w:bottom w:w="32" w:type="dxa"/>
@@ -3072,7 +3072,7 @@
             <w:tcBorders>
               <w:top w:val="none"/>
               <w:left w:val="none"/>
-              <w:bottom w:val="single" w:sz="4" w:space="0" w:color="E2D8CE"/>
+              <w:bottom w:val="single" w:sz="4" w:space="0" w:color="D4E5E1"/>
               <w:right w:val="none"/>
             </w:tcBorders>
           </w:tcPr>
@@ -3106,9 +3106,9 @@
               <w:right w:w="80" w:type="dxa"/>
             </w:tcMar>
             <w:tcBorders>
-              <w:top w:val="single" w:sz="12" w:space="0" w:color="A56341"/>
+              <w:top w:val="single" w:sz="12" w:space="0" w:color="00AA91"/>
               <w:left w:val="none"/>
-              <w:bottom w:val="single" w:sz="12" w:space="0" w:color="A56341"/>
+              <w:bottom w:val="single" w:sz="12" w:space="0" w:color="00AA91"/>
               <w:right w:val="none"/>
             </w:tcBorders>
           </w:tcPr>
@@ -3120,7 +3120,7 @@
               <w:rPr>
                 <w:rFonts w:ascii="Arial" w:hAnsi="Arial"/>
                 <w:b/>
-                <w:color w:val="102A43"/>
+                <w:color w:val="12213A"/>
                 <w:sz w:val="17"/>
               </w:rPr>
               <w:t>TOTAL PERMODALAN AWAL</w:t>
@@ -3138,9 +3138,9 @@
               <w:right w:w="80" w:type="dxa"/>
             </w:tcMar>
             <w:tcBorders>
-              <w:top w:val="single" w:sz="12" w:space="0" w:color="A56341"/>
+              <w:top w:val="single" w:sz="12" w:space="0" w:color="00AA91"/>
               <w:left w:val="none"/>
-              <w:bottom w:val="single" w:sz="12" w:space="0" w:color="A56341"/>
+              <w:bottom w:val="single" w:sz="12" w:space="0" w:color="00AA91"/>
               <w:right w:val="none"/>
             </w:tcBorders>
           </w:tcPr>
@@ -3157,9 +3157,9 @@
               <w:right w:w="80" w:type="dxa"/>
             </w:tcMar>
             <w:tcBorders>
-              <w:top w:val="single" w:sz="12" w:space="0" w:color="A56341"/>
+              <w:top w:val="single" w:sz="12" w:space="0" w:color="00AA91"/>
               <w:left w:val="none"/>
-              <w:bottom w:val="single" w:sz="12" w:space="0" w:color="A56341"/>
+              <w:bottom w:val="single" w:sz="12" w:space="0" w:color="00AA91"/>
               <w:right w:val="none"/>
             </w:tcBorders>
           </w:tcPr>
@@ -3176,9 +3176,9 @@
               <w:right w:w="80" w:type="dxa"/>
             </w:tcMar>
             <w:tcBorders>
-              <w:top w:val="single" w:sz="12" w:space="0" w:color="A56341"/>
+              <w:top w:val="single" w:sz="12" w:space="0" w:color="00AA91"/>
               <w:left w:val="none"/>
-              <w:bottom w:val="single" w:sz="12" w:space="0" w:color="A56341"/>
+              <w:bottom w:val="single" w:sz="12" w:space="0" w:color="00AA91"/>
               <w:right w:val="none"/>
             </w:tcBorders>
           </w:tcPr>
@@ -3190,7 +3190,7 @@
               <w:rPr>
                 <w:rFonts w:ascii="Arial" w:hAnsi="Arial"/>
                 <w:b/>
-                <w:color w:val="102A43"/>
+                <w:color w:val="12213A"/>
                 <w:sz w:val="18"/>
               </w:rPr>
               <w:t>Rp 15.000.000</w:t>
@@ -3213,7 +3213,7 @@
         <w:rPr>
           <w:rFonts w:ascii="Arial" w:hAnsi="Arial"/>
           <w:b/>
-          <w:color w:val="102A43"/>
+          <w:color w:val="12213A"/>
           <w:sz w:val="26"/>
         </w:rPr>
         <w:t>5. STRUKTUR HPP, SIMULASI KINERJA FINANSIAL &amp; BEP</w:t>
@@ -3228,7 +3228,7 @@
         <w:rPr>
           <w:rFonts w:ascii="Arial" w:hAnsi="Arial"/>
           <w:b/>
-          <w:color w:val="A56341"/>
+          <w:color w:val="00AA91"/>
           <w:sz w:val="21"/>
         </w:rPr>
         <w:t>5.1 Rincian HPP dan Margin Keuntungan Menu Kunci</w:t>
@@ -3271,7 +3271,7 @@
         <w:tc>
           <w:tcPr>
             <w:tcW w:type="dxa" w:w="2438"/>
-            <w:shd w:val="clear" w:color="auto" w:fill="102A43"/>
+            <w:shd w:val="clear" w:color="auto" w:fill="12213A"/>
             <w:tcMar>
               <w:top w:w="45" w:type="dxa"/>
               <w:bottom w:w="45" w:type="dxa"/>
@@ -3297,7 +3297,7 @@
         <w:tc>
           <w:tcPr>
             <w:tcW w:type="dxa" w:w="3175"/>
-            <w:shd w:val="clear" w:color="auto" w:fill="102A43"/>
+            <w:shd w:val="clear" w:color="auto" w:fill="12213A"/>
             <w:tcMar>
               <w:top w:w="45" w:type="dxa"/>
               <w:bottom w:w="45" w:type="dxa"/>
@@ -3323,7 +3323,7 @@
         <w:tc>
           <w:tcPr>
             <w:tcW w:type="dxa" w:w="1247"/>
-            <w:shd w:val="clear" w:color="auto" w:fill="102A43"/>
+            <w:shd w:val="clear" w:color="auto" w:fill="12213A"/>
             <w:tcMar>
               <w:top w:w="45" w:type="dxa"/>
               <w:bottom w:w="45" w:type="dxa"/>
@@ -3349,7 +3349,7 @@
         <w:tc>
           <w:tcPr>
             <w:tcW w:type="dxa" w:w="1247"/>
-            <w:shd w:val="clear" w:color="auto" w:fill="102A43"/>
+            <w:shd w:val="clear" w:color="auto" w:fill="12213A"/>
             <w:tcMar>
               <w:top w:w="45" w:type="dxa"/>
               <w:bottom w:w="45" w:type="dxa"/>
@@ -3375,7 +3375,7 @@
         <w:tc>
           <w:tcPr>
             <w:tcW w:type="dxa" w:w="1587"/>
-            <w:shd w:val="clear" w:color="auto" w:fill="102A43"/>
+            <w:shd w:val="clear" w:color="auto" w:fill="12213A"/>
             <w:tcMar>
               <w:top w:w="45" w:type="dxa"/>
               <w:bottom w:w="45" w:type="dxa"/>
@@ -3406,7 +3406,7 @@
         <w:tc>
           <w:tcPr>
             <w:tcW w:type="dxa" w:w="2438"/>
-            <w:shd w:val="clear" w:color="auto" w:fill="FDF6F0"/>
+            <w:shd w:val="clear" w:color="auto" w:fill="F4F9F8"/>
             <w:tcMar>
               <w:top w:w="16" w:type="dxa"/>
               <w:bottom w:w="16" w:type="dxa"/>
@@ -3416,7 +3416,7 @@
             <w:tcBorders>
               <w:top w:val="none"/>
               <w:left w:val="none"/>
-              <w:bottom w:val="single" w:sz="4" w:space="0" w:color="E2D8CE"/>
+              <w:bottom w:val="single" w:sz="4" w:space="0" w:color="D4E5E1"/>
               <w:right w:val="none"/>
             </w:tcBorders>
           </w:tcPr>
@@ -3438,7 +3438,7 @@
         <w:tc>
           <w:tcPr>
             <w:tcW w:type="dxa" w:w="3175"/>
-            <w:shd w:val="clear" w:color="auto" w:fill="FDF6F0"/>
+            <w:shd w:val="clear" w:color="auto" w:fill="F4F9F8"/>
             <w:tcMar>
               <w:top w:w="16" w:type="dxa"/>
               <w:bottom w:w="16" w:type="dxa"/>
@@ -3448,7 +3448,7 @@
             <w:tcBorders>
               <w:top w:val="none"/>
               <w:left w:val="none"/>
-              <w:bottom w:val="single" w:sz="4" w:space="0" w:color="E2D8CE"/>
+              <w:bottom w:val="single" w:sz="4" w:space="0" w:color="D4E5E1"/>
               <w:right w:val="none"/>
             </w:tcBorders>
           </w:tcPr>
@@ -3469,7 +3469,7 @@
         <w:tc>
           <w:tcPr>
             <w:tcW w:type="dxa" w:w="1247"/>
-            <w:shd w:val="clear" w:color="auto" w:fill="FDF6F0"/>
+            <w:shd w:val="clear" w:color="auto" w:fill="F4F9F8"/>
             <w:tcMar>
               <w:top w:w="16" w:type="dxa"/>
               <w:bottom w:w="16" w:type="dxa"/>
@@ -3479,7 +3479,7 @@
             <w:tcBorders>
               <w:top w:val="none"/>
               <w:left w:val="none"/>
-              <w:bottom w:val="single" w:sz="4" w:space="0" w:color="E2D8CE"/>
+              <w:bottom w:val="single" w:sz="4" w:space="0" w:color="D4E5E1"/>
               <w:right w:val="none"/>
             </w:tcBorders>
           </w:tcPr>
@@ -3500,7 +3500,7 @@
         <w:tc>
           <w:tcPr>
             <w:tcW w:type="dxa" w:w="1247"/>
-            <w:shd w:val="clear" w:color="auto" w:fill="FDF6F0"/>
+            <w:shd w:val="clear" w:color="auto" w:fill="F4F9F8"/>
             <w:tcMar>
               <w:top w:w="16" w:type="dxa"/>
               <w:bottom w:w="16" w:type="dxa"/>
@@ -3510,7 +3510,7 @@
             <w:tcBorders>
               <w:top w:val="none"/>
               <w:left w:val="none"/>
-              <w:bottom w:val="single" w:sz="4" w:space="0" w:color="E2D8CE"/>
+              <w:bottom w:val="single" w:sz="4" w:space="0" w:color="D4E5E1"/>
               <w:right w:val="none"/>
             </w:tcBorders>
           </w:tcPr>
@@ -3531,7 +3531,7 @@
         <w:tc>
           <w:tcPr>
             <w:tcW w:type="dxa" w:w="1587"/>
-            <w:shd w:val="clear" w:color="auto" w:fill="FDF6F0"/>
+            <w:shd w:val="clear" w:color="auto" w:fill="F4F9F8"/>
             <w:tcMar>
               <w:top w:w="16" w:type="dxa"/>
               <w:bottom w:w="16" w:type="dxa"/>
@@ -3541,7 +3541,7 @@
             <w:tcBorders>
               <w:top w:val="none"/>
               <w:left w:val="none"/>
-              <w:bottom w:val="single" w:sz="4" w:space="0" w:color="E2D8CE"/>
+              <w:bottom w:val="single" w:sz="4" w:space="0" w:color="D4E5E1"/>
               <w:right w:val="none"/>
             </w:tcBorders>
           </w:tcPr>
@@ -3578,7 +3578,7 @@
             <w:tcBorders>
               <w:top w:val="none"/>
               <w:left w:val="none"/>
-              <w:bottom w:val="single" w:sz="4" w:space="0" w:color="E2D8CE"/>
+              <w:bottom w:val="single" w:sz="4" w:space="0" w:color="D4E5E1"/>
               <w:right w:val="none"/>
             </w:tcBorders>
           </w:tcPr>
@@ -3610,7 +3610,7 @@
             <w:tcBorders>
               <w:top w:val="none"/>
               <w:left w:val="none"/>
-              <w:bottom w:val="single" w:sz="4" w:space="0" w:color="E2D8CE"/>
+              <w:bottom w:val="single" w:sz="4" w:space="0" w:color="D4E5E1"/>
               <w:right w:val="none"/>
             </w:tcBorders>
           </w:tcPr>
@@ -3641,7 +3641,7 @@
             <w:tcBorders>
               <w:top w:val="none"/>
               <w:left w:val="none"/>
-              <w:bottom w:val="single" w:sz="4" w:space="0" w:color="E2D8CE"/>
+              <w:bottom w:val="single" w:sz="4" w:space="0" w:color="D4E5E1"/>
               <w:right w:val="none"/>
             </w:tcBorders>
           </w:tcPr>
@@ -3672,7 +3672,7 @@
             <w:tcBorders>
               <w:top w:val="none"/>
               <w:left w:val="none"/>
-              <w:bottom w:val="single" w:sz="4" w:space="0" w:color="E2D8CE"/>
+              <w:bottom w:val="single" w:sz="4" w:space="0" w:color="D4E5E1"/>
               <w:right w:val="none"/>
             </w:tcBorders>
           </w:tcPr>
@@ -3703,7 +3703,7 @@
             <w:tcBorders>
               <w:top w:val="none"/>
               <w:left w:val="none"/>
-              <w:bottom w:val="single" w:sz="4" w:space="0" w:color="E2D8CE"/>
+              <w:bottom w:val="single" w:sz="4" w:space="0" w:color="D4E5E1"/>
               <w:right w:val="none"/>
             </w:tcBorders>
           </w:tcPr>
@@ -3730,7 +3730,7 @@
         <w:tc>
           <w:tcPr>
             <w:tcW w:type="dxa" w:w="2438"/>
-            <w:shd w:val="clear" w:color="auto" w:fill="FDF6F0"/>
+            <w:shd w:val="clear" w:color="auto" w:fill="F4F9F8"/>
             <w:tcMar>
               <w:top w:w="16" w:type="dxa"/>
               <w:bottom w:w="16" w:type="dxa"/>
@@ -3740,7 +3740,7 @@
             <w:tcBorders>
               <w:top w:val="none"/>
               <w:left w:val="none"/>
-              <w:bottom w:val="single" w:sz="4" w:space="0" w:color="E2D8CE"/>
+              <w:bottom w:val="single" w:sz="4" w:space="0" w:color="D4E5E1"/>
               <w:right w:val="none"/>
             </w:tcBorders>
           </w:tcPr>
@@ -3762,7 +3762,7 @@
         <w:tc>
           <w:tcPr>
             <w:tcW w:type="dxa" w:w="3175"/>
-            <w:shd w:val="clear" w:color="auto" w:fill="FDF6F0"/>
+            <w:shd w:val="clear" w:color="auto" w:fill="F4F9F8"/>
             <w:tcMar>
               <w:top w:w="16" w:type="dxa"/>
               <w:bottom w:w="16" w:type="dxa"/>
@@ -3772,7 +3772,7 @@
             <w:tcBorders>
               <w:top w:val="none"/>
               <w:left w:val="none"/>
-              <w:bottom w:val="single" w:sz="4" w:space="0" w:color="E2D8CE"/>
+              <w:bottom w:val="single" w:sz="4" w:space="0" w:color="D4E5E1"/>
               <w:right w:val="none"/>
             </w:tcBorders>
           </w:tcPr>
@@ -3793,7 +3793,7 @@
         <w:tc>
           <w:tcPr>
             <w:tcW w:type="dxa" w:w="1247"/>
-            <w:shd w:val="clear" w:color="auto" w:fill="FDF6F0"/>
+            <w:shd w:val="clear" w:color="auto" w:fill="F4F9F8"/>
             <w:tcMar>
               <w:top w:w="16" w:type="dxa"/>
               <w:bottom w:w="16" w:type="dxa"/>
@@ -3803,7 +3803,7 @@
             <w:tcBorders>
               <w:top w:val="none"/>
               <w:left w:val="none"/>
-              <w:bottom w:val="single" w:sz="4" w:space="0" w:color="E2D8CE"/>
+              <w:bottom w:val="single" w:sz="4" w:space="0" w:color="D4E5E1"/>
               <w:right w:val="none"/>
             </w:tcBorders>
           </w:tcPr>
@@ -3824,7 +3824,7 @@
         <w:tc>
           <w:tcPr>
             <w:tcW w:type="dxa" w:w="1247"/>
-            <w:shd w:val="clear" w:color="auto" w:fill="FDF6F0"/>
+            <w:shd w:val="clear" w:color="auto" w:fill="F4F9F8"/>
             <w:tcMar>
               <w:top w:w="16" w:type="dxa"/>
               <w:bottom w:w="16" w:type="dxa"/>
@@ -3834,7 +3834,7 @@
             <w:tcBorders>
               <w:top w:val="none"/>
               <w:left w:val="none"/>
-              <w:bottom w:val="single" w:sz="4" w:space="0" w:color="E2D8CE"/>
+              <w:bottom w:val="single" w:sz="4" w:space="0" w:color="D4E5E1"/>
               <w:right w:val="none"/>
             </w:tcBorders>
           </w:tcPr>
@@ -3855,7 +3855,7 @@
         <w:tc>
           <w:tcPr>
             <w:tcW w:type="dxa" w:w="1587"/>
-            <w:shd w:val="clear" w:color="auto" w:fill="FDF6F0"/>
+            <w:shd w:val="clear" w:color="auto" w:fill="F4F9F8"/>
             <w:tcMar>
               <w:top w:w="16" w:type="dxa"/>
               <w:bottom w:w="16" w:type="dxa"/>
@@ -3865,7 +3865,7 @@
             <w:tcBorders>
               <w:top w:val="none"/>
               <w:left w:val="none"/>
-              <w:bottom w:val="single" w:sz="4" w:space="0" w:color="E2D8CE"/>
+              <w:bottom w:val="single" w:sz="4" w:space="0" w:color="D4E5E1"/>
               <w:right w:val="none"/>
             </w:tcBorders>
           </w:tcPr>
@@ -3902,7 +3902,7 @@
             <w:tcBorders>
               <w:top w:val="none"/>
               <w:left w:val="none"/>
-              <w:bottom w:val="single" w:sz="4" w:space="0" w:color="E2D8CE"/>
+              <w:bottom w:val="single" w:sz="4" w:space="0" w:color="D4E5E1"/>
               <w:right w:val="none"/>
             </w:tcBorders>
           </w:tcPr>
@@ -3934,7 +3934,7 @@
             <w:tcBorders>
               <w:top w:val="none"/>
               <w:left w:val="none"/>
-              <w:bottom w:val="single" w:sz="4" w:space="0" w:color="E2D8CE"/>
+              <w:bottom w:val="single" w:sz="4" w:space="0" w:color="D4E5E1"/>
               <w:right w:val="none"/>
             </w:tcBorders>
           </w:tcPr>
@@ -3965,7 +3965,7 @@
             <w:tcBorders>
               <w:top w:val="none"/>
               <w:left w:val="none"/>
-              <w:bottom w:val="single" w:sz="4" w:space="0" w:color="E2D8CE"/>
+              <w:bottom w:val="single" w:sz="4" w:space="0" w:color="D4E5E1"/>
               <w:right w:val="none"/>
             </w:tcBorders>
           </w:tcPr>
@@ -3996,7 +3996,7 @@
             <w:tcBorders>
               <w:top w:val="none"/>
               <w:left w:val="none"/>
-              <w:bottom w:val="single" w:sz="4" w:space="0" w:color="E2D8CE"/>
+              <w:bottom w:val="single" w:sz="4" w:space="0" w:color="D4E5E1"/>
               <w:right w:val="none"/>
             </w:tcBorders>
           </w:tcPr>
@@ -4027,7 +4027,7 @@
             <w:tcBorders>
               <w:top w:val="none"/>
               <w:left w:val="none"/>
-              <w:bottom w:val="single" w:sz="4" w:space="0" w:color="E2D8CE"/>
+              <w:bottom w:val="single" w:sz="4" w:space="0" w:color="D4E5E1"/>
               <w:right w:val="none"/>
             </w:tcBorders>
           </w:tcPr>
@@ -4054,7 +4054,7 @@
         <w:tc>
           <w:tcPr>
             <w:tcW w:type="dxa" w:w="2438"/>
-            <w:shd w:val="clear" w:color="auto" w:fill="FDF6F0"/>
+            <w:shd w:val="clear" w:color="auto" w:fill="F4F9F8"/>
             <w:tcMar>
               <w:top w:w="16" w:type="dxa"/>
               <w:bottom w:w="16" w:type="dxa"/>
@@ -4064,7 +4064,7 @@
             <w:tcBorders>
               <w:top w:val="none"/>
               <w:left w:val="none"/>
-              <w:bottom w:val="single" w:sz="4" w:space="0" w:color="E2D8CE"/>
+              <w:bottom w:val="single" w:sz="4" w:space="0" w:color="D4E5E1"/>
               <w:right w:val="none"/>
             </w:tcBorders>
           </w:tcPr>
@@ -4086,7 +4086,7 @@
         <w:tc>
           <w:tcPr>
             <w:tcW w:type="dxa" w:w="3175"/>
-            <w:shd w:val="clear" w:color="auto" w:fill="FDF6F0"/>
+            <w:shd w:val="clear" w:color="auto" w:fill="F4F9F8"/>
             <w:tcMar>
               <w:top w:w="16" w:type="dxa"/>
               <w:bottom w:w="16" w:type="dxa"/>
@@ -4096,7 +4096,7 @@
             <w:tcBorders>
               <w:top w:val="none"/>
               <w:left w:val="none"/>
-              <w:bottom w:val="single" w:sz="4" w:space="0" w:color="E2D8CE"/>
+              <w:bottom w:val="single" w:sz="4" w:space="0" w:color="D4E5E1"/>
               <w:right w:val="none"/>
             </w:tcBorders>
           </w:tcPr>
@@ -4117,7 +4117,7 @@
         <w:tc>
           <w:tcPr>
             <w:tcW w:type="dxa" w:w="1247"/>
-            <w:shd w:val="clear" w:color="auto" w:fill="FDF6F0"/>
+            <w:shd w:val="clear" w:color="auto" w:fill="F4F9F8"/>
             <w:tcMar>
               <w:top w:w="16" w:type="dxa"/>
               <w:bottom w:w="16" w:type="dxa"/>
@@ -4127,7 +4127,7 @@
             <w:tcBorders>
               <w:top w:val="none"/>
               <w:left w:val="none"/>
-              <w:bottom w:val="single" w:sz="4" w:space="0" w:color="E2D8CE"/>
+              <w:bottom w:val="single" w:sz="4" w:space="0" w:color="D4E5E1"/>
               <w:right w:val="none"/>
             </w:tcBorders>
           </w:tcPr>
@@ -4148,7 +4148,7 @@
         <w:tc>
           <w:tcPr>
             <w:tcW w:type="dxa" w:w="1247"/>
-            <w:shd w:val="clear" w:color="auto" w:fill="FDF6F0"/>
+            <w:shd w:val="clear" w:color="auto" w:fill="F4F9F8"/>
             <w:tcMar>
               <w:top w:w="16" w:type="dxa"/>
               <w:bottom w:w="16" w:type="dxa"/>
@@ -4158,7 +4158,7 @@
             <w:tcBorders>
               <w:top w:val="none"/>
               <w:left w:val="none"/>
-              <w:bottom w:val="single" w:sz="4" w:space="0" w:color="E2D8CE"/>
+              <w:bottom w:val="single" w:sz="4" w:space="0" w:color="D4E5E1"/>
               <w:right w:val="none"/>
             </w:tcBorders>
           </w:tcPr>
@@ -4179,7 +4179,7 @@
         <w:tc>
           <w:tcPr>
             <w:tcW w:type="dxa" w:w="1587"/>
-            <w:shd w:val="clear" w:color="auto" w:fill="FDF6F0"/>
+            <w:shd w:val="clear" w:color="auto" w:fill="F4F9F8"/>
             <w:tcMar>
               <w:top w:w="16" w:type="dxa"/>
               <w:bottom w:w="16" w:type="dxa"/>
@@ -4189,7 +4189,7 @@
             <w:tcBorders>
               <w:top w:val="none"/>
               <w:left w:val="none"/>
-              <w:bottom w:val="single" w:sz="4" w:space="0" w:color="E2D8CE"/>
+              <w:bottom w:val="single" w:sz="4" w:space="0" w:color="D4E5E1"/>
               <w:right w:val="none"/>
             </w:tcBorders>
           </w:tcPr>
@@ -4226,7 +4226,7 @@
             <w:tcBorders>
               <w:top w:val="none"/>
               <w:left w:val="none"/>
-              <w:bottom w:val="single" w:sz="4" w:space="0" w:color="E2D8CE"/>
+              <w:bottom w:val="single" w:sz="4" w:space="0" w:color="D4E5E1"/>
               <w:right w:val="none"/>
             </w:tcBorders>
           </w:tcPr>
@@ -4258,7 +4258,7 @@
             <w:tcBorders>
               <w:top w:val="none"/>
               <w:left w:val="none"/>
-              <w:bottom w:val="single" w:sz="4" w:space="0" w:color="E2D8CE"/>
+              <w:bottom w:val="single" w:sz="4" w:space="0" w:color="D4E5E1"/>
               <w:right w:val="none"/>
             </w:tcBorders>
           </w:tcPr>
@@ -4289,7 +4289,7 @@
             <w:tcBorders>
               <w:top w:val="none"/>
               <w:left w:val="none"/>
-              <w:bottom w:val="single" w:sz="4" w:space="0" w:color="E2D8CE"/>
+              <w:bottom w:val="single" w:sz="4" w:space="0" w:color="D4E5E1"/>
               <w:right w:val="none"/>
             </w:tcBorders>
           </w:tcPr>
@@ -4320,7 +4320,7 @@
             <w:tcBorders>
               <w:top w:val="none"/>
               <w:left w:val="none"/>
-              <w:bottom w:val="single" w:sz="4" w:space="0" w:color="E2D8CE"/>
+              <w:bottom w:val="single" w:sz="4" w:space="0" w:color="D4E5E1"/>
               <w:right w:val="none"/>
             </w:tcBorders>
           </w:tcPr>
@@ -4351,7 +4351,7 @@
             <w:tcBorders>
               <w:top w:val="none"/>
               <w:left w:val="none"/>
-              <w:bottom w:val="single" w:sz="4" w:space="0" w:color="E2D8CE"/>
+              <w:bottom w:val="single" w:sz="4" w:space="0" w:color="D4E5E1"/>
               <w:right w:val="none"/>
             </w:tcBorders>
           </w:tcPr>
@@ -4378,7 +4378,7 @@
         <w:tc>
           <w:tcPr>
             <w:tcW w:type="dxa" w:w="2438"/>
-            <w:shd w:val="clear" w:color="auto" w:fill="FDF6F0"/>
+            <w:shd w:val="clear" w:color="auto" w:fill="F4F9F8"/>
             <w:tcMar>
               <w:top w:w="16" w:type="dxa"/>
               <w:bottom w:w="16" w:type="dxa"/>
@@ -4388,7 +4388,7 @@
             <w:tcBorders>
               <w:top w:val="none"/>
               <w:left w:val="none"/>
-              <w:bottom w:val="single" w:sz="4" w:space="0" w:color="E2D8CE"/>
+              <w:bottom w:val="single" w:sz="4" w:space="0" w:color="D4E5E1"/>
               <w:right w:val="none"/>
             </w:tcBorders>
           </w:tcPr>
@@ -4410,7 +4410,7 @@
         <w:tc>
           <w:tcPr>
             <w:tcW w:type="dxa" w:w="3175"/>
-            <w:shd w:val="clear" w:color="auto" w:fill="FDF6F0"/>
+            <w:shd w:val="clear" w:color="auto" w:fill="F4F9F8"/>
             <w:tcMar>
               <w:top w:w="16" w:type="dxa"/>
               <w:bottom w:w="16" w:type="dxa"/>
@@ -4420,7 +4420,7 @@
             <w:tcBorders>
               <w:top w:val="none"/>
               <w:left w:val="none"/>
-              <w:bottom w:val="single" w:sz="4" w:space="0" w:color="E2D8CE"/>
+              <w:bottom w:val="single" w:sz="4" w:space="0" w:color="D4E5E1"/>
               <w:right w:val="none"/>
             </w:tcBorders>
           </w:tcPr>
@@ -4441,7 +4441,7 @@
         <w:tc>
           <w:tcPr>
             <w:tcW w:type="dxa" w:w="1247"/>
-            <w:shd w:val="clear" w:color="auto" w:fill="FDF6F0"/>
+            <w:shd w:val="clear" w:color="auto" w:fill="F4F9F8"/>
             <w:tcMar>
               <w:top w:w="16" w:type="dxa"/>
               <w:bottom w:w="16" w:type="dxa"/>
@@ -4451,7 +4451,7 @@
             <w:tcBorders>
               <w:top w:val="none"/>
               <w:left w:val="none"/>
-              <w:bottom w:val="single" w:sz="4" w:space="0" w:color="E2D8CE"/>
+              <w:bottom w:val="single" w:sz="4" w:space="0" w:color="D4E5E1"/>
               <w:right w:val="none"/>
             </w:tcBorders>
           </w:tcPr>
@@ -4472,7 +4472,7 @@
         <w:tc>
           <w:tcPr>
             <w:tcW w:type="dxa" w:w="1247"/>
-            <w:shd w:val="clear" w:color="auto" w:fill="FDF6F0"/>
+            <w:shd w:val="clear" w:color="auto" w:fill="F4F9F8"/>
             <w:tcMar>
               <w:top w:w="16" w:type="dxa"/>
               <w:bottom w:w="16" w:type="dxa"/>
@@ -4482,7 +4482,7 @@
             <w:tcBorders>
               <w:top w:val="none"/>
               <w:left w:val="none"/>
-              <w:bottom w:val="single" w:sz="4" w:space="0" w:color="E2D8CE"/>
+              <w:bottom w:val="single" w:sz="4" w:space="0" w:color="D4E5E1"/>
               <w:right w:val="none"/>
             </w:tcBorders>
           </w:tcPr>
@@ -4503,7 +4503,7 @@
         <w:tc>
           <w:tcPr>
             <w:tcW w:type="dxa" w:w="1587"/>
-            <w:shd w:val="clear" w:color="auto" w:fill="FDF6F0"/>
+            <w:shd w:val="clear" w:color="auto" w:fill="F4F9F8"/>
             <w:tcMar>
               <w:top w:w="16" w:type="dxa"/>
               <w:bottom w:w="16" w:type="dxa"/>
@@ -4513,7 +4513,7 @@
             <w:tcBorders>
               <w:top w:val="none"/>
               <w:left w:val="none"/>
-              <w:bottom w:val="single" w:sz="4" w:space="0" w:color="E2D8CE"/>
+              <w:bottom w:val="single" w:sz="4" w:space="0" w:color="D4E5E1"/>
               <w:right w:val="none"/>
             </w:tcBorders>
           </w:tcPr>
@@ -4550,7 +4550,7 @@
             <w:tcBorders>
               <w:top w:val="none"/>
               <w:left w:val="none"/>
-              <w:bottom w:val="single" w:sz="4" w:space="0" w:color="E2D8CE"/>
+              <w:bottom w:val="single" w:sz="4" w:space="0" w:color="D4E5E1"/>
               <w:right w:val="none"/>
             </w:tcBorders>
           </w:tcPr>
@@ -4582,7 +4582,7 @@
             <w:tcBorders>
               <w:top w:val="none"/>
               <w:left w:val="none"/>
-              <w:bottom w:val="single" w:sz="4" w:space="0" w:color="E2D8CE"/>
+              <w:bottom w:val="single" w:sz="4" w:space="0" w:color="D4E5E1"/>
               <w:right w:val="none"/>
             </w:tcBorders>
           </w:tcPr>
@@ -4613,7 +4613,7 @@
             <w:tcBorders>
               <w:top w:val="none"/>
               <w:left w:val="none"/>
-              <w:bottom w:val="single" w:sz="4" w:space="0" w:color="E2D8CE"/>
+              <w:bottom w:val="single" w:sz="4" w:space="0" w:color="D4E5E1"/>
               <w:right w:val="none"/>
             </w:tcBorders>
           </w:tcPr>
@@ -4644,7 +4644,7 @@
             <w:tcBorders>
               <w:top w:val="none"/>
               <w:left w:val="none"/>
-              <w:bottom w:val="single" w:sz="4" w:space="0" w:color="E2D8CE"/>
+              <w:bottom w:val="single" w:sz="4" w:space="0" w:color="D4E5E1"/>
               <w:right w:val="none"/>
             </w:tcBorders>
           </w:tcPr>
@@ -4675,7 +4675,7 @@
             <w:tcBorders>
               <w:top w:val="none"/>
               <w:left w:val="none"/>
-              <w:bottom w:val="single" w:sz="4" w:space="0" w:color="E2D8CE"/>
+              <w:bottom w:val="single" w:sz="4" w:space="0" w:color="D4E5E1"/>
               <w:right w:val="none"/>
             </w:tcBorders>
           </w:tcPr>
@@ -4702,7 +4702,7 @@
         <w:tc>
           <w:tcPr>
             <w:tcW w:type="dxa" w:w="2438"/>
-            <w:shd w:val="clear" w:color="auto" w:fill="FDF6F0"/>
+            <w:shd w:val="clear" w:color="auto" w:fill="F4F9F8"/>
             <w:tcMar>
               <w:top w:w="16" w:type="dxa"/>
               <w:bottom w:w="16" w:type="dxa"/>
@@ -4712,7 +4712,7 @@
             <w:tcBorders>
               <w:top w:val="none"/>
               <w:left w:val="none"/>
-              <w:bottom w:val="single" w:sz="4" w:space="0" w:color="E2D8CE"/>
+              <w:bottom w:val="single" w:sz="4" w:space="0" w:color="D4E5E1"/>
               <w:right w:val="none"/>
             </w:tcBorders>
           </w:tcPr>
@@ -4734,7 +4734,7 @@
         <w:tc>
           <w:tcPr>
             <w:tcW w:type="dxa" w:w="3175"/>
-            <w:shd w:val="clear" w:color="auto" w:fill="FDF6F0"/>
+            <w:shd w:val="clear" w:color="auto" w:fill="F4F9F8"/>
             <w:tcMar>
               <w:top w:w="16" w:type="dxa"/>
               <w:bottom w:w="16" w:type="dxa"/>
@@ -4744,7 +4744,7 @@
             <w:tcBorders>
               <w:top w:val="none"/>
               <w:left w:val="none"/>
-              <w:bottom w:val="single" w:sz="4" w:space="0" w:color="E2D8CE"/>
+              <w:bottom w:val="single" w:sz="4" w:space="0" w:color="D4E5E1"/>
               <w:right w:val="none"/>
             </w:tcBorders>
           </w:tcPr>
@@ -4765,7 +4765,7 @@
         <w:tc>
           <w:tcPr>
             <w:tcW w:type="dxa" w:w="1247"/>
-            <w:shd w:val="clear" w:color="auto" w:fill="FDF6F0"/>
+            <w:shd w:val="clear" w:color="auto" w:fill="F4F9F8"/>
             <w:tcMar>
               <w:top w:w="16" w:type="dxa"/>
               <w:bottom w:w="16" w:type="dxa"/>
@@ -4775,7 +4775,7 @@
             <w:tcBorders>
               <w:top w:val="none"/>
               <w:left w:val="none"/>
-              <w:bottom w:val="single" w:sz="4" w:space="0" w:color="E2D8CE"/>
+              <w:bottom w:val="single" w:sz="4" w:space="0" w:color="D4E5E1"/>
               <w:right w:val="none"/>
             </w:tcBorders>
           </w:tcPr>
@@ -4796,7 +4796,7 @@
         <w:tc>
           <w:tcPr>
             <w:tcW w:type="dxa" w:w="1247"/>
-            <w:shd w:val="clear" w:color="auto" w:fill="FDF6F0"/>
+            <w:shd w:val="clear" w:color="auto" w:fill="F4F9F8"/>
             <w:tcMar>
               <w:top w:w="16" w:type="dxa"/>
               <w:bottom w:w="16" w:type="dxa"/>
@@ -4806,7 +4806,7 @@
             <w:tcBorders>
               <w:top w:val="none"/>
               <w:left w:val="none"/>
-              <w:bottom w:val="single" w:sz="4" w:space="0" w:color="E2D8CE"/>
+              <w:bottom w:val="single" w:sz="4" w:space="0" w:color="D4E5E1"/>
               <w:right w:val="none"/>
             </w:tcBorders>
           </w:tcPr>
@@ -4827,7 +4827,7 @@
         <w:tc>
           <w:tcPr>
             <w:tcW w:type="dxa" w:w="1587"/>
-            <w:shd w:val="clear" w:color="auto" w:fill="FDF6F0"/>
+            <w:shd w:val="clear" w:color="auto" w:fill="F4F9F8"/>
             <w:tcMar>
               <w:top w:w="16" w:type="dxa"/>
               <w:bottom w:w="16" w:type="dxa"/>
@@ -4837,7 +4837,7 @@
             <w:tcBorders>
               <w:top w:val="none"/>
               <w:left w:val="none"/>
-              <w:bottom w:val="single" w:sz="4" w:space="0" w:color="E2D8CE"/>
+              <w:bottom w:val="single" w:sz="4" w:space="0" w:color="D4E5E1"/>
               <w:right w:val="none"/>
             </w:tcBorders>
           </w:tcPr>
@@ -4874,7 +4874,7 @@
             <w:tcBorders>
               <w:top w:val="none"/>
               <w:left w:val="none"/>
-              <w:bottom w:val="single" w:sz="4" w:space="0" w:color="E2D8CE"/>
+              <w:bottom w:val="single" w:sz="4" w:space="0" w:color="D4E5E1"/>
               <w:right w:val="none"/>
             </w:tcBorders>
           </w:tcPr>
@@ -4906,7 +4906,7 @@
             <w:tcBorders>
               <w:top w:val="none"/>
               <w:left w:val="none"/>
-              <w:bottom w:val="single" w:sz="4" w:space="0" w:color="E2D8CE"/>
+              <w:bottom w:val="single" w:sz="4" w:space="0" w:color="D4E5E1"/>
               <w:right w:val="none"/>
             </w:tcBorders>
           </w:tcPr>
@@ -4937,7 +4937,7 @@
             <w:tcBorders>
               <w:top w:val="none"/>
               <w:left w:val="none"/>
-              <w:bottom w:val="single" w:sz="4" w:space="0" w:color="E2D8CE"/>
+              <w:bottom w:val="single" w:sz="4" w:space="0" w:color="D4E5E1"/>
               <w:right w:val="none"/>
             </w:tcBorders>
           </w:tcPr>
@@ -4968,7 +4968,7 @@
             <w:tcBorders>
               <w:top w:val="none"/>
               <w:left w:val="none"/>
-              <w:bottom w:val="single" w:sz="4" w:space="0" w:color="E2D8CE"/>
+              <w:bottom w:val="single" w:sz="4" w:space="0" w:color="D4E5E1"/>
               <w:right w:val="none"/>
             </w:tcBorders>
           </w:tcPr>
@@ -4999,7 +4999,7 @@
             <w:tcBorders>
               <w:top w:val="none"/>
               <w:left w:val="none"/>
-              <w:bottom w:val="single" w:sz="4" w:space="0" w:color="E2D8CE"/>
+              <w:bottom w:val="single" w:sz="4" w:space="0" w:color="D4E5E1"/>
               <w:right w:val="none"/>
             </w:tcBorders>
           </w:tcPr>
@@ -5026,7 +5026,7 @@
         <w:tc>
           <w:tcPr>
             <w:tcW w:type="dxa" w:w="2438"/>
-            <w:shd w:val="clear" w:color="auto" w:fill="FDF6F0"/>
+            <w:shd w:val="clear" w:color="auto" w:fill="F4F9F8"/>
             <w:tcMar>
               <w:top w:w="16" w:type="dxa"/>
               <w:bottom w:w="16" w:type="dxa"/>
@@ -5036,7 +5036,7 @@
             <w:tcBorders>
               <w:top w:val="none"/>
               <w:left w:val="none"/>
-              <w:bottom w:val="single" w:sz="4" w:space="0" w:color="E2D8CE"/>
+              <w:bottom w:val="single" w:sz="4" w:space="0" w:color="D4E5E1"/>
               <w:right w:val="none"/>
             </w:tcBorders>
           </w:tcPr>
@@ -5058,7 +5058,7 @@
         <w:tc>
           <w:tcPr>
             <w:tcW w:type="dxa" w:w="3175"/>
-            <w:shd w:val="clear" w:color="auto" w:fill="FDF6F0"/>
+            <w:shd w:val="clear" w:color="auto" w:fill="F4F9F8"/>
             <w:tcMar>
               <w:top w:w="16" w:type="dxa"/>
               <w:bottom w:w="16" w:type="dxa"/>
@@ -5068,7 +5068,7 @@
             <w:tcBorders>
               <w:top w:val="none"/>
               <w:left w:val="none"/>
-              <w:bottom w:val="single" w:sz="4" w:space="0" w:color="E2D8CE"/>
+              <w:bottom w:val="single" w:sz="4" w:space="0" w:color="D4E5E1"/>
               <w:right w:val="none"/>
             </w:tcBorders>
           </w:tcPr>
@@ -5089,7 +5089,7 @@
         <w:tc>
           <w:tcPr>
             <w:tcW w:type="dxa" w:w="1247"/>
-            <w:shd w:val="clear" w:color="auto" w:fill="FDF6F0"/>
+            <w:shd w:val="clear" w:color="auto" w:fill="F4F9F8"/>
             <w:tcMar>
               <w:top w:w="16" w:type="dxa"/>
               <w:bottom w:w="16" w:type="dxa"/>
@@ -5099,7 +5099,7 @@
             <w:tcBorders>
               <w:top w:val="none"/>
               <w:left w:val="none"/>
-              <w:bottom w:val="single" w:sz="4" w:space="0" w:color="E2D8CE"/>
+              <w:bottom w:val="single" w:sz="4" w:space="0" w:color="D4E5E1"/>
               <w:right w:val="none"/>
             </w:tcBorders>
           </w:tcPr>
@@ -5120,7 +5120,7 @@
         <w:tc>
           <w:tcPr>
             <w:tcW w:type="dxa" w:w="1247"/>
-            <w:shd w:val="clear" w:color="auto" w:fill="FDF6F0"/>
+            <w:shd w:val="clear" w:color="auto" w:fill="F4F9F8"/>
             <w:tcMar>
               <w:top w:w="16" w:type="dxa"/>
               <w:bottom w:w="16" w:type="dxa"/>
@@ -5130,7 +5130,7 @@
             <w:tcBorders>
               <w:top w:val="none"/>
               <w:left w:val="none"/>
-              <w:bottom w:val="single" w:sz="4" w:space="0" w:color="E2D8CE"/>
+              <w:bottom w:val="single" w:sz="4" w:space="0" w:color="D4E5E1"/>
               <w:right w:val="none"/>
             </w:tcBorders>
           </w:tcPr>
@@ -5151,7 +5151,7 @@
         <w:tc>
           <w:tcPr>
             <w:tcW w:type="dxa" w:w="1587"/>
-            <w:shd w:val="clear" w:color="auto" w:fill="FDF6F0"/>
+            <w:shd w:val="clear" w:color="auto" w:fill="F4F9F8"/>
             <w:tcMar>
               <w:top w:w="16" w:type="dxa"/>
               <w:bottom w:w="16" w:type="dxa"/>
@@ -5161,7 +5161,7 @@
             <w:tcBorders>
               <w:top w:val="none"/>
               <w:left w:val="none"/>
-              <w:bottom w:val="single" w:sz="4" w:space="0" w:color="E2D8CE"/>
+              <w:bottom w:val="single" w:sz="4" w:space="0" w:color="D4E5E1"/>
               <w:right w:val="none"/>
             </w:tcBorders>
           </w:tcPr>
@@ -5198,7 +5198,7 @@
             <w:tcBorders>
               <w:top w:val="none"/>
               <w:left w:val="none"/>
-              <w:bottom w:val="single" w:sz="4" w:space="0" w:color="E2D8CE"/>
+              <w:bottom w:val="single" w:sz="4" w:space="0" w:color="D4E5E1"/>
               <w:right w:val="none"/>
             </w:tcBorders>
           </w:tcPr>
@@ -5230,7 +5230,7 @@
             <w:tcBorders>
               <w:top w:val="none"/>
               <w:left w:val="none"/>
-              <w:bottom w:val="single" w:sz="4" w:space="0" w:color="E2D8CE"/>
+              <w:bottom w:val="single" w:sz="4" w:space="0" w:color="D4E5E1"/>
               <w:right w:val="none"/>
             </w:tcBorders>
           </w:tcPr>
@@ -5261,7 +5261,7 @@
             <w:tcBorders>
               <w:top w:val="none"/>
               <w:left w:val="none"/>
-              <w:bottom w:val="single" w:sz="4" w:space="0" w:color="E2D8CE"/>
+              <w:bottom w:val="single" w:sz="4" w:space="0" w:color="D4E5E1"/>
               <w:right w:val="none"/>
             </w:tcBorders>
           </w:tcPr>
@@ -5292,7 +5292,7 @@
             <w:tcBorders>
               <w:top w:val="none"/>
               <w:left w:val="none"/>
-              <w:bottom w:val="single" w:sz="4" w:space="0" w:color="E2D8CE"/>
+              <w:bottom w:val="single" w:sz="4" w:space="0" w:color="D4E5E1"/>
               <w:right w:val="none"/>
             </w:tcBorders>
           </w:tcPr>
@@ -5323,7 +5323,7 @@
             <w:tcBorders>
               <w:top w:val="none"/>
               <w:left w:val="none"/>
-              <w:bottom w:val="single" w:sz="4" w:space="0" w:color="E2D8CE"/>
+              <w:bottom w:val="single" w:sz="4" w:space="0" w:color="D4E5E1"/>
               <w:right w:val="none"/>
             </w:tcBorders>
           </w:tcPr>
@@ -5353,7 +5353,7 @@
         <w:rPr>
           <w:rFonts w:ascii="Arial" w:hAnsi="Arial"/>
           <w:b/>
-          <w:color w:val="A56341"/>
+          <w:color w:val="00AA91"/>
           <w:sz w:val="21"/>
         </w:rPr>
         <w:t>5.2 Proyeksi Kinerja Keuangan &amp; Waktu Balik Modal (BEP)</w:t>
@@ -5379,7 +5379,7 @@
         <w:tc>
           <w:tcPr>
             <w:tcW w:type="dxa" w:w="2891"/>
-            <w:shd w:val="clear" w:color="auto" w:fill="102A43"/>
+            <w:shd w:val="clear" w:color="auto" w:fill="12213A"/>
             <w:tcMar>
               <w:top w:w="32" w:type="dxa"/>
               <w:bottom w:w="32" w:type="dxa"/>
@@ -5405,7 +5405,7 @@
         <w:tc>
           <w:tcPr>
             <w:tcW w:type="dxa" w:w="2268"/>
-            <w:shd w:val="clear" w:color="auto" w:fill="102A43"/>
+            <w:shd w:val="clear" w:color="auto" w:fill="12213A"/>
             <w:tcMar>
               <w:top w:w="32" w:type="dxa"/>
               <w:bottom w:w="32" w:type="dxa"/>
@@ -5431,7 +5431,7 @@
         <w:tc>
           <w:tcPr>
             <w:tcW w:type="dxa" w:w="2268"/>
-            <w:shd w:val="clear" w:color="auto" w:fill="102A43"/>
+            <w:shd w:val="clear" w:color="auto" w:fill="12213A"/>
             <w:tcMar>
               <w:top w:w="32" w:type="dxa"/>
               <w:bottom w:w="32" w:type="dxa"/>
@@ -5457,7 +5457,7 @@
         <w:tc>
           <w:tcPr>
             <w:tcW w:type="dxa" w:w="2268"/>
-            <w:shd w:val="clear" w:color="auto" w:fill="102A43"/>
+            <w:shd w:val="clear" w:color="auto" w:fill="12213A"/>
             <w:tcMar>
               <w:top w:w="32" w:type="dxa"/>
               <w:bottom w:w="32" w:type="dxa"/>
@@ -5488,7 +5488,7 @@
         <w:tc>
           <w:tcPr>
             <w:tcW w:type="dxa" w:w="2891"/>
-            <w:shd w:val="clear" w:color="auto" w:fill="FDF6F0"/>
+            <w:shd w:val="clear" w:color="auto" w:fill="F4F9F8"/>
             <w:tcMar>
               <w:top w:w="18" w:type="dxa"/>
               <w:bottom w:w="18" w:type="dxa"/>
@@ -5498,7 +5498,7 @@
             <w:tcBorders>
               <w:top w:val="none"/>
               <w:left w:val="none"/>
-              <w:bottom w:val="single" w:sz="4" w:space="0" w:color="E2D8CE"/>
+              <w:bottom w:val="single" w:sz="4" w:space="0" w:color="D4E5E1"/>
               <w:right w:val="none"/>
             </w:tcBorders>
           </w:tcPr>
@@ -5520,7 +5520,7 @@
         <w:tc>
           <w:tcPr>
             <w:tcW w:type="dxa" w:w="2268"/>
-            <w:shd w:val="clear" w:color="auto" w:fill="FDF6F0"/>
+            <w:shd w:val="clear" w:color="auto" w:fill="F4F9F8"/>
             <w:tcMar>
               <w:top w:w="18" w:type="dxa"/>
               <w:bottom w:w="18" w:type="dxa"/>
@@ -5530,7 +5530,7 @@
             <w:tcBorders>
               <w:top w:val="none"/>
               <w:left w:val="none"/>
-              <w:bottom w:val="single" w:sz="4" w:space="0" w:color="E2D8CE"/>
+              <w:bottom w:val="single" w:sz="4" w:space="0" w:color="D4E5E1"/>
               <w:right w:val="none"/>
             </w:tcBorders>
           </w:tcPr>
@@ -5552,7 +5552,7 @@
         <w:tc>
           <w:tcPr>
             <w:tcW w:type="dxa" w:w="2268"/>
-            <w:shd w:val="clear" w:color="auto" w:fill="FDF6F0"/>
+            <w:shd w:val="clear" w:color="auto" w:fill="F4F9F8"/>
             <w:tcMar>
               <w:top w:w="18" w:type="dxa"/>
               <w:bottom w:w="18" w:type="dxa"/>
@@ -5562,7 +5562,7 @@
             <w:tcBorders>
               <w:top w:val="none"/>
               <w:left w:val="none"/>
-              <w:bottom w:val="single" w:sz="4" w:space="0" w:color="E2D8CE"/>
+              <w:bottom w:val="single" w:sz="4" w:space="0" w:color="D4E5E1"/>
               <w:right w:val="none"/>
             </w:tcBorders>
           </w:tcPr>
@@ -5584,7 +5584,7 @@
         <w:tc>
           <w:tcPr>
             <w:tcW w:type="dxa" w:w="2268"/>
-            <w:shd w:val="clear" w:color="auto" w:fill="FDF6F0"/>
+            <w:shd w:val="clear" w:color="auto" w:fill="F4F9F8"/>
             <w:tcMar>
               <w:top w:w="18" w:type="dxa"/>
               <w:bottom w:w="18" w:type="dxa"/>
@@ -5594,7 +5594,7 @@
             <w:tcBorders>
               <w:top w:val="none"/>
               <w:left w:val="none"/>
-              <w:bottom w:val="single" w:sz="4" w:space="0" w:color="E2D8CE"/>
+              <w:bottom w:val="single" w:sz="4" w:space="0" w:color="D4E5E1"/>
               <w:right w:val="none"/>
             </w:tcBorders>
           </w:tcPr>
@@ -5631,7 +5631,7 @@
             <w:tcBorders>
               <w:top w:val="none"/>
               <w:left w:val="none"/>
-              <w:bottom w:val="single" w:sz="4" w:space="0" w:color="E2D8CE"/>
+              <w:bottom w:val="single" w:sz="4" w:space="0" w:color="D4E5E1"/>
               <w:right w:val="none"/>
             </w:tcBorders>
           </w:tcPr>
@@ -5663,7 +5663,7 @@
             <w:tcBorders>
               <w:top w:val="none"/>
               <w:left w:val="none"/>
-              <w:bottom w:val="single" w:sz="4" w:space="0" w:color="E2D8CE"/>
+              <w:bottom w:val="single" w:sz="4" w:space="0" w:color="D4E5E1"/>
               <w:right w:val="none"/>
             </w:tcBorders>
           </w:tcPr>
@@ -5695,7 +5695,7 @@
             <w:tcBorders>
               <w:top w:val="none"/>
               <w:left w:val="none"/>
-              <w:bottom w:val="single" w:sz="4" w:space="0" w:color="E2D8CE"/>
+              <w:bottom w:val="single" w:sz="4" w:space="0" w:color="D4E5E1"/>
               <w:right w:val="none"/>
             </w:tcBorders>
           </w:tcPr>
@@ -5727,7 +5727,7 @@
             <w:tcBorders>
               <w:top w:val="none"/>
               <w:left w:val="none"/>
-              <w:bottom w:val="single" w:sz="4" w:space="0" w:color="E2D8CE"/>
+              <w:bottom w:val="single" w:sz="4" w:space="0" w:color="D4E5E1"/>
               <w:right w:val="none"/>
             </w:tcBorders>
           </w:tcPr>
@@ -5754,7 +5754,7 @@
         <w:tc>
           <w:tcPr>
             <w:tcW w:type="dxa" w:w="2891"/>
-            <w:shd w:val="clear" w:color="auto" w:fill="FDF6F0"/>
+            <w:shd w:val="clear" w:color="auto" w:fill="F4F9F8"/>
             <w:tcMar>
               <w:top w:w="18" w:type="dxa"/>
               <w:bottom w:w="18" w:type="dxa"/>
@@ -5764,7 +5764,7 @@
             <w:tcBorders>
               <w:top w:val="none"/>
               <w:left w:val="none"/>
-              <w:bottom w:val="single" w:sz="4" w:space="0" w:color="E2D8CE"/>
+              <w:bottom w:val="single" w:sz="4" w:space="0" w:color="D4E5E1"/>
               <w:right w:val="none"/>
             </w:tcBorders>
           </w:tcPr>
@@ -5786,7 +5786,7 @@
         <w:tc>
           <w:tcPr>
             <w:tcW w:type="dxa" w:w="2268"/>
-            <w:shd w:val="clear" w:color="auto" w:fill="FDF6F0"/>
+            <w:shd w:val="clear" w:color="auto" w:fill="F4F9F8"/>
             <w:tcMar>
               <w:top w:w="18" w:type="dxa"/>
               <w:bottom w:w="18" w:type="dxa"/>
@@ -5796,7 +5796,7 @@
             <w:tcBorders>
               <w:top w:val="none"/>
               <w:left w:val="none"/>
-              <w:bottom w:val="single" w:sz="4" w:space="0" w:color="E2D8CE"/>
+              <w:bottom w:val="single" w:sz="4" w:space="0" w:color="D4E5E1"/>
               <w:right w:val="none"/>
             </w:tcBorders>
           </w:tcPr>
@@ -5818,7 +5818,7 @@
         <w:tc>
           <w:tcPr>
             <w:tcW w:type="dxa" w:w="2268"/>
-            <w:shd w:val="clear" w:color="auto" w:fill="FDF6F0"/>
+            <w:shd w:val="clear" w:color="auto" w:fill="F4F9F8"/>
             <w:tcMar>
               <w:top w:w="18" w:type="dxa"/>
               <w:bottom w:w="18" w:type="dxa"/>
@@ -5828,7 +5828,7 @@
             <w:tcBorders>
               <w:top w:val="none"/>
               <w:left w:val="none"/>
-              <w:bottom w:val="single" w:sz="4" w:space="0" w:color="E2D8CE"/>
+              <w:bottom w:val="single" w:sz="4" w:space="0" w:color="D4E5E1"/>
               <w:right w:val="none"/>
             </w:tcBorders>
           </w:tcPr>
@@ -5850,7 +5850,7 @@
         <w:tc>
           <w:tcPr>
             <w:tcW w:type="dxa" w:w="2268"/>
-            <w:shd w:val="clear" w:color="auto" w:fill="FDF6F0"/>
+            <w:shd w:val="clear" w:color="auto" w:fill="F4F9F8"/>
             <w:tcMar>
               <w:top w:w="18" w:type="dxa"/>
               <w:bottom w:w="18" w:type="dxa"/>
@@ -5860,7 +5860,7 @@
             <w:tcBorders>
               <w:top w:val="none"/>
               <w:left w:val="none"/>
-              <w:bottom w:val="single" w:sz="4" w:space="0" w:color="E2D8CE"/>
+              <w:bottom w:val="single" w:sz="4" w:space="0" w:color="D4E5E1"/>
               <w:right w:val="none"/>
             </w:tcBorders>
           </w:tcPr>
@@ -5897,7 +5897,7 @@
             <w:tcBorders>
               <w:top w:val="none"/>
               <w:left w:val="none"/>
-              <w:bottom w:val="single" w:sz="4" w:space="0" w:color="E2D8CE"/>
+              <w:bottom w:val="single" w:sz="4" w:space="0" w:color="D4E5E1"/>
               <w:right w:val="none"/>
             </w:tcBorders>
           </w:tcPr>
@@ -5929,7 +5929,7 @@
             <w:tcBorders>
               <w:top w:val="none"/>
               <w:left w:val="none"/>
-              <w:bottom w:val="single" w:sz="4" w:space="0" w:color="E2D8CE"/>
+              <w:bottom w:val="single" w:sz="4" w:space="0" w:color="D4E5E1"/>
               <w:right w:val="none"/>
             </w:tcBorders>
           </w:tcPr>
@@ -5961,7 +5961,7 @@
             <w:tcBorders>
               <w:top w:val="none"/>
               <w:left w:val="none"/>
-              <w:bottom w:val="single" w:sz="4" w:space="0" w:color="E2D8CE"/>
+              <w:bottom w:val="single" w:sz="4" w:space="0" w:color="D4E5E1"/>
               <w:right w:val="none"/>
             </w:tcBorders>
           </w:tcPr>
@@ -5993,7 +5993,7 @@
             <w:tcBorders>
               <w:top w:val="none"/>
               <w:left w:val="none"/>
-              <w:bottom w:val="single" w:sz="4" w:space="0" w:color="E2D8CE"/>
+              <w:bottom w:val="single" w:sz="4" w:space="0" w:color="D4E5E1"/>
               <w:right w:val="none"/>
             </w:tcBorders>
           </w:tcPr>
@@ -6020,7 +6020,7 @@
         <w:tc>
           <w:tcPr>
             <w:tcW w:type="dxa" w:w="2891"/>
-            <w:shd w:val="clear" w:color="auto" w:fill="FDF6F0"/>
+            <w:shd w:val="clear" w:color="auto" w:fill="F4F9F8"/>
             <w:tcMar>
               <w:top w:w="18" w:type="dxa"/>
               <w:bottom w:w="18" w:type="dxa"/>
@@ -6030,7 +6030,7 @@
             <w:tcBorders>
               <w:top w:val="none"/>
               <w:left w:val="none"/>
-              <w:bottom w:val="single" w:sz="4" w:space="0" w:color="E2D8CE"/>
+              <w:bottom w:val="single" w:sz="4" w:space="0" w:color="D4E5E1"/>
               <w:right w:val="none"/>
             </w:tcBorders>
           </w:tcPr>
@@ -6052,7 +6052,7 @@
         <w:tc>
           <w:tcPr>
             <w:tcW w:type="dxa" w:w="2268"/>
-            <w:shd w:val="clear" w:color="auto" w:fill="FDF6F0"/>
+            <w:shd w:val="clear" w:color="auto" w:fill="F4F9F8"/>
             <w:tcMar>
               <w:top w:w="18" w:type="dxa"/>
               <w:bottom w:w="18" w:type="dxa"/>
@@ -6062,7 +6062,7 @@
             <w:tcBorders>
               <w:top w:val="none"/>
               <w:left w:val="none"/>
-              <w:bottom w:val="single" w:sz="4" w:space="0" w:color="E2D8CE"/>
+              <w:bottom w:val="single" w:sz="4" w:space="0" w:color="D4E5E1"/>
               <w:right w:val="none"/>
             </w:tcBorders>
           </w:tcPr>
@@ -6084,7 +6084,7 @@
         <w:tc>
           <w:tcPr>
             <w:tcW w:type="dxa" w:w="2268"/>
-            <w:shd w:val="clear" w:color="auto" w:fill="FDF6F0"/>
+            <w:shd w:val="clear" w:color="auto" w:fill="F4F9F8"/>
             <w:tcMar>
               <w:top w:w="18" w:type="dxa"/>
               <w:bottom w:w="18" w:type="dxa"/>
@@ -6094,7 +6094,7 @@
             <w:tcBorders>
               <w:top w:val="none"/>
               <w:left w:val="none"/>
-              <w:bottom w:val="single" w:sz="4" w:space="0" w:color="E2D8CE"/>
+              <w:bottom w:val="single" w:sz="4" w:space="0" w:color="D4E5E1"/>
               <w:right w:val="none"/>
             </w:tcBorders>
           </w:tcPr>
@@ -6116,7 +6116,7 @@
         <w:tc>
           <w:tcPr>
             <w:tcW w:type="dxa" w:w="2268"/>
-            <w:shd w:val="clear" w:color="auto" w:fill="FDF6F0"/>
+            <w:shd w:val="clear" w:color="auto" w:fill="F4F9F8"/>
             <w:tcMar>
               <w:top w:w="18" w:type="dxa"/>
               <w:bottom w:w="18" w:type="dxa"/>
@@ -6126,7 +6126,7 @@
             <w:tcBorders>
               <w:top w:val="none"/>
               <w:left w:val="none"/>
-              <w:bottom w:val="single" w:sz="4" w:space="0" w:color="E2D8CE"/>
+              <w:bottom w:val="single" w:sz="4" w:space="0" w:color="D4E5E1"/>
               <w:right w:val="none"/>
             </w:tcBorders>
           </w:tcPr>
@@ -6163,7 +6163,7 @@
             <w:tcBorders>
               <w:top w:val="none"/>
               <w:left w:val="none"/>
-              <w:bottom w:val="single" w:sz="4" w:space="0" w:color="E2D8CE"/>
+              <w:bottom w:val="single" w:sz="4" w:space="0" w:color="D4E5E1"/>
               <w:right w:val="none"/>
             </w:tcBorders>
           </w:tcPr>
@@ -6195,7 +6195,7 @@
             <w:tcBorders>
               <w:top w:val="none"/>
               <w:left w:val="none"/>
-              <w:bottom w:val="single" w:sz="4" w:space="0" w:color="E2D8CE"/>
+              <w:bottom w:val="single" w:sz="4" w:space="0" w:color="D4E5E1"/>
               <w:right w:val="none"/>
             </w:tcBorders>
           </w:tcPr>
@@ -6227,7 +6227,7 @@
             <w:tcBorders>
               <w:top w:val="none"/>
               <w:left w:val="none"/>
-              <w:bottom w:val="single" w:sz="4" w:space="0" w:color="E2D8CE"/>
+              <w:bottom w:val="single" w:sz="4" w:space="0" w:color="D4E5E1"/>
               <w:right w:val="none"/>
             </w:tcBorders>
           </w:tcPr>
@@ -6259,7 +6259,7 @@
             <w:tcBorders>
               <w:top w:val="none"/>
               <w:left w:val="none"/>
-              <w:bottom w:val="single" w:sz="4" w:space="0" w:color="E2D8CE"/>
+              <w:bottom w:val="single" w:sz="4" w:space="0" w:color="D4E5E1"/>
               <w:right w:val="none"/>
             </w:tcBorders>
           </w:tcPr>
@@ -6286,7 +6286,7 @@
         <w:tc>
           <w:tcPr>
             <w:tcW w:type="dxa" w:w="2891"/>
-            <w:shd w:val="clear" w:color="auto" w:fill="FDF6F0"/>
+            <w:shd w:val="clear" w:color="auto" w:fill="F4F9F8"/>
             <w:tcMar>
               <w:top w:w="18" w:type="dxa"/>
               <w:bottom w:w="18" w:type="dxa"/>
@@ -6296,7 +6296,7 @@
             <w:tcBorders>
               <w:top w:val="none"/>
               <w:left w:val="none"/>
-              <w:bottom w:val="single" w:sz="4" w:space="0" w:color="E2D8CE"/>
+              <w:bottom w:val="single" w:sz="4" w:space="0" w:color="D4E5E1"/>
               <w:right w:val="none"/>
             </w:tcBorders>
           </w:tcPr>
@@ -6318,7 +6318,7 @@
         <w:tc>
           <w:tcPr>
             <w:tcW w:type="dxa" w:w="2268"/>
-            <w:shd w:val="clear" w:color="auto" w:fill="FDF6F0"/>
+            <w:shd w:val="clear" w:color="auto" w:fill="F4F9F8"/>
             <w:tcMar>
               <w:top w:w="18" w:type="dxa"/>
               <w:bottom w:w="18" w:type="dxa"/>
@@ -6328,7 +6328,7 @@
             <w:tcBorders>
               <w:top w:val="none"/>
               <w:left w:val="none"/>
-              <w:bottom w:val="single" w:sz="4" w:space="0" w:color="E2D8CE"/>
+              <w:bottom w:val="single" w:sz="4" w:space="0" w:color="D4E5E1"/>
               <w:right w:val="none"/>
             </w:tcBorders>
           </w:tcPr>
@@ -6350,7 +6350,7 @@
         <w:tc>
           <w:tcPr>
             <w:tcW w:type="dxa" w:w="2268"/>
-            <w:shd w:val="clear" w:color="auto" w:fill="FDF6F0"/>
+            <w:shd w:val="clear" w:color="auto" w:fill="F4F9F8"/>
             <w:tcMar>
               <w:top w:w="18" w:type="dxa"/>
               <w:bottom w:w="18" w:type="dxa"/>
@@ -6360,7 +6360,7 @@
             <w:tcBorders>
               <w:top w:val="none"/>
               <w:left w:val="none"/>
-              <w:bottom w:val="single" w:sz="4" w:space="0" w:color="E2D8CE"/>
+              <w:bottom w:val="single" w:sz="4" w:space="0" w:color="D4E5E1"/>
               <w:right w:val="none"/>
             </w:tcBorders>
           </w:tcPr>
@@ -6382,7 +6382,7 @@
         <w:tc>
           <w:tcPr>
             <w:tcW w:type="dxa" w:w="2268"/>
-            <w:shd w:val="clear" w:color="auto" w:fill="FDF6F0"/>
+            <w:shd w:val="clear" w:color="auto" w:fill="F4F9F8"/>
             <w:tcMar>
               <w:top w:w="18" w:type="dxa"/>
               <w:bottom w:w="18" w:type="dxa"/>
@@ -6392,7 +6392,7 @@
             <w:tcBorders>
               <w:top w:val="none"/>
               <w:left w:val="none"/>
-              <w:bottom w:val="single" w:sz="4" w:space="0" w:color="E2D8CE"/>
+              <w:bottom w:val="single" w:sz="4" w:space="0" w:color="D4E5E1"/>
               <w:right w:val="none"/>
             </w:tcBorders>
           </w:tcPr>
@@ -6429,7 +6429,7 @@
             <w:tcBorders>
               <w:top w:val="none"/>
               <w:left w:val="none"/>
-              <w:bottom w:val="single" w:sz="4" w:space="0" w:color="E2D8CE"/>
+              <w:bottom w:val="single" w:sz="4" w:space="0" w:color="D4E5E1"/>
               <w:right w:val="none"/>
             </w:tcBorders>
           </w:tcPr>
@@ -6461,7 +6461,7 @@
             <w:tcBorders>
               <w:top w:val="none"/>
               <w:left w:val="none"/>
-              <w:bottom w:val="single" w:sz="4" w:space="0" w:color="E2D8CE"/>
+              <w:bottom w:val="single" w:sz="4" w:space="0" w:color="D4E5E1"/>
               <w:right w:val="none"/>
             </w:tcBorders>
           </w:tcPr>
@@ -6493,7 +6493,7 @@
             <w:tcBorders>
               <w:top w:val="none"/>
               <w:left w:val="none"/>
-              <w:bottom w:val="single" w:sz="4" w:space="0" w:color="E2D8CE"/>
+              <w:bottom w:val="single" w:sz="4" w:space="0" w:color="D4E5E1"/>
               <w:right w:val="none"/>
             </w:tcBorders>
           </w:tcPr>
@@ -6525,7 +6525,7 @@
             <w:tcBorders>
               <w:top w:val="none"/>
               <w:left w:val="none"/>
-              <w:bottom w:val="single" w:sz="4" w:space="0" w:color="E2D8CE"/>
+              <w:bottom w:val="single" w:sz="4" w:space="0" w:color="D4E5E1"/>
               <w:right w:val="none"/>
             </w:tcBorders>
           </w:tcPr>
@@ -6562,7 +6562,7 @@
             <w:tcBorders>
               <w:top w:val="none"/>
               <w:left w:val="none"/>
-              <w:bottom w:val="single" w:sz="4" w:space="0" w:color="E2D8CE"/>
+              <w:bottom w:val="single" w:sz="4" w:space="0" w:color="D4E5E1"/>
               <w:right w:val="none"/>
             </w:tcBorders>
           </w:tcPr>
@@ -6574,7 +6574,7 @@
               <w:rPr>
                 <w:rFonts w:ascii="Arial" w:hAnsi="Arial"/>
                 <w:b/>
-                <w:color w:val="102A43"/>
+                <w:color w:val="12213A"/>
                 <w:sz w:val="16"/>
               </w:rPr>
               <w:t>Dividen Investor (40%)</w:t>
@@ -6594,7 +6594,7 @@
             <w:tcBorders>
               <w:top w:val="none"/>
               <w:left w:val="none"/>
-              <w:bottom w:val="single" w:sz="4" w:space="0" w:color="E2D8CE"/>
+              <w:bottom w:val="single" w:sz="4" w:space="0" w:color="D4E5E1"/>
               <w:right w:val="none"/>
             </w:tcBorders>
           </w:tcPr>
@@ -6606,7 +6606,7 @@
               <w:rPr>
                 <w:rFonts w:ascii="Arial" w:hAnsi="Arial"/>
                 <w:b/>
-                <w:color w:val="102A43"/>
+                <w:color w:val="12213A"/>
                 <w:sz w:val="16"/>
               </w:rPr>
               <w:t>Rp 880.000 / bulan</w:t>
@@ -6626,7 +6626,7 @@
             <w:tcBorders>
               <w:top w:val="none"/>
               <w:left w:val="none"/>
-              <w:bottom w:val="single" w:sz="4" w:space="0" w:color="E2D8CE"/>
+              <w:bottom w:val="single" w:sz="4" w:space="0" w:color="D4E5E1"/>
               <w:right w:val="none"/>
             </w:tcBorders>
           </w:tcPr>
@@ -6638,7 +6638,7 @@
               <w:rPr>
                 <w:rFonts w:ascii="Arial" w:hAnsi="Arial"/>
                 <w:b/>
-                <w:color w:val="102A43"/>
+                <w:color w:val="12213A"/>
                 <w:sz w:val="16"/>
               </w:rPr>
               <w:t>Rp 2.000.000 / bulan</w:t>
@@ -6658,7 +6658,7 @@
             <w:tcBorders>
               <w:top w:val="none"/>
               <w:left w:val="none"/>
-              <w:bottom w:val="single" w:sz="4" w:space="0" w:color="E2D8CE"/>
+              <w:bottom w:val="single" w:sz="4" w:space="0" w:color="D4E5E1"/>
               <w:right w:val="none"/>
             </w:tcBorders>
           </w:tcPr>
@@ -6670,7 +6670,7 @@
               <w:rPr>
                 <w:rFonts w:ascii="Arial" w:hAnsi="Arial"/>
                 <w:b/>
-                <w:color w:val="102A43"/>
+                <w:color w:val="12213A"/>
                 <w:sz w:val="16"/>
               </w:rPr>
               <w:t>Rp 3.200.000 / bulan</w:t>
@@ -6695,7 +6695,7 @@
             <w:tcBorders>
               <w:top w:val="none"/>
               <w:left w:val="none"/>
-              <w:bottom w:val="single" w:sz="4" w:space="0" w:color="E2D8CE"/>
+              <w:bottom w:val="single" w:sz="4" w:space="0" w:color="D4E5E1"/>
               <w:right w:val="none"/>
             </w:tcBorders>
           </w:tcPr>
@@ -6727,7 +6727,7 @@
             <w:tcBorders>
               <w:top w:val="none"/>
               <w:left w:val="none"/>
-              <w:bottom w:val="single" w:sz="4" w:space="0" w:color="E2D8CE"/>
+              <w:bottom w:val="single" w:sz="4" w:space="0" w:color="D4E5E1"/>
               <w:right w:val="none"/>
             </w:tcBorders>
           </w:tcPr>
@@ -6759,7 +6759,7 @@
             <w:tcBorders>
               <w:top w:val="none"/>
               <w:left w:val="none"/>
-              <w:bottom w:val="single" w:sz="4" w:space="0" w:color="E2D8CE"/>
+              <w:bottom w:val="single" w:sz="4" w:space="0" w:color="D4E5E1"/>
               <w:right w:val="none"/>
             </w:tcBorders>
           </w:tcPr>
@@ -6791,7 +6791,7 @@
             <w:tcBorders>
               <w:top w:val="none"/>
               <w:left w:val="none"/>
-              <w:bottom w:val="single" w:sz="4" w:space="0" w:color="E2D8CE"/>
+              <w:bottom w:val="single" w:sz="4" w:space="0" w:color="D4E5E1"/>
               <w:right w:val="none"/>
             </w:tcBorders>
           </w:tcPr>
@@ -6828,7 +6828,7 @@
             <w:tcBorders>
               <w:top w:val="none"/>
               <w:left w:val="none"/>
-              <w:bottom w:val="single" w:sz="4" w:space="0" w:color="E2D8CE"/>
+              <w:bottom w:val="single" w:sz="4" w:space="0" w:color="D4E5E1"/>
               <w:right w:val="none"/>
             </w:tcBorders>
           </w:tcPr>
@@ -6840,7 +6840,7 @@
               <w:rPr>
                 <w:rFonts w:ascii="Arial" w:hAnsi="Arial"/>
                 <w:b/>
-                <w:color w:val="102A43"/>
+                <w:color w:val="12213A"/>
                 <w:sz w:val="16"/>
               </w:rPr>
               <w:t>Waktu Balik Modal (BEP)</w:t>
@@ -6860,7 +6860,7 @@
             <w:tcBorders>
               <w:top w:val="none"/>
               <w:left w:val="none"/>
-              <w:bottom w:val="single" w:sz="4" w:space="0" w:color="E2D8CE"/>
+              <w:bottom w:val="single" w:sz="4" w:space="0" w:color="D4E5E1"/>
               <w:right w:val="none"/>
             </w:tcBorders>
           </w:tcPr>
@@ -6872,7 +6872,7 @@
               <w:rPr>
                 <w:rFonts w:ascii="Arial" w:hAnsi="Arial"/>
                 <w:b/>
-                <w:color w:val="102A43"/>
+                <w:color w:val="12213A"/>
                 <w:sz w:val="16"/>
               </w:rPr>
               <w:t>17,0 Bulan</w:t>
@@ -6892,7 +6892,7 @@
             <w:tcBorders>
               <w:top w:val="none"/>
               <w:left w:val="none"/>
-              <w:bottom w:val="single" w:sz="4" w:space="0" w:color="E2D8CE"/>
+              <w:bottom w:val="single" w:sz="4" w:space="0" w:color="D4E5E1"/>
               <w:right w:val="none"/>
             </w:tcBorders>
           </w:tcPr>
@@ -6904,7 +6904,7 @@
               <w:rPr>
                 <w:rFonts w:ascii="Arial" w:hAnsi="Arial"/>
                 <w:b/>
-                <w:color w:val="102A43"/>
+                <w:color w:val="12213A"/>
                 <w:sz w:val="16"/>
               </w:rPr>
               <w:t>7,5 Bulan (~7,5 Bulan)</w:t>
@@ -6924,7 +6924,7 @@
             <w:tcBorders>
               <w:top w:val="none"/>
               <w:left w:val="none"/>
-              <w:bottom w:val="single" w:sz="4" w:space="0" w:color="E2D8CE"/>
+              <w:bottom w:val="single" w:sz="4" w:space="0" w:color="D4E5E1"/>
               <w:right w:val="none"/>
             </w:tcBorders>
           </w:tcPr>
@@ -6936,7 +6936,7 @@
               <w:rPr>
                 <w:rFonts w:ascii="Arial" w:hAnsi="Arial"/>
                 <w:b/>
-                <w:color w:val="102A43"/>
+                <w:color w:val="12213A"/>
                 <w:sz w:val="16"/>
               </w:rPr>
               <w:t>4,7 Bulan</w:t>
@@ -6959,7 +6959,7 @@
         <w:rPr>
           <w:rFonts w:ascii="Arial" w:hAnsi="Arial"/>
           <w:b/>
-          <w:color w:val="102A43"/>
+          <w:color w:val="12213A"/>
           <w:sz w:val="26"/>
         </w:rPr>
         <w:t>6. SKEMA KEMITRAAN MUDHARABAH &amp; FORMULIR KOMITMEN</w:t>
@@ -6974,7 +6974,7 @@
         <w:rPr>
           <w:rFonts w:ascii="Arial" w:hAnsi="Arial"/>
           <w:b/>
-          <w:color w:val="A56341"/>
+          <w:color w:val="00AA91"/>
           <w:sz w:val="21"/>
         </w:rPr>
         <w:t>6.1 Struktur Penawaran Kemitraan Modal Rp 15.000.000</w:t>
@@ -7009,7 +7009,7 @@
         <w:tc>
           <w:tcPr>
             <w:tcW w:type="dxa" w:w="9694"/>
-            <w:shd w:val="clear" w:color="auto" w:fill="FDF6F0"/>
+            <w:shd w:val="clear" w:color="auto" w:fill="F4F9F8"/>
             <w:tcMar>
               <w:top w:w="65" w:type="dxa"/>
               <w:bottom w:w="65" w:type="dxa"/>
@@ -7018,7 +7018,7 @@
             </w:tcMar>
             <w:tcBorders>
               <w:top w:val="none"/>
-              <w:left w:val="single" w:sz="24" w:space="0" w:color="A56341"/>
+              <w:left w:val="single" w:sz="24" w:space="0" w:color="00AA91"/>
               <w:bottom w:val="none"/>
               <w:right w:val="none"/>
             </w:tcBorders>
@@ -7032,7 +7032,7 @@
               <w:rPr>
                 <w:rFonts w:ascii="Arial" w:hAnsi="Arial"/>
                 <w:b/>
-                <w:color w:val="102A43"/>
+                <w:color w:val="12213A"/>
                 <w:sz w:val="20"/>
               </w:rPr>
               <w:t>OPSI PARTISIPASI MODAL &amp; HAK INVESTOR</w:t>
@@ -7047,7 +7047,7 @@
               <w:rPr>
                 <w:rFonts w:ascii="Arial" w:hAnsi="Arial"/>
                 <w:b/>
-                <w:color w:val="A56341"/>
+                <w:color w:val="00AA91"/>
                 <w:sz w:val="18"/>
               </w:rPr>
               <w:t xml:space="preserve">• Pilihan Slot Permodalan: </w:t>
@@ -7070,7 +7070,7 @@
               <w:rPr>
                 <w:rFonts w:ascii="Arial" w:hAnsi="Arial"/>
                 <w:b/>
-                <w:color w:val="A56341"/>
+                <w:color w:val="00AA91"/>
                 <w:sz w:val="18"/>
               </w:rPr>
               <w:t xml:space="preserve">• Nisbah Bagi Hasil Laba Bersih: </w:t>
@@ -7093,7 +7093,7 @@
               <w:rPr>
                 <w:rFonts w:ascii="Arial" w:hAnsi="Arial"/>
                 <w:b/>
-                <w:color w:val="A56341"/>
+                <w:color w:val="00AA91"/>
                 <w:sz w:val="18"/>
               </w:rPr>
               <w:t xml:space="preserve">• Transparansi Kasir Digital: </w:t>
@@ -7116,7 +7116,7 @@
               <w:rPr>
                 <w:rFonts w:ascii="Arial" w:hAnsi="Arial"/>
                 <w:b/>
-                <w:color w:val="A56341"/>
+                <w:color w:val="00AA91"/>
                 <w:sz w:val="18"/>
               </w:rPr>
               <w:t xml:space="preserve">• Roadmap Ekspansi Bertahap: </w:t>
@@ -7147,7 +7147,7 @@
         <w:rPr>
           <w:rFonts w:ascii="Arial" w:hAnsi="Arial"/>
           <w:b/>
-          <w:color w:val="A56341"/>
+          <w:color w:val="00AA91"/>
           <w:sz w:val="21"/>
         </w:rPr>
         <w:t>6.2 Kesimpulan Eksekutif</w:t>
@@ -7178,7 +7178,7 @@
         <w:rPr>
           <w:rFonts w:ascii="Arial" w:hAnsi="Arial"/>
           <w:b/>
-          <w:color w:val="A56341"/>
+          <w:color w:val="00AA91"/>
           <w:sz w:val="21"/>
         </w:rPr>
         <w:t>6.3 Lembar Pernyataan Komitmen Kemitraan Investasi</w:t>
@@ -7222,7 +7222,7 @@
             </w:tcMar>
             <w:tcBorders>
               <w:top w:val="none"/>
-              <w:left w:val="single" w:sz="24" w:space="0" w:color="A56341"/>
+              <w:left w:val="single" w:sz="24" w:space="0" w:color="00AA91"/>
               <w:bottom w:val="none"/>
               <w:right w:val="none"/>
             </w:tcBorders>
@@ -7236,7 +7236,7 @@
               <w:rPr>
                 <w:rFonts w:ascii="Arial" w:hAnsi="Arial"/>
                 <w:b/>
-                <w:color w:val="102A43"/>
+                <w:color w:val="12213A"/>
                 <w:sz w:val="20"/>
               </w:rPr>
               <w:t>FORMULIR DATA MITRA INVESTOR</w:t>
@@ -7255,7 +7255,7 @@
               <w:rPr>
                 <w:rFonts w:ascii="Arial" w:hAnsi="Arial"/>
                 <w:b/>
-                <w:color w:val="A56341"/>
+                <w:color w:val="00AA91"/>
                 <w:sz w:val="18"/>
               </w:rPr>
               <w:t>Nama Lengkap Calon Mitra</w:t>
@@ -7285,7 +7285,7 @@
               <w:rPr>
                 <w:rFonts w:ascii="Arial" w:hAnsi="Arial"/>
                 <w:b/>
-                <w:color w:val="A56341"/>
+                <w:color w:val="00AA91"/>
                 <w:sz w:val="18"/>
               </w:rPr>
               <w:t>Nomor WhatsApp / Kontak</w:t>
@@ -7315,7 +7315,7 @@
               <w:rPr>
                 <w:rFonts w:ascii="Arial" w:hAnsi="Arial"/>
                 <w:b/>
-                <w:color w:val="A56341"/>
+                <w:color w:val="00AA91"/>
                 <w:sz w:val="18"/>
               </w:rPr>
               <w:t>Alamat / Domisili</w:t>
@@ -7345,7 +7345,7 @@
               <w:rPr>
                 <w:rFonts w:ascii="Arial" w:hAnsi="Arial"/>
                 <w:b/>
-                <w:color w:val="A56341"/>
+                <w:color w:val="00AA91"/>
                 <w:sz w:val="18"/>
               </w:rPr>
               <w:t>Pilihan Partisipasi Modal</w:t>
@@ -7375,7 +7375,7 @@
               <w:rPr>
                 <w:rFonts w:ascii="Arial" w:hAnsi="Arial"/>
                 <w:b/>
-                <w:color w:val="A56341"/>
+                <w:color w:val="00AA91"/>
                 <w:sz w:val="18"/>
               </w:rPr>
               <w:tab/>
@@ -7403,7 +7403,7 @@
               <w:rPr>
                 <w:rFonts w:ascii="Arial" w:hAnsi="Arial"/>
                 <w:b/>
-                <w:color w:val="A56341"/>
+                <w:color w:val="00AA91"/>
                 <w:sz w:val="18"/>
               </w:rPr>
               <w:tab/>
@@ -7431,7 +7431,7 @@
               <w:rPr>
                 <w:rFonts w:ascii="Arial" w:hAnsi="Arial"/>
                 <w:b/>
-                <w:color w:val="A56341"/>
+                <w:color w:val="00AA91"/>
                 <w:sz w:val="18"/>
               </w:rPr>
               <w:tab/>

</xml_diff>

<commit_message>
feat(branding): enlarge cover and Bab 1.4 logo, trim margins, and add survey assets
</commit_message>
<xml_diff>
--- a/PROPOSAL_INVESTASI_KEDAI_21.docx
+++ b/PROPOSAL_INVESTASI_KEDAI_21.docx
@@ -15,7 +15,7 @@
       <w:tr>
         <w:tc>
           <w:tcPr>
-            <w:tcW w:type="dxa" w:w="7597"/>
+            <w:tcW w:type="dxa" w:w="6917"/>
             <w:tcMar>
               <w:top w:w="0" w:type="dxa"/>
               <w:bottom w:w="0" w:type="dxa"/>
@@ -45,7 +45,7 @@
               <w:rPr>
                 <w:color w:val="12213A"/>
               </w:rPr>
-              <w:t>————————————————————————————————————————</w:t>
+              <w:t>——————————————————————————————————————</w:t>
             </w:r>
           </w:p>
           <w:p>
@@ -79,7 +79,7 @@
         </w:tc>
         <w:tc>
           <w:tcPr>
-            <w:tcW w:type="dxa" w:w="2098"/>
+            <w:tcW w:type="dxa" w:w="2778"/>
             <w:tcMar>
               <w:top w:w="0" w:type="dxa"/>
               <w:bottom w:w="0" w:type="dxa"/>
@@ -95,7 +95,7 @@
             <w:r>
               <w:drawing>
                 <wp:inline xmlns:a="http://schemas.openxmlformats.org/drawingml/2006/main" xmlns:pic="http://schemas.openxmlformats.org/drawingml/2006/picture">
-                  <wp:extent cx="1224000" cy="1224000"/>
+                  <wp:extent cx="1655999" cy="1484999"/>
                   <wp:docPr id="1" name="Picture 1"/>
                   <wp:cNvGraphicFramePr>
                     <a:graphicFrameLocks noChangeAspect="1"/>
@@ -116,7 +116,7 @@
                         <pic:spPr>
                           <a:xfrm>
                             <a:off x="0" y="0"/>
-                            <a:ext cx="1224000" cy="1224000"/>
+                            <a:ext cx="1655999" cy="1484999"/>
                           </a:xfrm>
                           <a:prstGeom prst="rect"/>
                         </pic:spPr>
@@ -132,7 +132,7 @@
     </w:tbl>
     <w:p>
       <w:pPr>
-        <w:spacing w:before="80" w:after="280"/>
+        <w:spacing w:before="80" w:after="240"/>
       </w:pPr>
       <w:r>
         <w:rPr>
@@ -147,7 +147,7 @@
     </w:p>
     <w:p>
       <w:pPr>
-        <w:spacing w:before="0" w:after="280" w:line="288" w:lineRule="auto"/>
+        <w:spacing w:before="0" w:after="240" w:line="288" w:lineRule="auto"/>
         <w:jc w:val="both"/>
       </w:pPr>
       <w:r>
@@ -777,12 +777,12 @@
       <w:tr>
         <w:tc>
           <w:tcPr>
-            <w:tcW w:type="dxa" w:w="2948"/>
+            <w:tcW w:type="dxa" w:w="3061"/>
             <w:tcMar>
               <w:top w:w="14" w:type="dxa"/>
               <w:bottom w:w="14" w:type="dxa"/>
-              <w:left w:w="25" w:type="dxa"/>
-              <w:right w:w="30" w:type="dxa"/>
+              <w:left w:w="20" w:type="dxa"/>
+              <w:right w:w="25" w:type="dxa"/>
             </w:tcMar>
             <w:shd w:val="clear" w:color="auto" w:fill="F4F9F8"/>
             <w:tcBorders>
@@ -800,7 +800,7 @@
             <w:r>
               <w:drawing>
                 <wp:inline xmlns:a="http://schemas.openxmlformats.org/drawingml/2006/main" xmlns:pic="http://schemas.openxmlformats.org/drawingml/2006/picture">
-                  <wp:extent cx="1620000" cy="1620000"/>
+                  <wp:extent cx="1728000" cy="1549565"/>
                   <wp:docPr id="2" name="Picture 2"/>
                   <wp:cNvGraphicFramePr>
                     <a:graphicFrameLocks noChangeAspect="1"/>
@@ -821,7 +821,7 @@
                         <pic:spPr>
                           <a:xfrm>
                             <a:off x="0" y="0"/>
-                            <a:ext cx="1620000" cy="1620000"/>
+                            <a:ext cx="1728000" cy="1549565"/>
                           </a:xfrm>
                           <a:prstGeom prst="rect"/>
                         </pic:spPr>
@@ -866,12 +866,12 @@
         </w:tc>
         <w:tc>
           <w:tcPr>
-            <w:tcW w:type="dxa" w:w="6746"/>
+            <w:tcW w:type="dxa" w:w="6633"/>
             <w:tcMar>
               <w:top w:w="14" w:type="dxa"/>
               <w:bottom w:w="14" w:type="dxa"/>
-              <w:left w:w="30" w:type="dxa"/>
-              <w:right w:w="25" w:type="dxa"/>
+              <w:left w:w="25" w:type="dxa"/>
+              <w:right w:w="20" w:type="dxa"/>
             </w:tcMar>
             <w:shd w:val="clear" w:color="auto" w:fill="F4F9F8"/>
             <w:tcBorders>

</xml_diff>

<commit_message>
feat(branding): replace bright green and yellow text with Deep Navy
</commit_message>
<xml_diff>
--- a/PROPOSAL_INVESTASI_KEDAI_21.docx
+++ b/PROPOSAL_INVESTASI_KEDAI_21.docx
@@ -31,7 +31,7 @@
               <w:rPr>
                 <w:rFonts w:ascii="Arial" w:hAnsi="Arial"/>
                 <w:b/>
-                <w:color w:val="00AA91"/>
+                <w:color w:val="12213A"/>
                 <w:sz w:val="17"/>
               </w:rPr>
               <w:t>PENAWARAN INVESTASI &amp; KEMITRAAN USAHA MIKRO BERBASIS LEAN STARTUP</w:t>
@@ -70,7 +70,7 @@
               <w:rPr>
                 <w:rFonts w:ascii="Arial" w:hAnsi="Arial"/>
                 <w:b/>
-                <w:color w:val="00AA91"/>
+                <w:color w:val="12213A"/>
                 <w:sz w:val="30"/>
               </w:rPr>
               <w:t>&amp; ARTISAN ANGKRINGAN RAKYAT</w:t>
@@ -139,7 +139,7 @@
           <w:rFonts w:ascii="Arial" w:hAnsi="Arial"/>
           <w:b/>
           <w:i/>
-          <w:color w:val="FEBB09"/>
+          <w:color w:val="12213A"/>
           <w:sz w:val="22"/>
         </w:rPr>
         <w:t>Tagline: "Ruang Temu Bersahaja, Seduh Cerita"</w:t>
@@ -174,7 +174,7 @@
         <w:tc>
           <w:tcPr>
             <w:tcW w:type="dxa" w:w="9694"/>
-            <w:shd w:val="clear" w:color="auto" w:fill="F4F9F8"/>
+            <w:shd w:val="clear" w:color="auto" w:fill="F4F7FB"/>
             <w:tcMar>
               <w:top w:w="65" w:type="dxa"/>
               <w:bottom w:w="65" w:type="dxa"/>
@@ -183,7 +183,7 @@
             </w:tcMar>
             <w:tcBorders>
               <w:top w:val="none"/>
-              <w:left w:val="single" w:sz="24" w:space="0" w:color="00AA91"/>
+              <w:left w:val="single" w:sz="24" w:space="0" w:color="12213A"/>
               <w:bottom w:val="none"/>
               <w:right w:val="none"/>
             </w:tcBorders>
@@ -216,7 +216,7 @@
               <w:rPr>
                 <w:rFonts w:ascii="Arial" w:hAnsi="Arial"/>
                 <w:b/>
-                <w:color w:val="00AA91"/>
+                <w:color w:val="12213A"/>
                 <w:sz w:val="18"/>
               </w:rPr>
               <w:t>• Nilai Total Permodalan Awal</w:t>
@@ -245,7 +245,7 @@
               <w:rPr>
                 <w:rFonts w:ascii="Arial" w:hAnsi="Arial"/>
                 <w:b/>
-                <w:color w:val="00AA91"/>
+                <w:color w:val="12213A"/>
                 <w:sz w:val="18"/>
               </w:rPr>
               <w:t>• Opsi Partisipasi Mitra</w:t>
@@ -274,7 +274,7 @@
               <w:rPr>
                 <w:rFonts w:ascii="Arial" w:hAnsi="Arial"/>
                 <w:b/>
-                <w:color w:val="00AA91"/>
+                <w:color w:val="12213A"/>
                 <w:sz w:val="18"/>
               </w:rPr>
               <w:t>• Alokasi Sewa Lahan Sementara</w:t>
@@ -303,7 +303,7 @@
               <w:rPr>
                 <w:rFonts w:ascii="Arial" w:hAnsi="Arial"/>
                 <w:b/>
-                <w:color w:val="00AA91"/>
+                <w:color w:val="12213A"/>
                 <w:sz w:val="18"/>
               </w:rPr>
               <w:t>• Skema Kemitraan Usaha</w:t>
@@ -332,7 +332,7 @@
               <w:rPr>
                 <w:rFonts w:ascii="Arial" w:hAnsi="Arial"/>
                 <w:b/>
-                <w:color w:val="00AA91"/>
+                <w:color w:val="12213A"/>
                 <w:sz w:val="18"/>
               </w:rPr>
               <w:t>• Proyeksi Balik Modal (BEP)</w:t>
@@ -361,7 +361,7 @@
               <w:rPr>
                 <w:rFonts w:ascii="Arial" w:hAnsi="Arial"/>
                 <w:b/>
-                <w:color w:val="00AA91"/>
+                <w:color w:val="12213A"/>
                 <w:sz w:val="18"/>
               </w:rPr>
               <w:t>• Konsep Ruang &amp; Duduk</w:t>
@@ -390,7 +390,7 @@
               <w:rPr>
                 <w:rFonts w:ascii="Arial" w:hAnsi="Arial"/>
                 <w:b/>
-                <w:color w:val="00AA91"/>
+                <w:color w:val="12213A"/>
                 <w:sz w:val="18"/>
               </w:rPr>
               <w:t>• Konsep Dapur &amp; Minuman</w:t>
@@ -419,7 +419,7 @@
               <w:rPr>
                 <w:rFonts w:ascii="Arial" w:hAnsi="Arial"/>
                 <w:b/>
-                <w:color w:val="00AA91"/>
+                <w:color w:val="12213A"/>
                 <w:sz w:val="18"/>
               </w:rPr>
               <w:t>• Lokasi Basis Operasional</w:t>
@@ -448,7 +448,7 @@
               <w:rPr>
                 <w:rFonts w:ascii="Arial" w:hAnsi="Arial"/>
                 <w:b/>
-                <w:color w:val="00AA91"/>
+                <w:color w:val="12213A"/>
                 <w:sz w:val="18"/>
               </w:rPr>
               <w:t>• Inisiator &amp; Penanggung Jawab</w:t>
@@ -523,7 +523,7 @@
         <w:rPr>
           <w:rFonts w:ascii="Arial" w:hAnsi="Arial"/>
           <w:b/>
-          <w:color w:val="00AA91"/>
+          <w:color w:val="12213A"/>
           <w:sz w:val="21"/>
         </w:rPr>
         <w:t>1.1 Mengapa Model Lean MVP Diterapkan?</w:t>
@@ -570,7 +570,7 @@
         <w:rPr>
           <w:rFonts w:ascii="Arial" w:hAnsi="Arial"/>
           <w:b/>
-          <w:color w:val="00AA91"/>
+          <w:color w:val="12213A"/>
           <w:sz w:val="21"/>
         </w:rPr>
         <w:t>1.2 Sederhana, Cepat Buka &amp; Minim Risiko</w:t>
@@ -601,7 +601,7 @@
         <w:rPr>
           <w:rFonts w:ascii="Arial" w:hAnsi="Arial"/>
           <w:b/>
-          <w:color w:val="00AA91"/>
+          <w:color w:val="12213A"/>
           <w:sz w:val="21"/>
         </w:rPr>
         <w:t>1.3 Filosofi Nama Merek "Kedai 21" — Doa dan Harapan</w:t>
@@ -620,7 +620,7 @@
         <w:tc>
           <w:tcPr>
             <w:tcW w:type="dxa" w:w="9694"/>
-            <w:shd w:val="clear" w:color="auto" w:fill="F4F9F8"/>
+            <w:shd w:val="clear" w:color="auto" w:fill="F4F7FB"/>
             <w:tcMar>
               <w:top w:w="40" w:type="dxa"/>
               <w:bottom w:w="40" w:type="dxa"/>
@@ -629,7 +629,7 @@
             </w:tcMar>
             <w:tcBorders>
               <w:top w:val="none"/>
-              <w:left w:val="single" w:sz="24" w:space="0" w:color="00AA91"/>
+              <w:left w:val="single" w:sz="24" w:space="0" w:color="12213A"/>
               <w:bottom w:val="none"/>
               <w:right w:val="none"/>
             </w:tcBorders>
@@ -658,7 +658,7 @@
               <w:rPr>
                 <w:rFonts w:ascii="Arial" w:hAnsi="Arial"/>
                 <w:b/>
-                <w:color w:val="00AA91"/>
+                <w:color w:val="12213A"/>
                 <w:sz w:val="18"/>
               </w:rPr>
               <w:t xml:space="preserve">1. Ruang Temu Bersahaja &amp; Hangat (The Welcoming Third Place): </w:t>
@@ -681,7 +681,7 @@
               <w:rPr>
                 <w:rFonts w:ascii="Arial" w:hAnsi="Arial"/>
                 <w:b/>
-                <w:color w:val="00AA91"/>
+                <w:color w:val="12213A"/>
                 <w:sz w:val="18"/>
               </w:rPr>
               <w:t xml:space="preserve">2. Kematangan &amp; Kemandirian Usaha (Maturity &amp; Growth): </w:t>
@@ -704,7 +704,7 @@
               <w:rPr>
                 <w:rFonts w:ascii="Arial" w:hAnsi="Arial"/>
                 <w:b/>
-                <w:color w:val="00AA91"/>
+                <w:color w:val="12213A"/>
                 <w:sz w:val="18"/>
               </w:rPr>
               <w:t xml:space="preserve">3. Sinergi Kemitraan Syirkah 2-in-1: </w:t>
@@ -727,7 +727,7 @@
               <w:rPr>
                 <w:rFonts w:ascii="Arial" w:hAnsi="Arial"/>
                 <w:b/>
-                <w:color w:val="00AA91"/>
+                <w:color w:val="12213A"/>
                 <w:sz w:val="18"/>
               </w:rPr>
               <w:t xml:space="preserve">4. Simpul Silaturahmi Komunitas: </w:t>
@@ -758,7 +758,7 @@
         <w:rPr>
           <w:rFonts w:ascii="Arial" w:hAnsi="Arial"/>
           <w:b/>
-          <w:color w:val="00AA91"/>
+          <w:color w:val="12213A"/>
           <w:sz w:val="21"/>
         </w:rPr>
         <w:t>1.4 Identitas Visual Merek, Palet Warna &amp; Filosofi Logo</w:t>
@@ -784,11 +784,11 @@
               <w:left w:w="20" w:type="dxa"/>
               <w:right w:w="25" w:type="dxa"/>
             </w:tcMar>
-            <w:shd w:val="clear" w:color="auto" w:fill="F4F9F8"/>
+            <w:shd w:val="clear" w:color="auto" w:fill="F4F7FB"/>
             <w:tcBorders>
-              <w:top w:val="single" w:sz="4" w:space="0" w:color="D4E5E1"/>
-              <w:left w:val="single" w:sz="20" w:space="0" w:color="00AA91"/>
-              <w:bottom w:val="single" w:sz="4" w:space="0" w:color="D4E5E1"/>
+              <w:top w:val="single" w:sz="4" w:space="0" w:color="D9E2EC"/>
+              <w:left w:val="single" w:sz="20" w:space="0" w:color="12213A"/>
+              <w:bottom w:val="single" w:sz="4" w:space="0" w:color="D9E2EC"/>
               <w:right w:val="none"/>
             </w:tcBorders>
           </w:tcPr>
@@ -849,10 +849,10 @@
             <w:r>
               <w:rPr>
                 <w:b/>
-                <w:color w:val="00AA91"/>
+                <w:color w:val="12213A"/>
                 <w:sz w:val="16"/>
               </w:rPr>
-              <w:t>Tropical Teal &amp; Deep Navy</w:t>
+              <w:t>Deep Navy &amp; Tropical Teal</w:t>
               <w:br/>
             </w:r>
             <w:r>
@@ -860,7 +860,7 @@
                 <w:color w:val="627D98"/>
                 <w:sz w:val="14"/>
               </w:rPr>
-              <w:t>#00AA91, #12213A, #FEBB09</w:t>
+              <w:t>#12213A, #00AA91, #FEBB09</w:t>
             </w:r>
           </w:p>
         </w:tc>
@@ -873,12 +873,12 @@
               <w:left w:w="25" w:type="dxa"/>
               <w:right w:w="20" w:type="dxa"/>
             </w:tcMar>
-            <w:shd w:val="clear" w:color="auto" w:fill="F4F9F8"/>
+            <w:shd w:val="clear" w:color="auto" w:fill="F4F7FB"/>
             <w:tcBorders>
-              <w:top w:val="single" w:sz="4" w:space="0" w:color="D4E5E1"/>
+              <w:top w:val="single" w:sz="4" w:space="0" w:color="D9E2EC"/>
               <w:left w:val="none"/>
-              <w:bottom w:val="single" w:sz="4" w:space="0" w:color="D4E5E1"/>
-              <w:right w:val="single" w:sz="4" w:space="0" w:color="D4E5E1"/>
+              <w:bottom w:val="single" w:sz="4" w:space="0" w:color="D9E2EC"/>
+              <w:right w:val="single" w:sz="4" w:space="0" w:color="D9E2EC"/>
             </w:tcBorders>
           </w:tcPr>
           <w:p>
@@ -889,7 +889,7 @@
             <w:r>
               <w:rPr>
                 <w:b/>
-                <w:color w:val="00AA91"/>
+                <w:color w:val="12213A"/>
                 <w:sz w:val="17"/>
               </w:rPr>
               <w:t xml:space="preserve">1. Tipografi 'KEDAI 21' Kokoh &amp; Bersahaja (Bold Typography): </w:t>
@@ -910,7 +910,7 @@
             <w:r>
               <w:rPr>
                 <w:b/>
-                <w:color w:val="00AA91"/>
+                <w:color w:val="12213A"/>
                 <w:sz w:val="17"/>
               </w:rPr>
               <w:t xml:space="preserve">2. Lengkungan Senyuman Ramah (The Welcoming Smile Arc): </w:t>
@@ -931,7 +931,7 @@
             <w:r>
               <w:rPr>
                 <w:b/>
-                <w:color w:val="00AA91"/>
+                <w:color w:val="12213A"/>
                 <w:sz w:val="17"/>
               </w:rPr>
               <w:t xml:space="preserve">3. Percikan Kilau Emas Harapan (Radiant Sparkles &amp; Optimism): </w:t>
@@ -956,7 +956,7 @@
         <w:rPr>
           <w:rFonts w:ascii="Arial" w:hAnsi="Arial"/>
           <w:b/>
-          <w:color w:val="00AA91"/>
+          <w:color w:val="12213A"/>
           <w:sz w:val="21"/>
         </w:rPr>
         <w:t>1.5 Urgensi Identitas Merek: Dampak Psikologis bagi Pengunjung</w:t>
@@ -987,7 +987,7 @@
         <w:rPr>
           <w:rFonts w:ascii="Arial" w:hAnsi="Arial"/>
           <w:b/>
-          <w:color w:val="00AA91"/>
+          <w:color w:val="12213A"/>
           <w:sz w:val="19"/>
         </w:rPr>
         <w:t xml:space="preserve">1. Rasa Aman &amp; Kepastian Mutu (Psychological Safety &amp; Trust): </w:t>
@@ -1010,7 +1010,7 @@
         <w:rPr>
           <w:rFonts w:ascii="Arial" w:hAnsi="Arial"/>
           <w:b/>
-          <w:color w:val="00AA91"/>
+          <w:color w:val="12213A"/>
           <w:sz w:val="19"/>
         </w:rPr>
         <w:t xml:space="preserve">2. Rasa Memiliki &amp; Kebanggaan Sosial (Sense of Belonging &amp; Pride): </w:t>
@@ -1033,7 +1033,7 @@
         <w:rPr>
           <w:rFonts w:ascii="Arial" w:hAnsi="Arial"/>
           <w:b/>
-          <w:color w:val="00AA91"/>
+          <w:color w:val="12213A"/>
           <w:sz w:val="19"/>
         </w:rPr>
         <w:t xml:space="preserve">3. Pembeda dari Anonimitas Pasar (Top-of-Mind Brand Recall): </w:t>
@@ -1044,7 +1044,7 @@
           <w:color w:val="243B53"/>
           <w:sz w:val="19"/>
         </w:rPr>
-        <w:t>Warna khas Tropical Teal &amp; Deep Navy serta logo Kedai 21 bertindak sebagai mercusuar visual pemandu di jalur Cikedal - Menes yang membedakannya dari lapak jalanan biasa dan mengunci loyalitas kunjungan berulang (repeat order).</w:t>
+        <w:t>Warna khas Deep Navy &amp; Tropical Teal serta logo Kedai 21 bertindak sebagai mercusuar visual pemandu di jalur Cikedal - Menes yang membedakannya dari lapak jalanan biasa dan mengunci loyalitas kunjungan berulang (repeat order).</w:t>
       </w:r>
     </w:p>
     <w:p>
@@ -1076,7 +1076,7 @@
         <w:rPr>
           <w:rFonts w:ascii="Arial" w:hAnsi="Arial"/>
           <w:b/>
-          <w:color w:val="00AA91"/>
+          <w:color w:val="12213A"/>
           <w:sz w:val="21"/>
         </w:rPr>
         <w:t>2.1 Konsep Tempat: 100% Lesehan Alas Tebal Nyaman &amp; 4 Meja Lipat Portabel</w:t>
@@ -1123,7 +1123,7 @@
         <w:rPr>
           <w:rFonts w:ascii="Arial" w:hAnsi="Arial"/>
           <w:b/>
-          <w:color w:val="00AA91"/>
+          <w:color w:val="12213A"/>
           <w:sz w:val="21"/>
         </w:rPr>
         <w:t>2.2 Zonasi Tata Ruang Lahan Terbuka (~5 × 5 Meter / 25 m²)</w:t>
@@ -1158,7 +1158,7 @@
         <w:tc>
           <w:tcPr>
             <w:tcW w:type="dxa" w:w="9694"/>
-            <w:shd w:val="clear" w:color="auto" w:fill="F4F9F8"/>
+            <w:shd w:val="clear" w:color="auto" w:fill="F4F7FB"/>
             <w:tcMar>
               <w:top w:w="65" w:type="dxa"/>
               <w:bottom w:w="65" w:type="dxa"/>
@@ -1167,7 +1167,7 @@
             </w:tcMar>
             <w:tcBorders>
               <w:top w:val="none"/>
-              <w:left w:val="single" w:sz="24" w:space="0" w:color="00AA91"/>
+              <w:left w:val="single" w:sz="24" w:space="0" w:color="12213A"/>
               <w:bottom w:val="none"/>
               <w:right w:val="none"/>
             </w:tcBorders>
@@ -1196,7 +1196,7 @@
               <w:rPr>
                 <w:rFonts w:ascii="Arial" w:hAnsi="Arial"/>
                 <w:b/>
-                <w:color w:val="00AA91"/>
+                <w:color w:val="12213A"/>
                 <w:sz w:val="18"/>
               </w:rPr>
               <w:t xml:space="preserve">• Zonasi Depan (1,5 m × 5,0 m) — Dapur Display &amp; Panggangan Arang: </w:t>
@@ -1219,7 +1219,7 @@
               <w:rPr>
                 <w:rFonts w:ascii="Arial" w:hAnsi="Arial"/>
                 <w:b/>
-                <w:color w:val="00AA91"/>
+                <w:color w:val="12213A"/>
                 <w:sz w:val="18"/>
               </w:rPr>
               <w:t xml:space="preserve">• Zonasi Tengah &amp; Belakang (3,5 m × 5,0 m) — Area Lesehan Tamu: </w:t>
@@ -1242,7 +1242,7 @@
               <w:rPr>
                 <w:rFonts w:ascii="Arial" w:hAnsi="Arial"/>
                 <w:b/>
-                <w:color w:val="00AA91"/>
+                <w:color w:val="12213A"/>
                 <w:sz w:val="18"/>
               </w:rPr>
               <w:t xml:space="preserve">• Perlindungan Cuaca (Tenda 2×6m Milik Sendiri + Atap Terpal Baru): </w:t>
@@ -1265,7 +1265,7 @@
               <w:rPr>
                 <w:rFonts w:ascii="Arial" w:hAnsi="Arial"/>
                 <w:b/>
-                <w:color w:val="00AA91"/>
+                <w:color w:val="12213A"/>
                 <w:sz w:val="18"/>
               </w:rPr>
               <w:t xml:space="preserve">• Zonasi Parkir &amp; Akses Bersih: </w:t>
@@ -1296,7 +1296,7 @@
         <w:rPr>
           <w:rFonts w:ascii="Arial" w:hAnsi="Arial"/>
           <w:b/>
-          <w:color w:val="00AA91"/>
+          <w:color w:val="12213A"/>
           <w:sz w:val="21"/>
         </w:rPr>
         <w:t>2.3 Menu Makanan Awal: Aneka Sate Frozen Food Bakar Arang &amp; Kudapan</w:t>
@@ -1359,7 +1359,7 @@
         <w:rPr>
           <w:rFonts w:ascii="Arial" w:hAnsi="Arial"/>
           <w:b/>
-          <w:color w:val="00AA91"/>
+          <w:color w:val="12213A"/>
           <w:sz w:val="21"/>
         </w:rPr>
         <w:t>2.4 Signature Menu Kopi Kedai 21 &amp; Minuman Rakyat (Ikon Minuman Usaha)</w:t>
@@ -1474,7 +1474,7 @@
         <w:rPr>
           <w:rFonts w:ascii="Arial" w:hAnsi="Arial"/>
           <w:b/>
-          <w:color w:val="00AA91"/>
+          <w:color w:val="12213A"/>
           <w:sz w:val="21"/>
         </w:rPr>
         <w:t>3.1 Segmentasi Sasaran Konsumen Koridor Cikedal - Menes</w:t>
@@ -1509,7 +1509,7 @@
         <w:tc>
           <w:tcPr>
             <w:tcW w:type="dxa" w:w="9694"/>
-            <w:shd w:val="clear" w:color="auto" w:fill="F4F9F8"/>
+            <w:shd w:val="clear" w:color="auto" w:fill="F4F7FB"/>
             <w:tcMar>
               <w:top w:w="65" w:type="dxa"/>
               <w:bottom w:w="65" w:type="dxa"/>
@@ -1518,7 +1518,7 @@
             </w:tcMar>
             <w:tcBorders>
               <w:top w:val="none"/>
-              <w:left w:val="single" w:sz="24" w:space="0" w:color="00AA91"/>
+              <w:left w:val="single" w:sz="24" w:space="0" w:color="12213A"/>
               <w:bottom w:val="none"/>
               <w:right w:val="none"/>
             </w:tcBorders>
@@ -1547,7 +1547,7 @@
               <w:rPr>
                 <w:rFonts w:ascii="Arial" w:hAnsi="Arial"/>
                 <w:b/>
-                <w:color w:val="00AA91"/>
+                <w:color w:val="12213A"/>
                 <w:sz w:val="18"/>
               </w:rPr>
               <w:t xml:space="preserve">1. Pemuda Desa &amp; Komunitas Nongkrong Lokal (40%): </w:t>
@@ -1570,7 +1570,7 @@
               <w:rPr>
                 <w:rFonts w:ascii="Arial" w:hAnsi="Arial"/>
                 <w:b/>
-                <w:color w:val="00AA91"/>
+                <w:color w:val="12213A"/>
                 <w:sz w:val="18"/>
               </w:rPr>
               <w:t xml:space="preserve">2. Santri, Alumni &amp; Pelajar Lembaga Pendidikan (25%): </w:t>
@@ -1593,7 +1593,7 @@
               <w:rPr>
                 <w:rFonts w:ascii="Arial" w:hAnsi="Arial"/>
                 <w:b/>
-                <w:color w:val="00AA91"/>
+                <w:color w:val="12213A"/>
                 <w:sz w:val="18"/>
               </w:rPr>
               <w:t xml:space="preserve">3. Pekerja Malam, Guru, Pedagang &amp; Petugas Ronda (20%): </w:t>
@@ -1616,7 +1616,7 @@
               <w:rPr>
                 <w:rFonts w:ascii="Arial" w:hAnsi="Arial"/>
                 <w:b/>
-                <w:color w:val="00AA91"/>
+                <w:color w:val="12213A"/>
                 <w:sz w:val="18"/>
               </w:rPr>
               <w:t xml:space="preserve">4. Pelintas Jalur Wisata &amp; Logistik Pantai Barat (15%): </w:t>
@@ -1647,7 +1647,7 @@
         <w:rPr>
           <w:rFonts w:ascii="Arial" w:hAnsi="Arial"/>
           <w:b/>
-          <w:color w:val="00AA91"/>
+          <w:color w:val="12213A"/>
           <w:sz w:val="21"/>
         </w:rPr>
         <w:t>3.2 Keunggulan Kompetitif Dibanding Warkop Konvensional</w:t>
@@ -1726,7 +1726,7 @@
         <w:rPr>
           <w:rFonts w:ascii="Arial" w:hAnsi="Arial"/>
           <w:b/>
-          <w:color w:val="00AA91"/>
+          <w:color w:val="12213A"/>
           <w:sz w:val="21"/>
         </w:rPr>
         <w:t>3.3 Waktu Operasional &amp; Pola Layanan</w:t>
@@ -1793,7 +1793,7 @@
         <w:rPr>
           <w:rFonts w:ascii="Arial" w:hAnsi="Arial"/>
           <w:b/>
-          <w:color w:val="00AA91"/>
+          <w:color w:val="12213A"/>
           <w:sz w:val="21"/>
         </w:rPr>
         <w:t>4.1 Tabel Rincian Belanja Modal Awal (Tepat Rp 15.000.000)</w:t>
@@ -1928,7 +1928,7 @@
         <w:tc>
           <w:tcPr>
             <w:tcW w:type="dxa" w:w="2721"/>
-            <w:shd w:val="clear" w:color="auto" w:fill="F4F9F8"/>
+            <w:shd w:val="clear" w:color="auto" w:fill="F4F7FB"/>
             <w:tcMar>
               <w:top w:w="32" w:type="dxa"/>
               <w:bottom w:w="32" w:type="dxa"/>
@@ -1938,7 +1938,7 @@
             <w:tcBorders>
               <w:top w:val="none"/>
               <w:left w:val="none"/>
-              <w:bottom w:val="single" w:sz="4" w:space="0" w:color="D4E5E1"/>
+              <w:bottom w:val="single" w:sz="4" w:space="0" w:color="D9E2EC"/>
               <w:right w:val="none"/>
             </w:tcBorders>
           </w:tcPr>
@@ -1960,7 +1960,7 @@
         <w:tc>
           <w:tcPr>
             <w:tcW w:type="dxa" w:w="3685"/>
-            <w:shd w:val="clear" w:color="auto" w:fill="F4F9F8"/>
+            <w:shd w:val="clear" w:color="auto" w:fill="F4F7FB"/>
             <w:tcMar>
               <w:top w:w="32" w:type="dxa"/>
               <w:bottom w:w="32" w:type="dxa"/>
@@ -1970,7 +1970,7 @@
             <w:tcBorders>
               <w:top w:val="none"/>
               <w:left w:val="none"/>
-              <w:bottom w:val="single" w:sz="4" w:space="0" w:color="D4E5E1"/>
+              <w:bottom w:val="single" w:sz="4" w:space="0" w:color="D9E2EC"/>
               <w:right w:val="none"/>
             </w:tcBorders>
           </w:tcPr>
@@ -1991,7 +1991,7 @@
         <w:tc>
           <w:tcPr>
             <w:tcW w:type="dxa" w:w="1247"/>
-            <w:shd w:val="clear" w:color="auto" w:fill="F4F9F8"/>
+            <w:shd w:val="clear" w:color="auto" w:fill="F4F7FB"/>
             <w:tcMar>
               <w:top w:w="32" w:type="dxa"/>
               <w:bottom w:w="32" w:type="dxa"/>
@@ -2001,7 +2001,7 @@
             <w:tcBorders>
               <w:top w:val="none"/>
               <w:left w:val="none"/>
-              <w:bottom w:val="single" w:sz="4" w:space="0" w:color="D4E5E1"/>
+              <w:bottom w:val="single" w:sz="4" w:space="0" w:color="D9E2EC"/>
               <w:right w:val="none"/>
             </w:tcBorders>
           </w:tcPr>
@@ -2022,7 +2022,7 @@
         <w:tc>
           <w:tcPr>
             <w:tcW w:type="dxa" w:w="2041"/>
-            <w:shd w:val="clear" w:color="auto" w:fill="F4F9F8"/>
+            <w:shd w:val="clear" w:color="auto" w:fill="F4F7FB"/>
             <w:tcMar>
               <w:top w:w="32" w:type="dxa"/>
               <w:bottom w:w="32" w:type="dxa"/>
@@ -2032,7 +2032,7 @@
             <w:tcBorders>
               <w:top w:val="none"/>
               <w:left w:val="none"/>
-              <w:bottom w:val="single" w:sz="4" w:space="0" w:color="D4E5E1"/>
+              <w:bottom w:val="single" w:sz="4" w:space="0" w:color="D9E2EC"/>
               <w:right w:val="none"/>
             </w:tcBorders>
           </w:tcPr>
@@ -2068,7 +2068,7 @@
             <w:tcBorders>
               <w:top w:val="none"/>
               <w:left w:val="none"/>
-              <w:bottom w:val="single" w:sz="4" w:space="0" w:color="D4E5E1"/>
+              <w:bottom w:val="single" w:sz="4" w:space="0" w:color="D9E2EC"/>
               <w:right w:val="none"/>
             </w:tcBorders>
           </w:tcPr>
@@ -2100,7 +2100,7 @@
             <w:tcBorders>
               <w:top w:val="none"/>
               <w:left w:val="none"/>
-              <w:bottom w:val="single" w:sz="4" w:space="0" w:color="D4E5E1"/>
+              <w:bottom w:val="single" w:sz="4" w:space="0" w:color="D9E2EC"/>
               <w:right w:val="none"/>
             </w:tcBorders>
           </w:tcPr>
@@ -2131,7 +2131,7 @@
             <w:tcBorders>
               <w:top w:val="none"/>
               <w:left w:val="none"/>
-              <w:bottom w:val="single" w:sz="4" w:space="0" w:color="D4E5E1"/>
+              <w:bottom w:val="single" w:sz="4" w:space="0" w:color="D9E2EC"/>
               <w:right w:val="none"/>
             </w:tcBorders>
           </w:tcPr>
@@ -2162,7 +2162,7 @@
             <w:tcBorders>
               <w:top w:val="none"/>
               <w:left w:val="none"/>
-              <w:bottom w:val="single" w:sz="4" w:space="0" w:color="D4E5E1"/>
+              <w:bottom w:val="single" w:sz="4" w:space="0" w:color="D9E2EC"/>
               <w:right w:val="none"/>
             </w:tcBorders>
           </w:tcPr>
@@ -2188,7 +2188,7 @@
         <w:tc>
           <w:tcPr>
             <w:tcW w:type="dxa" w:w="2721"/>
-            <w:shd w:val="clear" w:color="auto" w:fill="F4F9F8"/>
+            <w:shd w:val="clear" w:color="auto" w:fill="F4F7FB"/>
             <w:tcMar>
               <w:top w:w="32" w:type="dxa"/>
               <w:bottom w:w="32" w:type="dxa"/>
@@ -2198,7 +2198,7 @@
             <w:tcBorders>
               <w:top w:val="none"/>
               <w:left w:val="none"/>
-              <w:bottom w:val="single" w:sz="4" w:space="0" w:color="D4E5E1"/>
+              <w:bottom w:val="single" w:sz="4" w:space="0" w:color="D9E2EC"/>
               <w:right w:val="none"/>
             </w:tcBorders>
           </w:tcPr>
@@ -2220,7 +2220,7 @@
         <w:tc>
           <w:tcPr>
             <w:tcW w:type="dxa" w:w="3685"/>
-            <w:shd w:val="clear" w:color="auto" w:fill="F4F9F8"/>
+            <w:shd w:val="clear" w:color="auto" w:fill="F4F7FB"/>
             <w:tcMar>
               <w:top w:w="32" w:type="dxa"/>
               <w:bottom w:w="32" w:type="dxa"/>
@@ -2230,7 +2230,7 @@
             <w:tcBorders>
               <w:top w:val="none"/>
               <w:left w:val="none"/>
-              <w:bottom w:val="single" w:sz="4" w:space="0" w:color="D4E5E1"/>
+              <w:bottom w:val="single" w:sz="4" w:space="0" w:color="D9E2EC"/>
               <w:right w:val="none"/>
             </w:tcBorders>
           </w:tcPr>
@@ -2251,7 +2251,7 @@
         <w:tc>
           <w:tcPr>
             <w:tcW w:type="dxa" w:w="1247"/>
-            <w:shd w:val="clear" w:color="auto" w:fill="F4F9F8"/>
+            <w:shd w:val="clear" w:color="auto" w:fill="F4F7FB"/>
             <w:tcMar>
               <w:top w:w="32" w:type="dxa"/>
               <w:bottom w:w="32" w:type="dxa"/>
@@ -2261,7 +2261,7 @@
             <w:tcBorders>
               <w:top w:val="none"/>
               <w:left w:val="none"/>
-              <w:bottom w:val="single" w:sz="4" w:space="0" w:color="D4E5E1"/>
+              <w:bottom w:val="single" w:sz="4" w:space="0" w:color="D9E2EC"/>
               <w:right w:val="none"/>
             </w:tcBorders>
           </w:tcPr>
@@ -2282,7 +2282,7 @@
         <w:tc>
           <w:tcPr>
             <w:tcW w:type="dxa" w:w="2041"/>
-            <w:shd w:val="clear" w:color="auto" w:fill="F4F9F8"/>
+            <w:shd w:val="clear" w:color="auto" w:fill="F4F7FB"/>
             <w:tcMar>
               <w:top w:w="32" w:type="dxa"/>
               <w:bottom w:w="32" w:type="dxa"/>
@@ -2292,7 +2292,7 @@
             <w:tcBorders>
               <w:top w:val="none"/>
               <w:left w:val="none"/>
-              <w:bottom w:val="single" w:sz="4" w:space="0" w:color="D4E5E1"/>
+              <w:bottom w:val="single" w:sz="4" w:space="0" w:color="D9E2EC"/>
               <w:right w:val="none"/>
             </w:tcBorders>
           </w:tcPr>
@@ -2328,7 +2328,7 @@
             <w:tcBorders>
               <w:top w:val="none"/>
               <w:left w:val="none"/>
-              <w:bottom w:val="single" w:sz="4" w:space="0" w:color="D4E5E1"/>
+              <w:bottom w:val="single" w:sz="4" w:space="0" w:color="D9E2EC"/>
               <w:right w:val="none"/>
             </w:tcBorders>
           </w:tcPr>
@@ -2360,7 +2360,7 @@
             <w:tcBorders>
               <w:top w:val="none"/>
               <w:left w:val="none"/>
-              <w:bottom w:val="single" w:sz="4" w:space="0" w:color="D4E5E1"/>
+              <w:bottom w:val="single" w:sz="4" w:space="0" w:color="D9E2EC"/>
               <w:right w:val="none"/>
             </w:tcBorders>
           </w:tcPr>
@@ -2391,7 +2391,7 @@
             <w:tcBorders>
               <w:top w:val="none"/>
               <w:left w:val="none"/>
-              <w:bottom w:val="single" w:sz="4" w:space="0" w:color="D4E5E1"/>
+              <w:bottom w:val="single" w:sz="4" w:space="0" w:color="D9E2EC"/>
               <w:right w:val="none"/>
             </w:tcBorders>
           </w:tcPr>
@@ -2422,7 +2422,7 @@
             <w:tcBorders>
               <w:top w:val="none"/>
               <w:left w:val="none"/>
-              <w:bottom w:val="single" w:sz="4" w:space="0" w:color="D4E5E1"/>
+              <w:bottom w:val="single" w:sz="4" w:space="0" w:color="D9E2EC"/>
               <w:right w:val="none"/>
             </w:tcBorders>
           </w:tcPr>
@@ -2448,7 +2448,7 @@
         <w:tc>
           <w:tcPr>
             <w:tcW w:type="dxa" w:w="2721"/>
-            <w:shd w:val="clear" w:color="auto" w:fill="F4F9F8"/>
+            <w:shd w:val="clear" w:color="auto" w:fill="F4F7FB"/>
             <w:tcMar>
               <w:top w:w="32" w:type="dxa"/>
               <w:bottom w:w="32" w:type="dxa"/>
@@ -2458,7 +2458,7 @@
             <w:tcBorders>
               <w:top w:val="none"/>
               <w:left w:val="none"/>
-              <w:bottom w:val="single" w:sz="4" w:space="0" w:color="D4E5E1"/>
+              <w:bottom w:val="single" w:sz="4" w:space="0" w:color="D9E2EC"/>
               <w:right w:val="none"/>
             </w:tcBorders>
           </w:tcPr>
@@ -2480,7 +2480,7 @@
         <w:tc>
           <w:tcPr>
             <w:tcW w:type="dxa" w:w="3685"/>
-            <w:shd w:val="clear" w:color="auto" w:fill="F4F9F8"/>
+            <w:shd w:val="clear" w:color="auto" w:fill="F4F7FB"/>
             <w:tcMar>
               <w:top w:w="32" w:type="dxa"/>
               <w:bottom w:w="32" w:type="dxa"/>
@@ -2490,7 +2490,7 @@
             <w:tcBorders>
               <w:top w:val="none"/>
               <w:left w:val="none"/>
-              <w:bottom w:val="single" w:sz="4" w:space="0" w:color="D4E5E1"/>
+              <w:bottom w:val="single" w:sz="4" w:space="0" w:color="D9E2EC"/>
               <w:right w:val="none"/>
             </w:tcBorders>
           </w:tcPr>
@@ -2511,7 +2511,7 @@
         <w:tc>
           <w:tcPr>
             <w:tcW w:type="dxa" w:w="1247"/>
-            <w:shd w:val="clear" w:color="auto" w:fill="F4F9F8"/>
+            <w:shd w:val="clear" w:color="auto" w:fill="F4F7FB"/>
             <w:tcMar>
               <w:top w:w="32" w:type="dxa"/>
               <w:bottom w:w="32" w:type="dxa"/>
@@ -2521,7 +2521,7 @@
             <w:tcBorders>
               <w:top w:val="none"/>
               <w:left w:val="none"/>
-              <w:bottom w:val="single" w:sz="4" w:space="0" w:color="D4E5E1"/>
+              <w:bottom w:val="single" w:sz="4" w:space="0" w:color="D9E2EC"/>
               <w:right w:val="none"/>
             </w:tcBorders>
           </w:tcPr>
@@ -2542,7 +2542,7 @@
         <w:tc>
           <w:tcPr>
             <w:tcW w:type="dxa" w:w="2041"/>
-            <w:shd w:val="clear" w:color="auto" w:fill="F4F9F8"/>
+            <w:shd w:val="clear" w:color="auto" w:fill="F4F7FB"/>
             <w:tcMar>
               <w:top w:w="32" w:type="dxa"/>
               <w:bottom w:w="32" w:type="dxa"/>
@@ -2552,7 +2552,7 @@
             <w:tcBorders>
               <w:top w:val="none"/>
               <w:left w:val="none"/>
-              <w:bottom w:val="single" w:sz="4" w:space="0" w:color="D4E5E1"/>
+              <w:bottom w:val="single" w:sz="4" w:space="0" w:color="D9E2EC"/>
               <w:right w:val="none"/>
             </w:tcBorders>
           </w:tcPr>
@@ -2588,7 +2588,7 @@
             <w:tcBorders>
               <w:top w:val="none"/>
               <w:left w:val="none"/>
-              <w:bottom w:val="single" w:sz="4" w:space="0" w:color="D4E5E1"/>
+              <w:bottom w:val="single" w:sz="4" w:space="0" w:color="D9E2EC"/>
               <w:right w:val="none"/>
             </w:tcBorders>
           </w:tcPr>
@@ -2620,7 +2620,7 @@
             <w:tcBorders>
               <w:top w:val="none"/>
               <w:left w:val="none"/>
-              <w:bottom w:val="single" w:sz="4" w:space="0" w:color="D4E5E1"/>
+              <w:bottom w:val="single" w:sz="4" w:space="0" w:color="D9E2EC"/>
               <w:right w:val="none"/>
             </w:tcBorders>
           </w:tcPr>
@@ -2651,7 +2651,7 @@
             <w:tcBorders>
               <w:top w:val="none"/>
               <w:left w:val="none"/>
-              <w:bottom w:val="single" w:sz="4" w:space="0" w:color="D4E5E1"/>
+              <w:bottom w:val="single" w:sz="4" w:space="0" w:color="D9E2EC"/>
               <w:right w:val="none"/>
             </w:tcBorders>
           </w:tcPr>
@@ -2682,7 +2682,7 @@
             <w:tcBorders>
               <w:top w:val="none"/>
               <w:left w:val="none"/>
-              <w:bottom w:val="single" w:sz="4" w:space="0" w:color="D4E5E1"/>
+              <w:bottom w:val="single" w:sz="4" w:space="0" w:color="D9E2EC"/>
               <w:right w:val="none"/>
             </w:tcBorders>
           </w:tcPr>
@@ -2708,7 +2708,7 @@
         <w:tc>
           <w:tcPr>
             <w:tcW w:type="dxa" w:w="2721"/>
-            <w:shd w:val="clear" w:color="auto" w:fill="F4F9F8"/>
+            <w:shd w:val="clear" w:color="auto" w:fill="F4F7FB"/>
             <w:tcMar>
               <w:top w:w="32" w:type="dxa"/>
               <w:bottom w:w="32" w:type="dxa"/>
@@ -2718,7 +2718,7 @@
             <w:tcBorders>
               <w:top w:val="none"/>
               <w:left w:val="none"/>
-              <w:bottom w:val="single" w:sz="4" w:space="0" w:color="D4E5E1"/>
+              <w:bottom w:val="single" w:sz="4" w:space="0" w:color="D9E2EC"/>
               <w:right w:val="none"/>
             </w:tcBorders>
           </w:tcPr>
@@ -2740,7 +2740,7 @@
         <w:tc>
           <w:tcPr>
             <w:tcW w:type="dxa" w:w="3685"/>
-            <w:shd w:val="clear" w:color="auto" w:fill="F4F9F8"/>
+            <w:shd w:val="clear" w:color="auto" w:fill="F4F7FB"/>
             <w:tcMar>
               <w:top w:w="32" w:type="dxa"/>
               <w:bottom w:w="32" w:type="dxa"/>
@@ -2750,7 +2750,7 @@
             <w:tcBorders>
               <w:top w:val="none"/>
               <w:left w:val="none"/>
-              <w:bottom w:val="single" w:sz="4" w:space="0" w:color="D4E5E1"/>
+              <w:bottom w:val="single" w:sz="4" w:space="0" w:color="D9E2EC"/>
               <w:right w:val="none"/>
             </w:tcBorders>
           </w:tcPr>
@@ -2771,7 +2771,7 @@
         <w:tc>
           <w:tcPr>
             <w:tcW w:type="dxa" w:w="1247"/>
-            <w:shd w:val="clear" w:color="auto" w:fill="F4F9F8"/>
+            <w:shd w:val="clear" w:color="auto" w:fill="F4F7FB"/>
             <w:tcMar>
               <w:top w:w="32" w:type="dxa"/>
               <w:bottom w:w="32" w:type="dxa"/>
@@ -2781,7 +2781,7 @@
             <w:tcBorders>
               <w:top w:val="none"/>
               <w:left w:val="none"/>
-              <w:bottom w:val="single" w:sz="4" w:space="0" w:color="D4E5E1"/>
+              <w:bottom w:val="single" w:sz="4" w:space="0" w:color="D9E2EC"/>
               <w:right w:val="none"/>
             </w:tcBorders>
           </w:tcPr>
@@ -2802,7 +2802,7 @@
         <w:tc>
           <w:tcPr>
             <w:tcW w:type="dxa" w:w="2041"/>
-            <w:shd w:val="clear" w:color="auto" w:fill="F4F9F8"/>
+            <w:shd w:val="clear" w:color="auto" w:fill="F4F7FB"/>
             <w:tcMar>
               <w:top w:w="32" w:type="dxa"/>
               <w:bottom w:w="32" w:type="dxa"/>
@@ -2812,7 +2812,7 @@
             <w:tcBorders>
               <w:top w:val="none"/>
               <w:left w:val="none"/>
-              <w:bottom w:val="single" w:sz="4" w:space="0" w:color="D4E5E1"/>
+              <w:bottom w:val="single" w:sz="4" w:space="0" w:color="D9E2EC"/>
               <w:right w:val="none"/>
             </w:tcBorders>
           </w:tcPr>
@@ -2848,7 +2848,7 @@
             <w:tcBorders>
               <w:top w:val="none"/>
               <w:left w:val="none"/>
-              <w:bottom w:val="single" w:sz="4" w:space="0" w:color="D4E5E1"/>
+              <w:bottom w:val="single" w:sz="4" w:space="0" w:color="D9E2EC"/>
               <w:right w:val="none"/>
             </w:tcBorders>
           </w:tcPr>
@@ -2880,7 +2880,7 @@
             <w:tcBorders>
               <w:top w:val="none"/>
               <w:left w:val="none"/>
-              <w:bottom w:val="single" w:sz="4" w:space="0" w:color="D4E5E1"/>
+              <w:bottom w:val="single" w:sz="4" w:space="0" w:color="D9E2EC"/>
               <w:right w:val="none"/>
             </w:tcBorders>
           </w:tcPr>
@@ -2911,7 +2911,7 @@
             <w:tcBorders>
               <w:top w:val="none"/>
               <w:left w:val="none"/>
-              <w:bottom w:val="single" w:sz="4" w:space="0" w:color="D4E5E1"/>
+              <w:bottom w:val="single" w:sz="4" w:space="0" w:color="D9E2EC"/>
               <w:right w:val="none"/>
             </w:tcBorders>
           </w:tcPr>
@@ -2942,7 +2942,7 @@
             <w:tcBorders>
               <w:top w:val="none"/>
               <w:left w:val="none"/>
-              <w:bottom w:val="single" w:sz="4" w:space="0" w:color="D4E5E1"/>
+              <w:bottom w:val="single" w:sz="4" w:space="0" w:color="D9E2EC"/>
               <w:right w:val="none"/>
             </w:tcBorders>
           </w:tcPr>
@@ -2968,7 +2968,7 @@
         <w:tc>
           <w:tcPr>
             <w:tcW w:type="dxa" w:w="2721"/>
-            <w:shd w:val="clear" w:color="auto" w:fill="F4F9F8"/>
+            <w:shd w:val="clear" w:color="auto" w:fill="F4F7FB"/>
             <w:tcMar>
               <w:top w:w="32" w:type="dxa"/>
               <w:bottom w:w="32" w:type="dxa"/>
@@ -2978,7 +2978,7 @@
             <w:tcBorders>
               <w:top w:val="none"/>
               <w:left w:val="none"/>
-              <w:bottom w:val="single" w:sz="4" w:space="0" w:color="D4E5E1"/>
+              <w:bottom w:val="single" w:sz="4" w:space="0" w:color="D9E2EC"/>
               <w:right w:val="none"/>
             </w:tcBorders>
           </w:tcPr>
@@ -3000,7 +3000,7 @@
         <w:tc>
           <w:tcPr>
             <w:tcW w:type="dxa" w:w="3685"/>
-            <w:shd w:val="clear" w:color="auto" w:fill="F4F9F8"/>
+            <w:shd w:val="clear" w:color="auto" w:fill="F4F7FB"/>
             <w:tcMar>
               <w:top w:w="32" w:type="dxa"/>
               <w:bottom w:w="32" w:type="dxa"/>
@@ -3010,7 +3010,7 @@
             <w:tcBorders>
               <w:top w:val="none"/>
               <w:left w:val="none"/>
-              <w:bottom w:val="single" w:sz="4" w:space="0" w:color="D4E5E1"/>
+              <w:bottom w:val="single" w:sz="4" w:space="0" w:color="D9E2EC"/>
               <w:right w:val="none"/>
             </w:tcBorders>
           </w:tcPr>
@@ -3031,7 +3031,7 @@
         <w:tc>
           <w:tcPr>
             <w:tcW w:type="dxa" w:w="1247"/>
-            <w:shd w:val="clear" w:color="auto" w:fill="F4F9F8"/>
+            <w:shd w:val="clear" w:color="auto" w:fill="F4F7FB"/>
             <w:tcMar>
               <w:top w:w="32" w:type="dxa"/>
               <w:bottom w:w="32" w:type="dxa"/>
@@ -3041,7 +3041,7 @@
             <w:tcBorders>
               <w:top w:val="none"/>
               <w:left w:val="none"/>
-              <w:bottom w:val="single" w:sz="4" w:space="0" w:color="D4E5E1"/>
+              <w:bottom w:val="single" w:sz="4" w:space="0" w:color="D9E2EC"/>
               <w:right w:val="none"/>
             </w:tcBorders>
           </w:tcPr>
@@ -3062,7 +3062,7 @@
         <w:tc>
           <w:tcPr>
             <w:tcW w:type="dxa" w:w="2041"/>
-            <w:shd w:val="clear" w:color="auto" w:fill="F4F9F8"/>
+            <w:shd w:val="clear" w:color="auto" w:fill="F4F7FB"/>
             <w:tcMar>
               <w:top w:w="32" w:type="dxa"/>
               <w:bottom w:w="32" w:type="dxa"/>
@@ -3072,7 +3072,7 @@
             <w:tcBorders>
               <w:top w:val="none"/>
               <w:left w:val="none"/>
-              <w:bottom w:val="single" w:sz="4" w:space="0" w:color="D4E5E1"/>
+              <w:bottom w:val="single" w:sz="4" w:space="0" w:color="D9E2EC"/>
               <w:right w:val="none"/>
             </w:tcBorders>
           </w:tcPr>
@@ -3106,9 +3106,9 @@
               <w:right w:w="80" w:type="dxa"/>
             </w:tcMar>
             <w:tcBorders>
-              <w:top w:val="single" w:sz="12" w:space="0" w:color="00AA91"/>
+              <w:top w:val="single" w:sz="12" w:space="0" w:color="12213A"/>
               <w:left w:val="none"/>
-              <w:bottom w:val="single" w:sz="12" w:space="0" w:color="00AA91"/>
+              <w:bottom w:val="single" w:sz="12" w:space="0" w:color="12213A"/>
               <w:right w:val="none"/>
             </w:tcBorders>
           </w:tcPr>
@@ -3138,9 +3138,9 @@
               <w:right w:w="80" w:type="dxa"/>
             </w:tcMar>
             <w:tcBorders>
-              <w:top w:val="single" w:sz="12" w:space="0" w:color="00AA91"/>
+              <w:top w:val="single" w:sz="12" w:space="0" w:color="12213A"/>
               <w:left w:val="none"/>
-              <w:bottom w:val="single" w:sz="12" w:space="0" w:color="00AA91"/>
+              <w:bottom w:val="single" w:sz="12" w:space="0" w:color="12213A"/>
               <w:right w:val="none"/>
             </w:tcBorders>
           </w:tcPr>
@@ -3157,9 +3157,9 @@
               <w:right w:w="80" w:type="dxa"/>
             </w:tcMar>
             <w:tcBorders>
-              <w:top w:val="single" w:sz="12" w:space="0" w:color="00AA91"/>
+              <w:top w:val="single" w:sz="12" w:space="0" w:color="12213A"/>
               <w:left w:val="none"/>
-              <w:bottom w:val="single" w:sz="12" w:space="0" w:color="00AA91"/>
+              <w:bottom w:val="single" w:sz="12" w:space="0" w:color="12213A"/>
               <w:right w:val="none"/>
             </w:tcBorders>
           </w:tcPr>
@@ -3176,9 +3176,9 @@
               <w:right w:w="80" w:type="dxa"/>
             </w:tcMar>
             <w:tcBorders>
-              <w:top w:val="single" w:sz="12" w:space="0" w:color="00AA91"/>
+              <w:top w:val="single" w:sz="12" w:space="0" w:color="12213A"/>
               <w:left w:val="none"/>
-              <w:bottom w:val="single" w:sz="12" w:space="0" w:color="00AA91"/>
+              <w:bottom w:val="single" w:sz="12" w:space="0" w:color="12213A"/>
               <w:right w:val="none"/>
             </w:tcBorders>
           </w:tcPr>
@@ -3228,7 +3228,7 @@
         <w:rPr>
           <w:rFonts w:ascii="Arial" w:hAnsi="Arial"/>
           <w:b/>
-          <w:color w:val="00AA91"/>
+          <w:color w:val="12213A"/>
           <w:sz w:val="21"/>
         </w:rPr>
         <w:t>5.1 Rincian HPP dan Margin Keuntungan Menu Kunci</w:t>
@@ -3406,7 +3406,7 @@
         <w:tc>
           <w:tcPr>
             <w:tcW w:type="dxa" w:w="2438"/>
-            <w:shd w:val="clear" w:color="auto" w:fill="F4F9F8"/>
+            <w:shd w:val="clear" w:color="auto" w:fill="F4F7FB"/>
             <w:tcMar>
               <w:top w:w="16" w:type="dxa"/>
               <w:bottom w:w="16" w:type="dxa"/>
@@ -3416,7 +3416,7 @@
             <w:tcBorders>
               <w:top w:val="none"/>
               <w:left w:val="none"/>
-              <w:bottom w:val="single" w:sz="4" w:space="0" w:color="D4E5E1"/>
+              <w:bottom w:val="single" w:sz="4" w:space="0" w:color="D9E2EC"/>
               <w:right w:val="none"/>
             </w:tcBorders>
           </w:tcPr>
@@ -3428,7 +3428,7 @@
               <w:rPr>
                 <w:rFonts w:ascii="Arial" w:hAnsi="Arial"/>
                 <w:b/>
-                <w:color w:val="243B53"/>
+                <w:color w:val="12213A"/>
                 <w:sz w:val="15"/>
               </w:rPr>
               <w:t>Sosis Bakar Sapi/Ayam (Saus BBQ &amp; Mayo)</w:t>
@@ -3438,7 +3438,7 @@
         <w:tc>
           <w:tcPr>
             <w:tcW w:type="dxa" w:w="3175"/>
-            <w:shd w:val="clear" w:color="auto" w:fill="F4F9F8"/>
+            <w:shd w:val="clear" w:color="auto" w:fill="F4F7FB"/>
             <w:tcMar>
               <w:top w:w="16" w:type="dxa"/>
               <w:bottom w:w="16" w:type="dxa"/>
@@ -3448,7 +3448,7 @@
             <w:tcBorders>
               <w:top w:val="none"/>
               <w:left w:val="none"/>
-              <w:bottom w:val="single" w:sz="4" w:space="0" w:color="D4E5E1"/>
+              <w:bottom w:val="single" w:sz="4" w:space="0" w:color="D9E2EC"/>
               <w:right w:val="none"/>
             </w:tcBorders>
           </w:tcPr>
@@ -3469,7 +3469,7 @@
         <w:tc>
           <w:tcPr>
             <w:tcW w:type="dxa" w:w="1247"/>
-            <w:shd w:val="clear" w:color="auto" w:fill="F4F9F8"/>
+            <w:shd w:val="clear" w:color="auto" w:fill="F4F7FB"/>
             <w:tcMar>
               <w:top w:w="16" w:type="dxa"/>
               <w:bottom w:w="16" w:type="dxa"/>
@@ -3479,7 +3479,7 @@
             <w:tcBorders>
               <w:top w:val="none"/>
               <w:left w:val="none"/>
-              <w:bottom w:val="single" w:sz="4" w:space="0" w:color="D4E5E1"/>
+              <w:bottom w:val="single" w:sz="4" w:space="0" w:color="D9E2EC"/>
               <w:right w:val="none"/>
             </w:tcBorders>
           </w:tcPr>
@@ -3500,7 +3500,7 @@
         <w:tc>
           <w:tcPr>
             <w:tcW w:type="dxa" w:w="1247"/>
-            <w:shd w:val="clear" w:color="auto" w:fill="F4F9F8"/>
+            <w:shd w:val="clear" w:color="auto" w:fill="F4F7FB"/>
             <w:tcMar>
               <w:top w:w="16" w:type="dxa"/>
               <w:bottom w:w="16" w:type="dxa"/>
@@ -3510,7 +3510,7 @@
             <w:tcBorders>
               <w:top w:val="none"/>
               <w:left w:val="none"/>
-              <w:bottom w:val="single" w:sz="4" w:space="0" w:color="D4E5E1"/>
+              <w:bottom w:val="single" w:sz="4" w:space="0" w:color="D9E2EC"/>
               <w:right w:val="none"/>
             </w:tcBorders>
           </w:tcPr>
@@ -3531,7 +3531,7 @@
         <w:tc>
           <w:tcPr>
             <w:tcW w:type="dxa" w:w="1587"/>
-            <w:shd w:val="clear" w:color="auto" w:fill="F4F9F8"/>
+            <w:shd w:val="clear" w:color="auto" w:fill="F4F7FB"/>
             <w:tcMar>
               <w:top w:w="16" w:type="dxa"/>
               <w:bottom w:w="16" w:type="dxa"/>
@@ -3541,7 +3541,7 @@
             <w:tcBorders>
               <w:top w:val="none"/>
               <w:left w:val="none"/>
-              <w:bottom w:val="single" w:sz="4" w:space="0" w:color="D4E5E1"/>
+              <w:bottom w:val="single" w:sz="4" w:space="0" w:color="D9E2EC"/>
               <w:right w:val="none"/>
             </w:tcBorders>
           </w:tcPr>
@@ -3553,7 +3553,7 @@
               <w:rPr>
                 <w:rFonts w:ascii="Arial" w:hAnsi="Arial"/>
                 <w:b/>
-                <w:color w:val="166534"/>
+                <w:color w:val="12213A"/>
                 <w:sz w:val="15"/>
               </w:rPr>
               <w:t>Rp 1.400 (46,7%)</w:t>
@@ -3578,7 +3578,7 @@
             <w:tcBorders>
               <w:top w:val="none"/>
               <w:left w:val="none"/>
-              <w:bottom w:val="single" w:sz="4" w:space="0" w:color="D4E5E1"/>
+              <w:bottom w:val="single" w:sz="4" w:space="0" w:color="D9E2EC"/>
               <w:right w:val="none"/>
             </w:tcBorders>
           </w:tcPr>
@@ -3590,7 +3590,7 @@
               <w:rPr>
                 <w:rFonts w:ascii="Arial" w:hAnsi="Arial"/>
                 <w:b/>
-                <w:color w:val="243B53"/>
+                <w:color w:val="12213A"/>
                 <w:sz w:val="15"/>
               </w:rPr>
               <w:t>Bakso Sapi Bakar Arang (3 Butir)</w:t>
@@ -3610,7 +3610,7 @@
             <w:tcBorders>
               <w:top w:val="none"/>
               <w:left w:val="none"/>
-              <w:bottom w:val="single" w:sz="4" w:space="0" w:color="D4E5E1"/>
+              <w:bottom w:val="single" w:sz="4" w:space="0" w:color="D9E2EC"/>
               <w:right w:val="none"/>
             </w:tcBorders>
           </w:tcPr>
@@ -3641,7 +3641,7 @@
             <w:tcBorders>
               <w:top w:val="none"/>
               <w:left w:val="none"/>
-              <w:bottom w:val="single" w:sz="4" w:space="0" w:color="D4E5E1"/>
+              <w:bottom w:val="single" w:sz="4" w:space="0" w:color="D9E2EC"/>
               <w:right w:val="none"/>
             </w:tcBorders>
           </w:tcPr>
@@ -3672,7 +3672,7 @@
             <w:tcBorders>
               <w:top w:val="none"/>
               <w:left w:val="none"/>
-              <w:bottom w:val="single" w:sz="4" w:space="0" w:color="D4E5E1"/>
+              <w:bottom w:val="single" w:sz="4" w:space="0" w:color="D9E2EC"/>
               <w:right w:val="none"/>
             </w:tcBorders>
           </w:tcPr>
@@ -3703,7 +3703,7 @@
             <w:tcBorders>
               <w:top w:val="none"/>
               <w:left w:val="none"/>
-              <w:bottom w:val="single" w:sz="4" w:space="0" w:color="D4E5E1"/>
+              <w:bottom w:val="single" w:sz="4" w:space="0" w:color="D9E2EC"/>
               <w:right w:val="none"/>
             </w:tcBorders>
           </w:tcPr>
@@ -3715,7 +3715,7 @@
               <w:rPr>
                 <w:rFonts w:ascii="Arial" w:hAnsi="Arial"/>
                 <w:b/>
-                <w:color w:val="166534"/>
+                <w:color w:val="12213A"/>
                 <w:sz w:val="15"/>
               </w:rPr>
               <w:t>Rp 1.100 (44,0%)</w:t>
@@ -3730,7 +3730,7 @@
         <w:tc>
           <w:tcPr>
             <w:tcW w:type="dxa" w:w="2438"/>
-            <w:shd w:val="clear" w:color="auto" w:fill="F4F9F8"/>
+            <w:shd w:val="clear" w:color="auto" w:fill="F4F7FB"/>
             <w:tcMar>
               <w:top w:w="16" w:type="dxa"/>
               <w:bottom w:w="16" w:type="dxa"/>
@@ -3740,7 +3740,7 @@
             <w:tcBorders>
               <w:top w:val="none"/>
               <w:left w:val="none"/>
-              <w:bottom w:val="single" w:sz="4" w:space="0" w:color="D4E5E1"/>
+              <w:bottom w:val="single" w:sz="4" w:space="0" w:color="D9E2EC"/>
               <w:right w:val="none"/>
             </w:tcBorders>
           </w:tcPr>
@@ -3752,7 +3752,7 @@
               <w:rPr>
                 <w:rFonts w:ascii="Arial" w:hAnsi="Arial"/>
                 <w:b/>
-                <w:color w:val="243B53"/>
+                <w:color w:val="12213A"/>
                 <w:sz w:val="15"/>
               </w:rPr>
               <w:t>Dumpling Ayam / Keju Lumer (2 Pcs)</w:t>
@@ -3762,7 +3762,7 @@
         <w:tc>
           <w:tcPr>
             <w:tcW w:type="dxa" w:w="3175"/>
-            <w:shd w:val="clear" w:color="auto" w:fill="F4F9F8"/>
+            <w:shd w:val="clear" w:color="auto" w:fill="F4F7FB"/>
             <w:tcMar>
               <w:top w:w="16" w:type="dxa"/>
               <w:bottom w:w="16" w:type="dxa"/>
@@ -3772,7 +3772,7 @@
             <w:tcBorders>
               <w:top w:val="none"/>
               <w:left w:val="none"/>
-              <w:bottom w:val="single" w:sz="4" w:space="0" w:color="D4E5E1"/>
+              <w:bottom w:val="single" w:sz="4" w:space="0" w:color="D9E2EC"/>
               <w:right w:val="none"/>
             </w:tcBorders>
           </w:tcPr>
@@ -3793,7 +3793,7 @@
         <w:tc>
           <w:tcPr>
             <w:tcW w:type="dxa" w:w="1247"/>
-            <w:shd w:val="clear" w:color="auto" w:fill="F4F9F8"/>
+            <w:shd w:val="clear" w:color="auto" w:fill="F4F7FB"/>
             <w:tcMar>
               <w:top w:w="16" w:type="dxa"/>
               <w:bottom w:w="16" w:type="dxa"/>
@@ -3803,7 +3803,7 @@
             <w:tcBorders>
               <w:top w:val="none"/>
               <w:left w:val="none"/>
-              <w:bottom w:val="single" w:sz="4" w:space="0" w:color="D4E5E1"/>
+              <w:bottom w:val="single" w:sz="4" w:space="0" w:color="D9E2EC"/>
               <w:right w:val="none"/>
             </w:tcBorders>
           </w:tcPr>
@@ -3824,7 +3824,7 @@
         <w:tc>
           <w:tcPr>
             <w:tcW w:type="dxa" w:w="1247"/>
-            <w:shd w:val="clear" w:color="auto" w:fill="F4F9F8"/>
+            <w:shd w:val="clear" w:color="auto" w:fill="F4F7FB"/>
             <w:tcMar>
               <w:top w:w="16" w:type="dxa"/>
               <w:bottom w:w="16" w:type="dxa"/>
@@ -3834,7 +3834,7 @@
             <w:tcBorders>
               <w:top w:val="none"/>
               <w:left w:val="none"/>
-              <w:bottom w:val="single" w:sz="4" w:space="0" w:color="D4E5E1"/>
+              <w:bottom w:val="single" w:sz="4" w:space="0" w:color="D9E2EC"/>
               <w:right w:val="none"/>
             </w:tcBorders>
           </w:tcPr>
@@ -3855,7 +3855,7 @@
         <w:tc>
           <w:tcPr>
             <w:tcW w:type="dxa" w:w="1587"/>
-            <w:shd w:val="clear" w:color="auto" w:fill="F4F9F8"/>
+            <w:shd w:val="clear" w:color="auto" w:fill="F4F7FB"/>
             <w:tcMar>
               <w:top w:w="16" w:type="dxa"/>
               <w:bottom w:w="16" w:type="dxa"/>
@@ -3865,7 +3865,7 @@
             <w:tcBorders>
               <w:top w:val="none"/>
               <w:left w:val="none"/>
-              <w:bottom w:val="single" w:sz="4" w:space="0" w:color="D4E5E1"/>
+              <w:bottom w:val="single" w:sz="4" w:space="0" w:color="D9E2EC"/>
               <w:right w:val="none"/>
             </w:tcBorders>
           </w:tcPr>
@@ -3877,7 +3877,7 @@
               <w:rPr>
                 <w:rFonts w:ascii="Arial" w:hAnsi="Arial"/>
                 <w:b/>
-                <w:color w:val="166534"/>
+                <w:color w:val="12213A"/>
                 <w:sz w:val="15"/>
               </w:rPr>
               <w:t>Rp 1.100 (31,4%)</w:t>
@@ -3902,7 +3902,7 @@
             <w:tcBorders>
               <w:top w:val="none"/>
               <w:left w:val="none"/>
-              <w:bottom w:val="single" w:sz="4" w:space="0" w:color="D4E5E1"/>
+              <w:bottom w:val="single" w:sz="4" w:space="0" w:color="D9E2EC"/>
               <w:right w:val="none"/>
             </w:tcBorders>
           </w:tcPr>
@@ -3914,7 +3914,7 @@
               <w:rPr>
                 <w:rFonts w:ascii="Arial" w:hAnsi="Arial"/>
                 <w:b/>
-                <w:color w:val="243B53"/>
+                <w:color w:val="12213A"/>
                 <w:sz w:val="15"/>
               </w:rPr>
               <w:t>Otak-Otak Singapore Bakar Arang</w:t>
@@ -3934,7 +3934,7 @@
             <w:tcBorders>
               <w:top w:val="none"/>
               <w:left w:val="none"/>
-              <w:bottom w:val="single" w:sz="4" w:space="0" w:color="D4E5E1"/>
+              <w:bottom w:val="single" w:sz="4" w:space="0" w:color="D9E2EC"/>
               <w:right w:val="none"/>
             </w:tcBorders>
           </w:tcPr>
@@ -3965,7 +3965,7 @@
             <w:tcBorders>
               <w:top w:val="none"/>
               <w:left w:val="none"/>
-              <w:bottom w:val="single" w:sz="4" w:space="0" w:color="D4E5E1"/>
+              <w:bottom w:val="single" w:sz="4" w:space="0" w:color="D9E2EC"/>
               <w:right w:val="none"/>
             </w:tcBorders>
           </w:tcPr>
@@ -3996,7 +3996,7 @@
             <w:tcBorders>
               <w:top w:val="none"/>
               <w:left w:val="none"/>
-              <w:bottom w:val="single" w:sz="4" w:space="0" w:color="D4E5E1"/>
+              <w:bottom w:val="single" w:sz="4" w:space="0" w:color="D9E2EC"/>
               <w:right w:val="none"/>
             </w:tcBorders>
           </w:tcPr>
@@ -4027,7 +4027,7 @@
             <w:tcBorders>
               <w:top w:val="none"/>
               <w:left w:val="none"/>
-              <w:bottom w:val="single" w:sz="4" w:space="0" w:color="D4E5E1"/>
+              <w:bottom w:val="single" w:sz="4" w:space="0" w:color="D9E2EC"/>
               <w:right w:val="none"/>
             </w:tcBorders>
           </w:tcPr>
@@ -4039,7 +4039,7 @@
               <w:rPr>
                 <w:rFonts w:ascii="Arial" w:hAnsi="Arial"/>
                 <w:b/>
-                <w:color w:val="166534"/>
+                <w:color w:val="12213A"/>
                 <w:sz w:val="15"/>
               </w:rPr>
               <w:t>Rp 1.000 (40,0%)</w:t>
@@ -4054,7 +4054,7 @@
         <w:tc>
           <w:tcPr>
             <w:tcW w:type="dxa" w:w="2438"/>
-            <w:shd w:val="clear" w:color="auto" w:fill="F4F9F8"/>
+            <w:shd w:val="clear" w:color="auto" w:fill="F4F7FB"/>
             <w:tcMar>
               <w:top w:w="16" w:type="dxa"/>
               <w:bottom w:w="16" w:type="dxa"/>
@@ -4064,7 +4064,7 @@
             <w:tcBorders>
               <w:top w:val="none"/>
               <w:left w:val="none"/>
-              <w:bottom w:val="single" w:sz="4" w:space="0" w:color="D4E5E1"/>
+              <w:bottom w:val="single" w:sz="4" w:space="0" w:color="D9E2EC"/>
               <w:right w:val="none"/>
             </w:tcBorders>
           </w:tcPr>
@@ -4076,7 +4076,7 @@
               <w:rPr>
                 <w:rFonts w:ascii="Arial" w:hAnsi="Arial"/>
                 <w:b/>
-                <w:color w:val="243B53"/>
+                <w:color w:val="12213A"/>
                 <w:sz w:val="15"/>
               </w:rPr>
               <w:t>Sate Cumi Olahan Bakar (Squid Flower)</w:t>
@@ -4086,7 +4086,7 @@
         <w:tc>
           <w:tcPr>
             <w:tcW w:type="dxa" w:w="3175"/>
-            <w:shd w:val="clear" w:color="auto" w:fill="F4F9F8"/>
+            <w:shd w:val="clear" w:color="auto" w:fill="F4F7FB"/>
             <w:tcMar>
               <w:top w:w="16" w:type="dxa"/>
               <w:bottom w:w="16" w:type="dxa"/>
@@ -4096,7 +4096,7 @@
             <w:tcBorders>
               <w:top w:val="none"/>
               <w:left w:val="none"/>
-              <w:bottom w:val="single" w:sz="4" w:space="0" w:color="D4E5E1"/>
+              <w:bottom w:val="single" w:sz="4" w:space="0" w:color="D9E2EC"/>
               <w:right w:val="none"/>
             </w:tcBorders>
           </w:tcPr>
@@ -4117,7 +4117,7 @@
         <w:tc>
           <w:tcPr>
             <w:tcW w:type="dxa" w:w="1247"/>
-            <w:shd w:val="clear" w:color="auto" w:fill="F4F9F8"/>
+            <w:shd w:val="clear" w:color="auto" w:fill="F4F7FB"/>
             <w:tcMar>
               <w:top w:w="16" w:type="dxa"/>
               <w:bottom w:w="16" w:type="dxa"/>
@@ -4127,7 +4127,7 @@
             <w:tcBorders>
               <w:top w:val="none"/>
               <w:left w:val="none"/>
-              <w:bottom w:val="single" w:sz="4" w:space="0" w:color="D4E5E1"/>
+              <w:bottom w:val="single" w:sz="4" w:space="0" w:color="D9E2EC"/>
               <w:right w:val="none"/>
             </w:tcBorders>
           </w:tcPr>
@@ -4148,7 +4148,7 @@
         <w:tc>
           <w:tcPr>
             <w:tcW w:type="dxa" w:w="1247"/>
-            <w:shd w:val="clear" w:color="auto" w:fill="F4F9F8"/>
+            <w:shd w:val="clear" w:color="auto" w:fill="F4F7FB"/>
             <w:tcMar>
               <w:top w:w="16" w:type="dxa"/>
               <w:bottom w:w="16" w:type="dxa"/>
@@ -4158,7 +4158,7 @@
             <w:tcBorders>
               <w:top w:val="none"/>
               <w:left w:val="none"/>
-              <w:bottom w:val="single" w:sz="4" w:space="0" w:color="D4E5E1"/>
+              <w:bottom w:val="single" w:sz="4" w:space="0" w:color="D9E2EC"/>
               <w:right w:val="none"/>
             </w:tcBorders>
           </w:tcPr>
@@ -4179,7 +4179,7 @@
         <w:tc>
           <w:tcPr>
             <w:tcW w:type="dxa" w:w="1587"/>
-            <w:shd w:val="clear" w:color="auto" w:fill="F4F9F8"/>
+            <w:shd w:val="clear" w:color="auto" w:fill="F4F7FB"/>
             <w:tcMar>
               <w:top w:w="16" w:type="dxa"/>
               <w:bottom w:w="16" w:type="dxa"/>
@@ -4189,7 +4189,7 @@
             <w:tcBorders>
               <w:top w:val="none"/>
               <w:left w:val="none"/>
-              <w:bottom w:val="single" w:sz="4" w:space="0" w:color="D4E5E1"/>
+              <w:bottom w:val="single" w:sz="4" w:space="0" w:color="D9E2EC"/>
               <w:right w:val="none"/>
             </w:tcBorders>
           </w:tcPr>
@@ -4201,7 +4201,7 @@
               <w:rPr>
                 <w:rFonts w:ascii="Arial" w:hAnsi="Arial"/>
                 <w:b/>
-                <w:color w:val="166534"/>
+                <w:color w:val="12213A"/>
                 <w:sz w:val="15"/>
               </w:rPr>
               <w:t>Rp 1.500 (42,9%)</w:t>
@@ -4226,7 +4226,7 @@
             <w:tcBorders>
               <w:top w:val="none"/>
               <w:left w:val="none"/>
-              <w:bottom w:val="single" w:sz="4" w:space="0" w:color="D4E5E1"/>
+              <w:bottom w:val="single" w:sz="4" w:space="0" w:color="D9E2EC"/>
               <w:right w:val="none"/>
             </w:tcBorders>
           </w:tcPr>
@@ -4238,7 +4238,7 @@
               <w:rPr>
                 <w:rFonts w:ascii="Arial" w:hAnsi="Arial"/>
                 <w:b/>
-                <w:color w:val="243B53"/>
+                <w:color w:val="12213A"/>
                 <w:sz w:val="15"/>
               </w:rPr>
               <w:t>Fish Roll / Crab Stick Olahan Bakar</w:t>
@@ -4258,7 +4258,7 @@
             <w:tcBorders>
               <w:top w:val="none"/>
               <w:left w:val="none"/>
-              <w:bottom w:val="single" w:sz="4" w:space="0" w:color="D4E5E1"/>
+              <w:bottom w:val="single" w:sz="4" w:space="0" w:color="D9E2EC"/>
               <w:right w:val="none"/>
             </w:tcBorders>
           </w:tcPr>
@@ -4289,7 +4289,7 @@
             <w:tcBorders>
               <w:top w:val="none"/>
               <w:left w:val="none"/>
-              <w:bottom w:val="single" w:sz="4" w:space="0" w:color="D4E5E1"/>
+              <w:bottom w:val="single" w:sz="4" w:space="0" w:color="D9E2EC"/>
               <w:right w:val="none"/>
             </w:tcBorders>
           </w:tcPr>
@@ -4320,7 +4320,7 @@
             <w:tcBorders>
               <w:top w:val="none"/>
               <w:left w:val="none"/>
-              <w:bottom w:val="single" w:sz="4" w:space="0" w:color="D4E5E1"/>
+              <w:bottom w:val="single" w:sz="4" w:space="0" w:color="D9E2EC"/>
               <w:right w:val="none"/>
             </w:tcBorders>
           </w:tcPr>
@@ -4351,7 +4351,7 @@
             <w:tcBorders>
               <w:top w:val="none"/>
               <w:left w:val="none"/>
-              <w:bottom w:val="single" w:sz="4" w:space="0" w:color="D4E5E1"/>
+              <w:bottom w:val="single" w:sz="4" w:space="0" w:color="D9E2EC"/>
               <w:right w:val="none"/>
             </w:tcBorders>
           </w:tcPr>
@@ -4363,7 +4363,7 @@
               <w:rPr>
                 <w:rFonts w:ascii="Arial" w:hAnsi="Arial"/>
                 <w:b/>
-                <w:color w:val="166534"/>
+                <w:color w:val="12213A"/>
                 <w:sz w:val="15"/>
               </w:rPr>
               <w:t>Rp 1.100 (44,0%)</w:t>
@@ -4378,7 +4378,7 @@
         <w:tc>
           <w:tcPr>
             <w:tcW w:type="dxa" w:w="2438"/>
-            <w:shd w:val="clear" w:color="auto" w:fill="F4F9F8"/>
+            <w:shd w:val="clear" w:color="auto" w:fill="F4F7FB"/>
             <w:tcMar>
               <w:top w:w="16" w:type="dxa"/>
               <w:bottom w:w="16" w:type="dxa"/>
@@ -4388,7 +4388,7 @@
             <w:tcBorders>
               <w:top w:val="none"/>
               <w:left w:val="none"/>
-              <w:bottom w:val="single" w:sz="4" w:space="0" w:color="D4E5E1"/>
+              <w:bottom w:val="single" w:sz="4" w:space="0" w:color="D9E2EC"/>
               <w:right w:val="none"/>
             </w:tcBorders>
           </w:tcPr>
@@ -4400,7 +4400,7 @@
               <w:rPr>
                 <w:rFonts w:ascii="Arial" w:hAnsi="Arial"/>
                 <w:b/>
-                <w:color w:val="243B53"/>
+                <w:color w:val="12213A"/>
                 <w:sz w:val="15"/>
               </w:rPr>
               <w:t>Nasi Kucing Teri / Orek Tempe</w:t>
@@ -4410,7 +4410,7 @@
         <w:tc>
           <w:tcPr>
             <w:tcW w:type="dxa" w:w="3175"/>
-            <w:shd w:val="clear" w:color="auto" w:fill="F4F9F8"/>
+            <w:shd w:val="clear" w:color="auto" w:fill="F4F7FB"/>
             <w:tcMar>
               <w:top w:w="16" w:type="dxa"/>
               <w:bottom w:w="16" w:type="dxa"/>
@@ -4420,7 +4420,7 @@
             <w:tcBorders>
               <w:top w:val="none"/>
               <w:left w:val="none"/>
-              <w:bottom w:val="single" w:sz="4" w:space="0" w:color="D4E5E1"/>
+              <w:bottom w:val="single" w:sz="4" w:space="0" w:color="D9E2EC"/>
               <w:right w:val="none"/>
             </w:tcBorders>
           </w:tcPr>
@@ -4441,7 +4441,7 @@
         <w:tc>
           <w:tcPr>
             <w:tcW w:type="dxa" w:w="1247"/>
-            <w:shd w:val="clear" w:color="auto" w:fill="F4F9F8"/>
+            <w:shd w:val="clear" w:color="auto" w:fill="F4F7FB"/>
             <w:tcMar>
               <w:top w:w="16" w:type="dxa"/>
               <w:bottom w:w="16" w:type="dxa"/>
@@ -4451,7 +4451,7 @@
             <w:tcBorders>
               <w:top w:val="none"/>
               <w:left w:val="none"/>
-              <w:bottom w:val="single" w:sz="4" w:space="0" w:color="D4E5E1"/>
+              <w:bottom w:val="single" w:sz="4" w:space="0" w:color="D9E2EC"/>
               <w:right w:val="none"/>
             </w:tcBorders>
           </w:tcPr>
@@ -4472,7 +4472,7 @@
         <w:tc>
           <w:tcPr>
             <w:tcW w:type="dxa" w:w="1247"/>
-            <w:shd w:val="clear" w:color="auto" w:fill="F4F9F8"/>
+            <w:shd w:val="clear" w:color="auto" w:fill="F4F7FB"/>
             <w:tcMar>
               <w:top w:w="16" w:type="dxa"/>
               <w:bottom w:w="16" w:type="dxa"/>
@@ -4482,7 +4482,7 @@
             <w:tcBorders>
               <w:top w:val="none"/>
               <w:left w:val="none"/>
-              <w:bottom w:val="single" w:sz="4" w:space="0" w:color="D4E5E1"/>
+              <w:bottom w:val="single" w:sz="4" w:space="0" w:color="D9E2EC"/>
               <w:right w:val="none"/>
             </w:tcBorders>
           </w:tcPr>
@@ -4503,7 +4503,7 @@
         <w:tc>
           <w:tcPr>
             <w:tcW w:type="dxa" w:w="1587"/>
-            <w:shd w:val="clear" w:color="auto" w:fill="F4F9F8"/>
+            <w:shd w:val="clear" w:color="auto" w:fill="F4F7FB"/>
             <w:tcMar>
               <w:top w:w="16" w:type="dxa"/>
               <w:bottom w:w="16" w:type="dxa"/>
@@ -4513,7 +4513,7 @@
             <w:tcBorders>
               <w:top w:val="none"/>
               <w:left w:val="none"/>
-              <w:bottom w:val="single" w:sz="4" w:space="0" w:color="D4E5E1"/>
+              <w:bottom w:val="single" w:sz="4" w:space="0" w:color="D9E2EC"/>
               <w:right w:val="none"/>
             </w:tcBorders>
           </w:tcPr>
@@ -4525,7 +4525,7 @@
               <w:rPr>
                 <w:rFonts w:ascii="Arial" w:hAnsi="Arial"/>
                 <w:b/>
-                <w:color w:val="166534"/>
+                <w:color w:val="12213A"/>
                 <w:sz w:val="15"/>
               </w:rPr>
               <w:t>Rp 1.000 (40,0%)</w:t>
@@ -4550,7 +4550,7 @@
             <w:tcBorders>
               <w:top w:val="none"/>
               <w:left w:val="none"/>
-              <w:bottom w:val="single" w:sz="4" w:space="0" w:color="D4E5E1"/>
+              <w:bottom w:val="single" w:sz="4" w:space="0" w:color="D9E2EC"/>
               <w:right w:val="none"/>
             </w:tcBorders>
           </w:tcPr>
@@ -4562,7 +4562,7 @@
               <w:rPr>
                 <w:rFonts w:ascii="Arial" w:hAnsi="Arial"/>
                 <w:b/>
-                <w:color w:val="243B53"/>
+                <w:color w:val="12213A"/>
                 <w:sz w:val="15"/>
               </w:rPr>
               <w:t>Tempe Mendoan Hangat (3 Lembar)</w:t>
@@ -4582,7 +4582,7 @@
             <w:tcBorders>
               <w:top w:val="none"/>
               <w:left w:val="none"/>
-              <w:bottom w:val="single" w:sz="4" w:space="0" w:color="D4E5E1"/>
+              <w:bottom w:val="single" w:sz="4" w:space="0" w:color="D9E2EC"/>
               <w:right w:val="none"/>
             </w:tcBorders>
           </w:tcPr>
@@ -4613,7 +4613,7 @@
             <w:tcBorders>
               <w:top w:val="none"/>
               <w:left w:val="none"/>
-              <w:bottom w:val="single" w:sz="4" w:space="0" w:color="D4E5E1"/>
+              <w:bottom w:val="single" w:sz="4" w:space="0" w:color="D9E2EC"/>
               <w:right w:val="none"/>
             </w:tcBorders>
           </w:tcPr>
@@ -4644,7 +4644,7 @@
             <w:tcBorders>
               <w:top w:val="none"/>
               <w:left w:val="none"/>
-              <w:bottom w:val="single" w:sz="4" w:space="0" w:color="D4E5E1"/>
+              <w:bottom w:val="single" w:sz="4" w:space="0" w:color="D9E2EC"/>
               <w:right w:val="none"/>
             </w:tcBorders>
           </w:tcPr>
@@ -4675,7 +4675,7 @@
             <w:tcBorders>
               <w:top w:val="none"/>
               <w:left w:val="none"/>
-              <w:bottom w:val="single" w:sz="4" w:space="0" w:color="D4E5E1"/>
+              <w:bottom w:val="single" w:sz="4" w:space="0" w:color="D9E2EC"/>
               <w:right w:val="none"/>
             </w:tcBorders>
           </w:tcPr>
@@ -4687,7 +4687,7 @@
               <w:rPr>
                 <w:rFonts w:ascii="Arial" w:hAnsi="Arial"/>
                 <w:b/>
-                <w:color w:val="166534"/>
+                <w:color w:val="12213A"/>
                 <w:sz w:val="15"/>
               </w:rPr>
               <w:t>Rp 1.000 (33,3%)</w:t>
@@ -4702,7 +4702,7 @@
         <w:tc>
           <w:tcPr>
             <w:tcW w:type="dxa" w:w="2438"/>
-            <w:shd w:val="clear" w:color="auto" w:fill="F4F9F8"/>
+            <w:shd w:val="clear" w:color="auto" w:fill="F4F7FB"/>
             <w:tcMar>
               <w:top w:w="16" w:type="dxa"/>
               <w:bottom w:w="16" w:type="dxa"/>
@@ -4712,7 +4712,7 @@
             <w:tcBorders>
               <w:top w:val="none"/>
               <w:left w:val="none"/>
-              <w:bottom w:val="single" w:sz="4" w:space="0" w:color="D4E5E1"/>
+              <w:bottom w:val="single" w:sz="4" w:space="0" w:color="D9E2EC"/>
               <w:right w:val="none"/>
             </w:tcBorders>
           </w:tcPr>
@@ -4724,7 +4724,7 @@
               <w:rPr>
                 <w:rFonts w:ascii="Arial" w:hAnsi="Arial"/>
                 <w:b/>
-                <w:color w:val="243B53"/>
+                <w:color w:val="12213A"/>
                 <w:sz w:val="15"/>
               </w:rPr>
               <w:t>Kopi Tubruk 'Kedai 21 Asli' (Signature)</w:t>
@@ -4734,7 +4734,7 @@
         <w:tc>
           <w:tcPr>
             <w:tcW w:type="dxa" w:w="3175"/>
-            <w:shd w:val="clear" w:color="auto" w:fill="F4F9F8"/>
+            <w:shd w:val="clear" w:color="auto" w:fill="F4F7FB"/>
             <w:tcMar>
               <w:top w:w="16" w:type="dxa"/>
               <w:bottom w:w="16" w:type="dxa"/>
@@ -4744,7 +4744,7 @@
             <w:tcBorders>
               <w:top w:val="none"/>
               <w:left w:val="none"/>
-              <w:bottom w:val="single" w:sz="4" w:space="0" w:color="D4E5E1"/>
+              <w:bottom w:val="single" w:sz="4" w:space="0" w:color="D9E2EC"/>
               <w:right w:val="none"/>
             </w:tcBorders>
           </w:tcPr>
@@ -4765,7 +4765,7 @@
         <w:tc>
           <w:tcPr>
             <w:tcW w:type="dxa" w:w="1247"/>
-            <w:shd w:val="clear" w:color="auto" w:fill="F4F9F8"/>
+            <w:shd w:val="clear" w:color="auto" w:fill="F4F7FB"/>
             <w:tcMar>
               <w:top w:w="16" w:type="dxa"/>
               <w:bottom w:w="16" w:type="dxa"/>
@@ -4775,7 +4775,7 @@
             <w:tcBorders>
               <w:top w:val="none"/>
               <w:left w:val="none"/>
-              <w:bottom w:val="single" w:sz="4" w:space="0" w:color="D4E5E1"/>
+              <w:bottom w:val="single" w:sz="4" w:space="0" w:color="D9E2EC"/>
               <w:right w:val="none"/>
             </w:tcBorders>
           </w:tcPr>
@@ -4796,7 +4796,7 @@
         <w:tc>
           <w:tcPr>
             <w:tcW w:type="dxa" w:w="1247"/>
-            <w:shd w:val="clear" w:color="auto" w:fill="F4F9F8"/>
+            <w:shd w:val="clear" w:color="auto" w:fill="F4F7FB"/>
             <w:tcMar>
               <w:top w:w="16" w:type="dxa"/>
               <w:bottom w:w="16" w:type="dxa"/>
@@ -4806,7 +4806,7 @@
             <w:tcBorders>
               <w:top w:val="none"/>
               <w:left w:val="none"/>
-              <w:bottom w:val="single" w:sz="4" w:space="0" w:color="D4E5E1"/>
+              <w:bottom w:val="single" w:sz="4" w:space="0" w:color="D9E2EC"/>
               <w:right w:val="none"/>
             </w:tcBorders>
           </w:tcPr>
@@ -4827,7 +4827,7 @@
         <w:tc>
           <w:tcPr>
             <w:tcW w:type="dxa" w:w="1587"/>
-            <w:shd w:val="clear" w:color="auto" w:fill="F4F9F8"/>
+            <w:shd w:val="clear" w:color="auto" w:fill="F4F7FB"/>
             <w:tcMar>
               <w:top w:w="16" w:type="dxa"/>
               <w:bottom w:w="16" w:type="dxa"/>
@@ -4837,7 +4837,7 @@
             <w:tcBorders>
               <w:top w:val="none"/>
               <w:left w:val="none"/>
-              <w:bottom w:val="single" w:sz="4" w:space="0" w:color="D4E5E1"/>
+              <w:bottom w:val="single" w:sz="4" w:space="0" w:color="D9E2EC"/>
               <w:right w:val="none"/>
             </w:tcBorders>
           </w:tcPr>
@@ -4849,7 +4849,7 @@
               <w:rPr>
                 <w:rFonts w:ascii="Arial" w:hAnsi="Arial"/>
                 <w:b/>
-                <w:color w:val="166534"/>
+                <w:color w:val="12213A"/>
                 <w:sz w:val="15"/>
               </w:rPr>
               <w:t>Rp 1.800 (60,0%)</w:t>
@@ -4874,7 +4874,7 @@
             <w:tcBorders>
               <w:top w:val="none"/>
               <w:left w:val="none"/>
-              <w:bottom w:val="single" w:sz="4" w:space="0" w:color="D4E5E1"/>
+              <w:bottom w:val="single" w:sz="4" w:space="0" w:color="D9E2EC"/>
               <w:right w:val="none"/>
             </w:tcBorders>
           </w:tcPr>
@@ -4886,7 +4886,7 @@
               <w:rPr>
                 <w:rFonts w:ascii="Arial" w:hAnsi="Arial"/>
                 <w:b/>
-                <w:color w:val="243B53"/>
+                <w:color w:val="12213A"/>
                 <w:sz w:val="15"/>
               </w:rPr>
               <w:t>Kopi Sachet Populer (Renceng/Dus)</w:t>
@@ -4906,7 +4906,7 @@
             <w:tcBorders>
               <w:top w:val="none"/>
               <w:left w:val="none"/>
-              <w:bottom w:val="single" w:sz="4" w:space="0" w:color="D4E5E1"/>
+              <w:bottom w:val="single" w:sz="4" w:space="0" w:color="D9E2EC"/>
               <w:right w:val="none"/>
             </w:tcBorders>
           </w:tcPr>
@@ -4937,7 +4937,7 @@
             <w:tcBorders>
               <w:top w:val="none"/>
               <w:left w:val="none"/>
-              <w:bottom w:val="single" w:sz="4" w:space="0" w:color="D4E5E1"/>
+              <w:bottom w:val="single" w:sz="4" w:space="0" w:color="D9E2EC"/>
               <w:right w:val="none"/>
             </w:tcBorders>
           </w:tcPr>
@@ -4968,7 +4968,7 @@
             <w:tcBorders>
               <w:top w:val="none"/>
               <w:left w:val="none"/>
-              <w:bottom w:val="single" w:sz="4" w:space="0" w:color="D4E5E1"/>
+              <w:bottom w:val="single" w:sz="4" w:space="0" w:color="D9E2EC"/>
               <w:right w:val="none"/>
             </w:tcBorders>
           </w:tcPr>
@@ -4999,7 +4999,7 @@
             <w:tcBorders>
               <w:top w:val="none"/>
               <w:left w:val="none"/>
-              <w:bottom w:val="single" w:sz="4" w:space="0" w:color="D4E5E1"/>
+              <w:bottom w:val="single" w:sz="4" w:space="0" w:color="D9E2EC"/>
               <w:right w:val="none"/>
             </w:tcBorders>
           </w:tcPr>
@@ -5011,7 +5011,7 @@
               <w:rPr>
                 <w:rFonts w:ascii="Arial" w:hAnsi="Arial"/>
                 <w:b/>
-                <w:color w:val="166534"/>
+                <w:color w:val="12213A"/>
                 <w:sz w:val="15"/>
               </w:rPr>
               <w:t>Rp 1.600 (53,3%)</w:t>
@@ -5026,7 +5026,7 @@
         <w:tc>
           <w:tcPr>
             <w:tcW w:type="dxa" w:w="2438"/>
-            <w:shd w:val="clear" w:color="auto" w:fill="F4F9F8"/>
+            <w:shd w:val="clear" w:color="auto" w:fill="F4F7FB"/>
             <w:tcMar>
               <w:top w:w="16" w:type="dxa"/>
               <w:bottom w:w="16" w:type="dxa"/>
@@ -5036,7 +5036,7 @@
             <w:tcBorders>
               <w:top w:val="none"/>
               <w:left w:val="none"/>
-              <w:bottom w:val="single" w:sz="4" w:space="0" w:color="D4E5E1"/>
+              <w:bottom w:val="single" w:sz="4" w:space="0" w:color="D9E2EC"/>
               <w:right w:val="none"/>
             </w:tcBorders>
           </w:tcPr>
@@ -5048,7 +5048,7 @@
               <w:rPr>
                 <w:rFonts w:ascii="Arial" w:hAnsi="Arial"/>
                 <w:b/>
-                <w:color w:val="243B53"/>
+                <w:color w:val="12213A"/>
                 <w:sz w:val="15"/>
               </w:rPr>
               <w:t>Es / Hangat Minuman Sachet Segar</w:t>
@@ -5058,7 +5058,7 @@
         <w:tc>
           <w:tcPr>
             <w:tcW w:type="dxa" w:w="3175"/>
-            <w:shd w:val="clear" w:color="auto" w:fill="F4F9F8"/>
+            <w:shd w:val="clear" w:color="auto" w:fill="F4F7FB"/>
             <w:tcMar>
               <w:top w:w="16" w:type="dxa"/>
               <w:bottom w:w="16" w:type="dxa"/>
@@ -5068,7 +5068,7 @@
             <w:tcBorders>
               <w:top w:val="none"/>
               <w:left w:val="none"/>
-              <w:bottom w:val="single" w:sz="4" w:space="0" w:color="D4E5E1"/>
+              <w:bottom w:val="single" w:sz="4" w:space="0" w:color="D9E2EC"/>
               <w:right w:val="none"/>
             </w:tcBorders>
           </w:tcPr>
@@ -5089,7 +5089,7 @@
         <w:tc>
           <w:tcPr>
             <w:tcW w:type="dxa" w:w="1247"/>
-            <w:shd w:val="clear" w:color="auto" w:fill="F4F9F8"/>
+            <w:shd w:val="clear" w:color="auto" w:fill="F4F7FB"/>
             <w:tcMar>
               <w:top w:w="16" w:type="dxa"/>
               <w:bottom w:w="16" w:type="dxa"/>
@@ -5099,7 +5099,7 @@
             <w:tcBorders>
               <w:top w:val="none"/>
               <w:left w:val="none"/>
-              <w:bottom w:val="single" w:sz="4" w:space="0" w:color="D4E5E1"/>
+              <w:bottom w:val="single" w:sz="4" w:space="0" w:color="D9E2EC"/>
               <w:right w:val="none"/>
             </w:tcBorders>
           </w:tcPr>
@@ -5120,7 +5120,7 @@
         <w:tc>
           <w:tcPr>
             <w:tcW w:type="dxa" w:w="1247"/>
-            <w:shd w:val="clear" w:color="auto" w:fill="F4F9F8"/>
+            <w:shd w:val="clear" w:color="auto" w:fill="F4F7FB"/>
             <w:tcMar>
               <w:top w:w="16" w:type="dxa"/>
               <w:bottom w:w="16" w:type="dxa"/>
@@ -5130,7 +5130,7 @@
             <w:tcBorders>
               <w:top w:val="none"/>
               <w:left w:val="none"/>
-              <w:bottom w:val="single" w:sz="4" w:space="0" w:color="D4E5E1"/>
+              <w:bottom w:val="single" w:sz="4" w:space="0" w:color="D9E2EC"/>
               <w:right w:val="none"/>
             </w:tcBorders>
           </w:tcPr>
@@ -5151,7 +5151,7 @@
         <w:tc>
           <w:tcPr>
             <w:tcW w:type="dxa" w:w="1587"/>
-            <w:shd w:val="clear" w:color="auto" w:fill="F4F9F8"/>
+            <w:shd w:val="clear" w:color="auto" w:fill="F4F7FB"/>
             <w:tcMar>
               <w:top w:w="16" w:type="dxa"/>
               <w:bottom w:w="16" w:type="dxa"/>
@@ -5161,7 +5161,7 @@
             <w:tcBorders>
               <w:top w:val="none"/>
               <w:left w:val="none"/>
-              <w:bottom w:val="single" w:sz="4" w:space="0" w:color="D4E5E1"/>
+              <w:bottom w:val="single" w:sz="4" w:space="0" w:color="D9E2EC"/>
               <w:right w:val="none"/>
             </w:tcBorders>
           </w:tcPr>
@@ -5173,7 +5173,7 @@
               <w:rPr>
                 <w:rFonts w:ascii="Arial" w:hAnsi="Arial"/>
                 <w:b/>
-                <w:color w:val="166534"/>
+                <w:color w:val="12213A"/>
                 <w:sz w:val="15"/>
               </w:rPr>
               <w:t>Rp 1.500 (42,9%)</w:t>
@@ -5198,7 +5198,7 @@
             <w:tcBorders>
               <w:top w:val="none"/>
               <w:left w:val="none"/>
-              <w:bottom w:val="single" w:sz="4" w:space="0" w:color="D4E5E1"/>
+              <w:bottom w:val="single" w:sz="4" w:space="0" w:color="D9E2EC"/>
               <w:right w:val="none"/>
             </w:tcBorders>
           </w:tcPr>
@@ -5210,7 +5210,7 @@
               <w:rPr>
                 <w:rFonts w:ascii="Arial" w:hAnsi="Arial"/>
                 <w:b/>
-                <w:color w:val="243B53"/>
+                <w:color w:val="12213A"/>
                 <w:sz w:val="15"/>
               </w:rPr>
               <w:t>Susu Murni / Kopi Rempah Kedai 21</w:t>
@@ -5230,7 +5230,7 @@
             <w:tcBorders>
               <w:top w:val="none"/>
               <w:left w:val="none"/>
-              <w:bottom w:val="single" w:sz="4" w:space="0" w:color="D4E5E1"/>
+              <w:bottom w:val="single" w:sz="4" w:space="0" w:color="D9E2EC"/>
               <w:right w:val="none"/>
             </w:tcBorders>
           </w:tcPr>
@@ -5261,7 +5261,7 @@
             <w:tcBorders>
               <w:top w:val="none"/>
               <w:left w:val="none"/>
-              <w:bottom w:val="single" w:sz="4" w:space="0" w:color="D4E5E1"/>
+              <w:bottom w:val="single" w:sz="4" w:space="0" w:color="D9E2EC"/>
               <w:right w:val="none"/>
             </w:tcBorders>
           </w:tcPr>
@@ -5292,7 +5292,7 @@
             <w:tcBorders>
               <w:top w:val="none"/>
               <w:left w:val="none"/>
-              <w:bottom w:val="single" w:sz="4" w:space="0" w:color="D4E5E1"/>
+              <w:bottom w:val="single" w:sz="4" w:space="0" w:color="D9E2EC"/>
               <w:right w:val="none"/>
             </w:tcBorders>
           </w:tcPr>
@@ -5323,7 +5323,7 @@
             <w:tcBorders>
               <w:top w:val="none"/>
               <w:left w:val="none"/>
-              <w:bottom w:val="single" w:sz="4" w:space="0" w:color="D4E5E1"/>
+              <w:bottom w:val="single" w:sz="4" w:space="0" w:color="D9E2EC"/>
               <w:right w:val="none"/>
             </w:tcBorders>
           </w:tcPr>
@@ -5335,7 +5335,7 @@
               <w:rPr>
                 <w:rFonts w:ascii="Arial" w:hAnsi="Arial"/>
                 <w:b/>
-                <w:color w:val="166534"/>
+                <w:color w:val="12213A"/>
                 <w:sz w:val="15"/>
               </w:rPr>
               <w:t>Rp 2.500 (41,7%)</w:t>
@@ -5353,7 +5353,7 @@
         <w:rPr>
           <w:rFonts w:ascii="Arial" w:hAnsi="Arial"/>
           <w:b/>
-          <w:color w:val="00AA91"/>
+          <w:color w:val="12213A"/>
           <w:sz w:val="21"/>
         </w:rPr>
         <w:t>5.2 Proyeksi Kinerja Keuangan &amp; Waktu Balik Modal (BEP)</w:t>
@@ -5488,7 +5488,7 @@
         <w:tc>
           <w:tcPr>
             <w:tcW w:type="dxa" w:w="2891"/>
-            <w:shd w:val="clear" w:color="auto" w:fill="F4F9F8"/>
+            <w:shd w:val="clear" w:color="auto" w:fill="F4F7FB"/>
             <w:tcMar>
               <w:top w:w="18" w:type="dxa"/>
               <w:bottom w:w="18" w:type="dxa"/>
@@ -5498,7 +5498,7 @@
             <w:tcBorders>
               <w:top w:val="none"/>
               <w:left w:val="none"/>
-              <w:bottom w:val="single" w:sz="4" w:space="0" w:color="D4E5E1"/>
+              <w:bottom w:val="single" w:sz="4" w:space="0" w:color="D9E2EC"/>
               <w:right w:val="none"/>
             </w:tcBorders>
           </w:tcPr>
@@ -5520,7 +5520,7 @@
         <w:tc>
           <w:tcPr>
             <w:tcW w:type="dxa" w:w="2268"/>
-            <w:shd w:val="clear" w:color="auto" w:fill="F4F9F8"/>
+            <w:shd w:val="clear" w:color="auto" w:fill="F4F7FB"/>
             <w:tcMar>
               <w:top w:w="18" w:type="dxa"/>
               <w:bottom w:w="18" w:type="dxa"/>
@@ -5530,7 +5530,7 @@
             <w:tcBorders>
               <w:top w:val="none"/>
               <w:left w:val="none"/>
-              <w:bottom w:val="single" w:sz="4" w:space="0" w:color="D4E5E1"/>
+              <w:bottom w:val="single" w:sz="4" w:space="0" w:color="D9E2EC"/>
               <w:right w:val="none"/>
             </w:tcBorders>
           </w:tcPr>
@@ -5552,7 +5552,7 @@
         <w:tc>
           <w:tcPr>
             <w:tcW w:type="dxa" w:w="2268"/>
-            <w:shd w:val="clear" w:color="auto" w:fill="F4F9F8"/>
+            <w:shd w:val="clear" w:color="auto" w:fill="F4F7FB"/>
             <w:tcMar>
               <w:top w:w="18" w:type="dxa"/>
               <w:bottom w:w="18" w:type="dxa"/>
@@ -5562,7 +5562,7 @@
             <w:tcBorders>
               <w:top w:val="none"/>
               <w:left w:val="none"/>
-              <w:bottom w:val="single" w:sz="4" w:space="0" w:color="D4E5E1"/>
+              <w:bottom w:val="single" w:sz="4" w:space="0" w:color="D9E2EC"/>
               <w:right w:val="none"/>
             </w:tcBorders>
           </w:tcPr>
@@ -5584,7 +5584,7 @@
         <w:tc>
           <w:tcPr>
             <w:tcW w:type="dxa" w:w="2268"/>
-            <w:shd w:val="clear" w:color="auto" w:fill="F4F9F8"/>
+            <w:shd w:val="clear" w:color="auto" w:fill="F4F7FB"/>
             <w:tcMar>
               <w:top w:w="18" w:type="dxa"/>
               <w:bottom w:w="18" w:type="dxa"/>
@@ -5594,7 +5594,7 @@
             <w:tcBorders>
               <w:top w:val="none"/>
               <w:left w:val="none"/>
-              <w:bottom w:val="single" w:sz="4" w:space="0" w:color="D4E5E1"/>
+              <w:bottom w:val="single" w:sz="4" w:space="0" w:color="D9E2EC"/>
               <w:right w:val="none"/>
             </w:tcBorders>
           </w:tcPr>
@@ -5631,7 +5631,7 @@
             <w:tcBorders>
               <w:top w:val="none"/>
               <w:left w:val="none"/>
-              <w:bottom w:val="single" w:sz="4" w:space="0" w:color="D4E5E1"/>
+              <w:bottom w:val="single" w:sz="4" w:space="0" w:color="D9E2EC"/>
               <w:right w:val="none"/>
             </w:tcBorders>
           </w:tcPr>
@@ -5663,7 +5663,7 @@
             <w:tcBorders>
               <w:top w:val="none"/>
               <w:left w:val="none"/>
-              <w:bottom w:val="single" w:sz="4" w:space="0" w:color="D4E5E1"/>
+              <w:bottom w:val="single" w:sz="4" w:space="0" w:color="D9E2EC"/>
               <w:right w:val="none"/>
             </w:tcBorders>
           </w:tcPr>
@@ -5695,7 +5695,7 @@
             <w:tcBorders>
               <w:top w:val="none"/>
               <w:left w:val="none"/>
-              <w:bottom w:val="single" w:sz="4" w:space="0" w:color="D4E5E1"/>
+              <w:bottom w:val="single" w:sz="4" w:space="0" w:color="D9E2EC"/>
               <w:right w:val="none"/>
             </w:tcBorders>
           </w:tcPr>
@@ -5727,7 +5727,7 @@
             <w:tcBorders>
               <w:top w:val="none"/>
               <w:left w:val="none"/>
-              <w:bottom w:val="single" w:sz="4" w:space="0" w:color="D4E5E1"/>
+              <w:bottom w:val="single" w:sz="4" w:space="0" w:color="D9E2EC"/>
               <w:right w:val="none"/>
             </w:tcBorders>
           </w:tcPr>
@@ -5754,7 +5754,7 @@
         <w:tc>
           <w:tcPr>
             <w:tcW w:type="dxa" w:w="2891"/>
-            <w:shd w:val="clear" w:color="auto" w:fill="F4F9F8"/>
+            <w:shd w:val="clear" w:color="auto" w:fill="F4F7FB"/>
             <w:tcMar>
               <w:top w:w="18" w:type="dxa"/>
               <w:bottom w:w="18" w:type="dxa"/>
@@ -5764,7 +5764,7 @@
             <w:tcBorders>
               <w:top w:val="none"/>
               <w:left w:val="none"/>
-              <w:bottom w:val="single" w:sz="4" w:space="0" w:color="D4E5E1"/>
+              <w:bottom w:val="single" w:sz="4" w:space="0" w:color="D9E2EC"/>
               <w:right w:val="none"/>
             </w:tcBorders>
           </w:tcPr>
@@ -5786,7 +5786,7 @@
         <w:tc>
           <w:tcPr>
             <w:tcW w:type="dxa" w:w="2268"/>
-            <w:shd w:val="clear" w:color="auto" w:fill="F4F9F8"/>
+            <w:shd w:val="clear" w:color="auto" w:fill="F4F7FB"/>
             <w:tcMar>
               <w:top w:w="18" w:type="dxa"/>
               <w:bottom w:w="18" w:type="dxa"/>
@@ -5796,7 +5796,7 @@
             <w:tcBorders>
               <w:top w:val="none"/>
               <w:left w:val="none"/>
-              <w:bottom w:val="single" w:sz="4" w:space="0" w:color="D4E5E1"/>
+              <w:bottom w:val="single" w:sz="4" w:space="0" w:color="D9E2EC"/>
               <w:right w:val="none"/>
             </w:tcBorders>
           </w:tcPr>
@@ -5818,7 +5818,7 @@
         <w:tc>
           <w:tcPr>
             <w:tcW w:type="dxa" w:w="2268"/>
-            <w:shd w:val="clear" w:color="auto" w:fill="F4F9F8"/>
+            <w:shd w:val="clear" w:color="auto" w:fill="F4F7FB"/>
             <w:tcMar>
               <w:top w:w="18" w:type="dxa"/>
               <w:bottom w:w="18" w:type="dxa"/>
@@ -5828,7 +5828,7 @@
             <w:tcBorders>
               <w:top w:val="none"/>
               <w:left w:val="none"/>
-              <w:bottom w:val="single" w:sz="4" w:space="0" w:color="D4E5E1"/>
+              <w:bottom w:val="single" w:sz="4" w:space="0" w:color="D9E2EC"/>
               <w:right w:val="none"/>
             </w:tcBorders>
           </w:tcPr>
@@ -5850,7 +5850,7 @@
         <w:tc>
           <w:tcPr>
             <w:tcW w:type="dxa" w:w="2268"/>
-            <w:shd w:val="clear" w:color="auto" w:fill="F4F9F8"/>
+            <w:shd w:val="clear" w:color="auto" w:fill="F4F7FB"/>
             <w:tcMar>
               <w:top w:w="18" w:type="dxa"/>
               <w:bottom w:w="18" w:type="dxa"/>
@@ -5860,7 +5860,7 @@
             <w:tcBorders>
               <w:top w:val="none"/>
               <w:left w:val="none"/>
-              <w:bottom w:val="single" w:sz="4" w:space="0" w:color="D4E5E1"/>
+              <w:bottom w:val="single" w:sz="4" w:space="0" w:color="D9E2EC"/>
               <w:right w:val="none"/>
             </w:tcBorders>
           </w:tcPr>
@@ -5897,7 +5897,7 @@
             <w:tcBorders>
               <w:top w:val="none"/>
               <w:left w:val="none"/>
-              <w:bottom w:val="single" w:sz="4" w:space="0" w:color="D4E5E1"/>
+              <w:bottom w:val="single" w:sz="4" w:space="0" w:color="D9E2EC"/>
               <w:right w:val="none"/>
             </w:tcBorders>
           </w:tcPr>
@@ -5929,7 +5929,7 @@
             <w:tcBorders>
               <w:top w:val="none"/>
               <w:left w:val="none"/>
-              <w:bottom w:val="single" w:sz="4" w:space="0" w:color="D4E5E1"/>
+              <w:bottom w:val="single" w:sz="4" w:space="0" w:color="D9E2EC"/>
               <w:right w:val="none"/>
             </w:tcBorders>
           </w:tcPr>
@@ -5961,7 +5961,7 @@
             <w:tcBorders>
               <w:top w:val="none"/>
               <w:left w:val="none"/>
-              <w:bottom w:val="single" w:sz="4" w:space="0" w:color="D4E5E1"/>
+              <w:bottom w:val="single" w:sz="4" w:space="0" w:color="D9E2EC"/>
               <w:right w:val="none"/>
             </w:tcBorders>
           </w:tcPr>
@@ -5993,7 +5993,7 @@
             <w:tcBorders>
               <w:top w:val="none"/>
               <w:left w:val="none"/>
-              <w:bottom w:val="single" w:sz="4" w:space="0" w:color="D4E5E1"/>
+              <w:bottom w:val="single" w:sz="4" w:space="0" w:color="D9E2EC"/>
               <w:right w:val="none"/>
             </w:tcBorders>
           </w:tcPr>
@@ -6020,7 +6020,7 @@
         <w:tc>
           <w:tcPr>
             <w:tcW w:type="dxa" w:w="2891"/>
-            <w:shd w:val="clear" w:color="auto" w:fill="F4F9F8"/>
+            <w:shd w:val="clear" w:color="auto" w:fill="F4F7FB"/>
             <w:tcMar>
               <w:top w:w="18" w:type="dxa"/>
               <w:bottom w:w="18" w:type="dxa"/>
@@ -6030,7 +6030,7 @@
             <w:tcBorders>
               <w:top w:val="none"/>
               <w:left w:val="none"/>
-              <w:bottom w:val="single" w:sz="4" w:space="0" w:color="D4E5E1"/>
+              <w:bottom w:val="single" w:sz="4" w:space="0" w:color="D9E2EC"/>
               <w:right w:val="none"/>
             </w:tcBorders>
           </w:tcPr>
@@ -6052,7 +6052,7 @@
         <w:tc>
           <w:tcPr>
             <w:tcW w:type="dxa" w:w="2268"/>
-            <w:shd w:val="clear" w:color="auto" w:fill="F4F9F8"/>
+            <w:shd w:val="clear" w:color="auto" w:fill="F4F7FB"/>
             <w:tcMar>
               <w:top w:w="18" w:type="dxa"/>
               <w:bottom w:w="18" w:type="dxa"/>
@@ -6062,7 +6062,7 @@
             <w:tcBorders>
               <w:top w:val="none"/>
               <w:left w:val="none"/>
-              <w:bottom w:val="single" w:sz="4" w:space="0" w:color="D4E5E1"/>
+              <w:bottom w:val="single" w:sz="4" w:space="0" w:color="D9E2EC"/>
               <w:right w:val="none"/>
             </w:tcBorders>
           </w:tcPr>
@@ -6084,7 +6084,7 @@
         <w:tc>
           <w:tcPr>
             <w:tcW w:type="dxa" w:w="2268"/>
-            <w:shd w:val="clear" w:color="auto" w:fill="F4F9F8"/>
+            <w:shd w:val="clear" w:color="auto" w:fill="F4F7FB"/>
             <w:tcMar>
               <w:top w:w="18" w:type="dxa"/>
               <w:bottom w:w="18" w:type="dxa"/>
@@ -6094,7 +6094,7 @@
             <w:tcBorders>
               <w:top w:val="none"/>
               <w:left w:val="none"/>
-              <w:bottom w:val="single" w:sz="4" w:space="0" w:color="D4E5E1"/>
+              <w:bottom w:val="single" w:sz="4" w:space="0" w:color="D9E2EC"/>
               <w:right w:val="none"/>
             </w:tcBorders>
           </w:tcPr>
@@ -6116,7 +6116,7 @@
         <w:tc>
           <w:tcPr>
             <w:tcW w:type="dxa" w:w="2268"/>
-            <w:shd w:val="clear" w:color="auto" w:fill="F4F9F8"/>
+            <w:shd w:val="clear" w:color="auto" w:fill="F4F7FB"/>
             <w:tcMar>
               <w:top w:w="18" w:type="dxa"/>
               <w:bottom w:w="18" w:type="dxa"/>
@@ -6126,7 +6126,7 @@
             <w:tcBorders>
               <w:top w:val="none"/>
               <w:left w:val="none"/>
-              <w:bottom w:val="single" w:sz="4" w:space="0" w:color="D4E5E1"/>
+              <w:bottom w:val="single" w:sz="4" w:space="0" w:color="D9E2EC"/>
               <w:right w:val="none"/>
             </w:tcBorders>
           </w:tcPr>
@@ -6163,7 +6163,7 @@
             <w:tcBorders>
               <w:top w:val="none"/>
               <w:left w:val="none"/>
-              <w:bottom w:val="single" w:sz="4" w:space="0" w:color="D4E5E1"/>
+              <w:bottom w:val="single" w:sz="4" w:space="0" w:color="D9E2EC"/>
               <w:right w:val="none"/>
             </w:tcBorders>
           </w:tcPr>
@@ -6195,7 +6195,7 @@
             <w:tcBorders>
               <w:top w:val="none"/>
               <w:left w:val="none"/>
-              <w:bottom w:val="single" w:sz="4" w:space="0" w:color="D4E5E1"/>
+              <w:bottom w:val="single" w:sz="4" w:space="0" w:color="D9E2EC"/>
               <w:right w:val="none"/>
             </w:tcBorders>
           </w:tcPr>
@@ -6227,7 +6227,7 @@
             <w:tcBorders>
               <w:top w:val="none"/>
               <w:left w:val="none"/>
-              <w:bottom w:val="single" w:sz="4" w:space="0" w:color="D4E5E1"/>
+              <w:bottom w:val="single" w:sz="4" w:space="0" w:color="D9E2EC"/>
               <w:right w:val="none"/>
             </w:tcBorders>
           </w:tcPr>
@@ -6259,7 +6259,7 @@
             <w:tcBorders>
               <w:top w:val="none"/>
               <w:left w:val="none"/>
-              <w:bottom w:val="single" w:sz="4" w:space="0" w:color="D4E5E1"/>
+              <w:bottom w:val="single" w:sz="4" w:space="0" w:color="D9E2EC"/>
               <w:right w:val="none"/>
             </w:tcBorders>
           </w:tcPr>
@@ -6286,7 +6286,7 @@
         <w:tc>
           <w:tcPr>
             <w:tcW w:type="dxa" w:w="2891"/>
-            <w:shd w:val="clear" w:color="auto" w:fill="F4F9F8"/>
+            <w:shd w:val="clear" w:color="auto" w:fill="F4F7FB"/>
             <w:tcMar>
               <w:top w:w="18" w:type="dxa"/>
               <w:bottom w:w="18" w:type="dxa"/>
@@ -6296,7 +6296,7 @@
             <w:tcBorders>
               <w:top w:val="none"/>
               <w:left w:val="none"/>
-              <w:bottom w:val="single" w:sz="4" w:space="0" w:color="D4E5E1"/>
+              <w:bottom w:val="single" w:sz="4" w:space="0" w:color="D9E2EC"/>
               <w:right w:val="none"/>
             </w:tcBorders>
           </w:tcPr>
@@ -6318,7 +6318,7 @@
         <w:tc>
           <w:tcPr>
             <w:tcW w:type="dxa" w:w="2268"/>
-            <w:shd w:val="clear" w:color="auto" w:fill="F4F9F8"/>
+            <w:shd w:val="clear" w:color="auto" w:fill="F4F7FB"/>
             <w:tcMar>
               <w:top w:w="18" w:type="dxa"/>
               <w:bottom w:w="18" w:type="dxa"/>
@@ -6328,7 +6328,7 @@
             <w:tcBorders>
               <w:top w:val="none"/>
               <w:left w:val="none"/>
-              <w:bottom w:val="single" w:sz="4" w:space="0" w:color="D4E5E1"/>
+              <w:bottom w:val="single" w:sz="4" w:space="0" w:color="D9E2EC"/>
               <w:right w:val="none"/>
             </w:tcBorders>
           </w:tcPr>
@@ -6350,7 +6350,7 @@
         <w:tc>
           <w:tcPr>
             <w:tcW w:type="dxa" w:w="2268"/>
-            <w:shd w:val="clear" w:color="auto" w:fill="F4F9F8"/>
+            <w:shd w:val="clear" w:color="auto" w:fill="F4F7FB"/>
             <w:tcMar>
               <w:top w:w="18" w:type="dxa"/>
               <w:bottom w:w="18" w:type="dxa"/>
@@ -6360,7 +6360,7 @@
             <w:tcBorders>
               <w:top w:val="none"/>
               <w:left w:val="none"/>
-              <w:bottom w:val="single" w:sz="4" w:space="0" w:color="D4E5E1"/>
+              <w:bottom w:val="single" w:sz="4" w:space="0" w:color="D9E2EC"/>
               <w:right w:val="none"/>
             </w:tcBorders>
           </w:tcPr>
@@ -6382,7 +6382,7 @@
         <w:tc>
           <w:tcPr>
             <w:tcW w:type="dxa" w:w="2268"/>
-            <w:shd w:val="clear" w:color="auto" w:fill="F4F9F8"/>
+            <w:shd w:val="clear" w:color="auto" w:fill="F4F7FB"/>
             <w:tcMar>
               <w:top w:w="18" w:type="dxa"/>
               <w:bottom w:w="18" w:type="dxa"/>
@@ -6392,7 +6392,7 @@
             <w:tcBorders>
               <w:top w:val="none"/>
               <w:left w:val="none"/>
-              <w:bottom w:val="single" w:sz="4" w:space="0" w:color="D4E5E1"/>
+              <w:bottom w:val="single" w:sz="4" w:space="0" w:color="D9E2EC"/>
               <w:right w:val="none"/>
             </w:tcBorders>
           </w:tcPr>
@@ -6429,7 +6429,7 @@
             <w:tcBorders>
               <w:top w:val="none"/>
               <w:left w:val="none"/>
-              <w:bottom w:val="single" w:sz="4" w:space="0" w:color="D4E5E1"/>
+              <w:bottom w:val="single" w:sz="4" w:space="0" w:color="D9E2EC"/>
               <w:right w:val="none"/>
             </w:tcBorders>
           </w:tcPr>
@@ -6461,7 +6461,7 @@
             <w:tcBorders>
               <w:top w:val="none"/>
               <w:left w:val="none"/>
-              <w:bottom w:val="single" w:sz="4" w:space="0" w:color="D4E5E1"/>
+              <w:bottom w:val="single" w:sz="4" w:space="0" w:color="D9E2EC"/>
               <w:right w:val="none"/>
             </w:tcBorders>
           </w:tcPr>
@@ -6493,7 +6493,7 @@
             <w:tcBorders>
               <w:top w:val="none"/>
               <w:left w:val="none"/>
-              <w:bottom w:val="single" w:sz="4" w:space="0" w:color="D4E5E1"/>
+              <w:bottom w:val="single" w:sz="4" w:space="0" w:color="D9E2EC"/>
               <w:right w:val="none"/>
             </w:tcBorders>
           </w:tcPr>
@@ -6525,7 +6525,7 @@
             <w:tcBorders>
               <w:top w:val="none"/>
               <w:left w:val="none"/>
-              <w:bottom w:val="single" w:sz="4" w:space="0" w:color="D4E5E1"/>
+              <w:bottom w:val="single" w:sz="4" w:space="0" w:color="D9E2EC"/>
               <w:right w:val="none"/>
             </w:tcBorders>
           </w:tcPr>
@@ -6562,7 +6562,7 @@
             <w:tcBorders>
               <w:top w:val="none"/>
               <w:left w:val="none"/>
-              <w:bottom w:val="single" w:sz="4" w:space="0" w:color="D4E5E1"/>
+              <w:bottom w:val="single" w:sz="4" w:space="0" w:color="D9E2EC"/>
               <w:right w:val="none"/>
             </w:tcBorders>
           </w:tcPr>
@@ -6594,7 +6594,7 @@
             <w:tcBorders>
               <w:top w:val="none"/>
               <w:left w:val="none"/>
-              <w:bottom w:val="single" w:sz="4" w:space="0" w:color="D4E5E1"/>
+              <w:bottom w:val="single" w:sz="4" w:space="0" w:color="D9E2EC"/>
               <w:right w:val="none"/>
             </w:tcBorders>
           </w:tcPr>
@@ -6626,7 +6626,7 @@
             <w:tcBorders>
               <w:top w:val="none"/>
               <w:left w:val="none"/>
-              <w:bottom w:val="single" w:sz="4" w:space="0" w:color="D4E5E1"/>
+              <w:bottom w:val="single" w:sz="4" w:space="0" w:color="D9E2EC"/>
               <w:right w:val="none"/>
             </w:tcBorders>
           </w:tcPr>
@@ -6658,7 +6658,7 @@
             <w:tcBorders>
               <w:top w:val="none"/>
               <w:left w:val="none"/>
-              <w:bottom w:val="single" w:sz="4" w:space="0" w:color="D4E5E1"/>
+              <w:bottom w:val="single" w:sz="4" w:space="0" w:color="D9E2EC"/>
               <w:right w:val="none"/>
             </w:tcBorders>
           </w:tcPr>
@@ -6695,7 +6695,7 @@
             <w:tcBorders>
               <w:top w:val="none"/>
               <w:left w:val="none"/>
-              <w:bottom w:val="single" w:sz="4" w:space="0" w:color="D4E5E1"/>
+              <w:bottom w:val="single" w:sz="4" w:space="0" w:color="D9E2EC"/>
               <w:right w:val="none"/>
             </w:tcBorders>
           </w:tcPr>
@@ -6727,7 +6727,7 @@
             <w:tcBorders>
               <w:top w:val="none"/>
               <w:left w:val="none"/>
-              <w:bottom w:val="single" w:sz="4" w:space="0" w:color="D4E5E1"/>
+              <w:bottom w:val="single" w:sz="4" w:space="0" w:color="D9E2EC"/>
               <w:right w:val="none"/>
             </w:tcBorders>
           </w:tcPr>
@@ -6759,7 +6759,7 @@
             <w:tcBorders>
               <w:top w:val="none"/>
               <w:left w:val="none"/>
-              <w:bottom w:val="single" w:sz="4" w:space="0" w:color="D4E5E1"/>
+              <w:bottom w:val="single" w:sz="4" w:space="0" w:color="D9E2EC"/>
               <w:right w:val="none"/>
             </w:tcBorders>
           </w:tcPr>
@@ -6791,7 +6791,7 @@
             <w:tcBorders>
               <w:top w:val="none"/>
               <w:left w:val="none"/>
-              <w:bottom w:val="single" w:sz="4" w:space="0" w:color="D4E5E1"/>
+              <w:bottom w:val="single" w:sz="4" w:space="0" w:color="D9E2EC"/>
               <w:right w:val="none"/>
             </w:tcBorders>
           </w:tcPr>
@@ -6828,7 +6828,7 @@
             <w:tcBorders>
               <w:top w:val="none"/>
               <w:left w:val="none"/>
-              <w:bottom w:val="single" w:sz="4" w:space="0" w:color="D4E5E1"/>
+              <w:bottom w:val="single" w:sz="4" w:space="0" w:color="D9E2EC"/>
               <w:right w:val="none"/>
             </w:tcBorders>
           </w:tcPr>
@@ -6860,7 +6860,7 @@
             <w:tcBorders>
               <w:top w:val="none"/>
               <w:left w:val="none"/>
-              <w:bottom w:val="single" w:sz="4" w:space="0" w:color="D4E5E1"/>
+              <w:bottom w:val="single" w:sz="4" w:space="0" w:color="D9E2EC"/>
               <w:right w:val="none"/>
             </w:tcBorders>
           </w:tcPr>
@@ -6892,7 +6892,7 @@
             <w:tcBorders>
               <w:top w:val="none"/>
               <w:left w:val="none"/>
-              <w:bottom w:val="single" w:sz="4" w:space="0" w:color="D4E5E1"/>
+              <w:bottom w:val="single" w:sz="4" w:space="0" w:color="D9E2EC"/>
               <w:right w:val="none"/>
             </w:tcBorders>
           </w:tcPr>
@@ -6924,7 +6924,7 @@
             <w:tcBorders>
               <w:top w:val="none"/>
               <w:left w:val="none"/>
-              <w:bottom w:val="single" w:sz="4" w:space="0" w:color="D4E5E1"/>
+              <w:bottom w:val="single" w:sz="4" w:space="0" w:color="D9E2EC"/>
               <w:right w:val="none"/>
             </w:tcBorders>
           </w:tcPr>
@@ -6974,7 +6974,7 @@
         <w:rPr>
           <w:rFonts w:ascii="Arial" w:hAnsi="Arial"/>
           <w:b/>
-          <w:color w:val="00AA91"/>
+          <w:color w:val="12213A"/>
           <w:sz w:val="21"/>
         </w:rPr>
         <w:t>6.1 Struktur Penawaran Kemitraan Modal Rp 15.000.000</w:t>
@@ -7009,7 +7009,7 @@
         <w:tc>
           <w:tcPr>
             <w:tcW w:type="dxa" w:w="9694"/>
-            <w:shd w:val="clear" w:color="auto" w:fill="F4F9F8"/>
+            <w:shd w:val="clear" w:color="auto" w:fill="F4F7FB"/>
             <w:tcMar>
               <w:top w:w="65" w:type="dxa"/>
               <w:bottom w:w="65" w:type="dxa"/>
@@ -7018,7 +7018,7 @@
             </w:tcMar>
             <w:tcBorders>
               <w:top w:val="none"/>
-              <w:left w:val="single" w:sz="24" w:space="0" w:color="00AA91"/>
+              <w:left w:val="single" w:sz="24" w:space="0" w:color="12213A"/>
               <w:bottom w:val="none"/>
               <w:right w:val="none"/>
             </w:tcBorders>
@@ -7047,7 +7047,7 @@
               <w:rPr>
                 <w:rFonts w:ascii="Arial" w:hAnsi="Arial"/>
                 <w:b/>
-                <w:color w:val="00AA91"/>
+                <w:color w:val="12213A"/>
                 <w:sz w:val="18"/>
               </w:rPr>
               <w:t xml:space="preserve">• Pilihan Slot Permodalan: </w:t>
@@ -7070,7 +7070,7 @@
               <w:rPr>
                 <w:rFonts w:ascii="Arial" w:hAnsi="Arial"/>
                 <w:b/>
-                <w:color w:val="00AA91"/>
+                <w:color w:val="12213A"/>
                 <w:sz w:val="18"/>
               </w:rPr>
               <w:t xml:space="preserve">• Nisbah Bagi Hasil Laba Bersih: </w:t>
@@ -7093,7 +7093,7 @@
               <w:rPr>
                 <w:rFonts w:ascii="Arial" w:hAnsi="Arial"/>
                 <w:b/>
-                <w:color w:val="00AA91"/>
+                <w:color w:val="12213A"/>
                 <w:sz w:val="18"/>
               </w:rPr>
               <w:t xml:space="preserve">• Transparansi Kasir Digital: </w:t>
@@ -7116,7 +7116,7 @@
               <w:rPr>
                 <w:rFonts w:ascii="Arial" w:hAnsi="Arial"/>
                 <w:b/>
-                <w:color w:val="00AA91"/>
+                <w:color w:val="12213A"/>
                 <w:sz w:val="18"/>
               </w:rPr>
               <w:t xml:space="preserve">• Roadmap Ekspansi Bertahap: </w:t>
@@ -7147,7 +7147,7 @@
         <w:rPr>
           <w:rFonts w:ascii="Arial" w:hAnsi="Arial"/>
           <w:b/>
-          <w:color w:val="00AA91"/>
+          <w:color w:val="12213A"/>
           <w:sz w:val="21"/>
         </w:rPr>
         <w:t>6.2 Kesimpulan Eksekutif</w:t>
@@ -7178,7 +7178,7 @@
         <w:rPr>
           <w:rFonts w:ascii="Arial" w:hAnsi="Arial"/>
           <w:b/>
-          <w:color w:val="00AA91"/>
+          <w:color w:val="12213A"/>
           <w:sz w:val="21"/>
         </w:rPr>
         <w:t>6.3 Lembar Pernyataan Komitmen Kemitraan Investasi</w:t>
@@ -7222,7 +7222,7 @@
             </w:tcMar>
             <w:tcBorders>
               <w:top w:val="none"/>
-              <w:left w:val="single" w:sz="24" w:space="0" w:color="00AA91"/>
+              <w:left w:val="single" w:sz="24" w:space="0" w:color="12213A"/>
               <w:bottom w:val="none"/>
               <w:right w:val="none"/>
             </w:tcBorders>
@@ -7255,7 +7255,7 @@
               <w:rPr>
                 <w:rFonts w:ascii="Arial" w:hAnsi="Arial"/>
                 <w:b/>
-                <w:color w:val="00AA91"/>
+                <w:color w:val="12213A"/>
                 <w:sz w:val="18"/>
               </w:rPr>
               <w:t>Nama Lengkap Calon Mitra</w:t>
@@ -7285,7 +7285,7 @@
               <w:rPr>
                 <w:rFonts w:ascii="Arial" w:hAnsi="Arial"/>
                 <w:b/>
-                <w:color w:val="00AA91"/>
+                <w:color w:val="12213A"/>
                 <w:sz w:val="18"/>
               </w:rPr>
               <w:t>Nomor WhatsApp / Kontak</w:t>
@@ -7315,7 +7315,7 @@
               <w:rPr>
                 <w:rFonts w:ascii="Arial" w:hAnsi="Arial"/>
                 <w:b/>
-                <w:color w:val="00AA91"/>
+                <w:color w:val="12213A"/>
                 <w:sz w:val="18"/>
               </w:rPr>
               <w:t>Alamat / Domisili</w:t>
@@ -7345,7 +7345,7 @@
               <w:rPr>
                 <w:rFonts w:ascii="Arial" w:hAnsi="Arial"/>
                 <w:b/>
-                <w:color w:val="00AA91"/>
+                <w:color w:val="12213A"/>
                 <w:sz w:val="18"/>
               </w:rPr>
               <w:t>Pilihan Partisipasi Modal</w:t>
@@ -7375,7 +7375,7 @@
               <w:rPr>
                 <w:rFonts w:ascii="Arial" w:hAnsi="Arial"/>
                 <w:b/>
-                <w:color w:val="00AA91"/>
+                <w:color w:val="12213A"/>
                 <w:sz w:val="18"/>
               </w:rPr>
               <w:tab/>
@@ -7403,7 +7403,7 @@
               <w:rPr>
                 <w:rFonts w:ascii="Arial" w:hAnsi="Arial"/>
                 <w:b/>
-                <w:color w:val="00AA91"/>
+                <w:color w:val="12213A"/>
                 <w:sz w:val="18"/>
               </w:rPr>
               <w:tab/>
@@ -7431,7 +7431,7 @@
               <w:rPr>
                 <w:rFonts w:ascii="Arial" w:hAnsi="Arial"/>
                 <w:b/>
-                <w:color w:val="00AA91"/>
+                <w:color w:val="12213A"/>
                 <w:sz w:val="18"/>
               </w:rPr>
               <w:tab/>

</xml_diff>